<commit_message>
docs: center all tables and titles in Word document and HTML
</commit_message>
<xml_diff>
--- a/docs/data-dictionary.docx
+++ b/docs/data-dictionary.docx
@@ -3,6 +3,1256 @@
 <w:document xmlns:wpc="http://schemas.microsoft.com/office/word/2010/wordprocessingCanvas" xmlns:cx="http://schemas.microsoft.com/office/drawing/2014/chartex" xmlns:cx1="http://schemas.microsoft.com/office/drawing/2015/9/8/chartex" xmlns:cx2="http://schemas.microsoft.com/office/drawing/2015/10/21/chartex" xmlns:cx3="http://schemas.microsoft.com/office/drawing/2016/5/9/chartex" xmlns:cx4="http://schemas.microsoft.com/office/drawing/2016/5/10/chartex" xmlns:cx5="http://schemas.microsoft.com/office/drawing/2016/5/11/chartex" xmlns:cx6="http://schemas.microsoft.com/office/drawing/2016/5/12/chartex" xmlns:cx7="http://schemas.microsoft.com/office/drawing/2016/5/13/chartex" xmlns:cx8="http://schemas.microsoft.com/office/drawing/2016/5/14/chartex" xmlns:mc="http://schemas.openxmlformats.org/markup-compatibility/2006" xmlns:aink="http://schemas.microsoft.com/office/drawing/2016/ink" xmlns:am3d="http://schemas.microsoft.com/office/drawing/2017/model3d" xmlns:o="urn:schemas-microsoft-com:office:office" xmlns:oel="http://schemas.microsoft.com/office/2019/extlst" xmlns:r="http://schemas.openxmlformats.org/officeDocument/2006/relationships" xmlns:m="http://schemas.openxmlformats.org/officeDocument/2006/math" xmlns:v="urn:schemas-microsoft-com:vml" xmlns:wp14="http://schemas.microsoft.com/office/word/2010/wordprocessingDrawing" xmlns:wp="http://schemas.openxmlformats.org/drawingml/2006/wordprocessingDrawing" xmlns:w10="urn:schemas-microsoft-com:office:word" xmlns:w="http://schemas.openxmlformats.org/wordprocessingml/2006/main" xmlns:w14="http://schemas.microsoft.com/office/word/2010/wordml" xmlns:w15="http://schemas.microsoft.com/office/word/2012/wordml" xmlns:w16cex="http://schemas.microsoft.com/office/word/2018/wordml/cex" xmlns:w16cid="http://schemas.microsoft.com/office/word/2016/wordml/cid" xmlns:w16="http://schemas.microsoft.com/office/word/2018/wordml" xmlns:w16du="http://schemas.microsoft.com/office/word/2023/wordml/word16du" xmlns:w16sdtdh="http://schemas.microsoft.com/office/word/2020/wordml/sdtdatahash" xmlns:w16sdtfl="http://schemas.microsoft.com/office/word/2024/wordml/sdtformatlock" xmlns:w16se="http://schemas.microsoft.com/office/word/2015/wordml/symex" xmlns:wpg="http://schemas.microsoft.com/office/word/2010/wordprocessingGroup" xmlns:wpi="http://schemas.microsoft.com/office/word/2010/wordprocessingInk" xmlns:wne="http://schemas.microsoft.com/office/word/2006/wordml" xmlns:wps="http://schemas.microsoft.com/office/word/2010/wordprocessingShape" mc:Ignorable="w14 w15 w16se w16cid w16 w16cex w16sdtdh w16sdtfl w16du wp14">
   <w:background w:color="FFFFFF"/>
   <w:body>
+    <w:tbl>
+      <w:tblPr>
+        <w:tblpPr w:leftFromText="180" w:rightFromText="180" w:vertAnchor="text" w:horzAnchor="margin" w:tblpXSpec="center" w:tblpY="2871"/>
+        <w:tblW w:w="5000" w:type="pct"/>
+        <w:jc w:val="center"/>
+        <w:tblBorders>
+          <w:top w:val="single" w:sz="4" w:space="0" w:color="000000"/>
+          <w:left w:val="single" w:sz="4" w:space="0" w:color="000000"/>
+          <w:bottom w:val="single" w:sz="4" w:space="0" w:color="000000"/>
+          <w:right w:val="single" w:sz="4" w:space="0" w:color="000000"/>
+          <w:insideH w:val="single" w:sz="4" w:space="0" w:color="000000"/>
+          <w:insideV w:val="single" w:sz="4" w:space="0" w:color="000000"/>
+        </w:tblBorders>
+        <w:tblCellMar>
+          <w:top w:w="15" w:type="dxa"/>
+          <w:left w:w="15" w:type="dxa"/>
+          <w:bottom w:w="15" w:type="dxa"/>
+          <w:right w:w="15" w:type="dxa"/>
+        </w:tblCellMar>
+        <w:tblLook w:val="04A0" w:firstRow="1" w:lastRow="0" w:firstColumn="1" w:lastColumn="0" w:noHBand="0" w:noVBand="1"/>
+      </w:tblPr>
+      <w:tblGrid>
+        <w:gridCol w:w="1907"/>
+        <w:gridCol w:w="1934"/>
+        <w:gridCol w:w="1201"/>
+        <w:gridCol w:w="1359"/>
+        <w:gridCol w:w="2949"/>
+      </w:tblGrid>
+      <w:tr>
+        <w:trPr>
+          <w:divId w:val="1414663851"/>
+          <w:cantSplit/>
+          <w:tblHeader/>
+          <w:jc w:val="center"/>
+        </w:trPr>
+        <w:tc>
+          <w:tcPr>
+            <w:tcW w:w="1020" w:type="pct"/>
+            <w:shd w:val="clear" w:color="auto" w:fill="FFFFFF"/>
+            <w:tcMar>
+              <w:top w:w="100" w:type="dxa"/>
+              <w:left w:w="120" w:type="dxa"/>
+              <w:bottom w:w="100" w:type="dxa"/>
+              <w:right w:w="120" w:type="dxa"/>
+            </w:tcMar>
+            <w:hideMark/>
+          </w:tcPr>
+          <w:p>
+            <w:pPr>
+              <w:spacing w:after="480"/>
+              <w:jc w:val="center"/>
+              <w:rPr>
+                <w:rFonts w:eastAsia="Times New Roman"/>
+                <w:b/>
+                <w:bCs/>
+                <w:color w:val="000000"/>
+              </w:rPr>
+            </w:pPr>
+            <w:r>
+              <w:rPr>
+                <w:rFonts w:eastAsia="Times New Roman"/>
+                <w:b/>
+                <w:bCs/>
+                <w:color w:val="000000"/>
+              </w:rPr>
+              <w:t>Field</w:t>
+            </w:r>
+          </w:p>
+        </w:tc>
+        <w:tc>
+          <w:tcPr>
+            <w:tcW w:w="1034" w:type="pct"/>
+            <w:shd w:val="clear" w:color="auto" w:fill="FFFFFF"/>
+            <w:tcMar>
+              <w:top w:w="100" w:type="dxa"/>
+              <w:left w:w="120" w:type="dxa"/>
+              <w:bottom w:w="100" w:type="dxa"/>
+              <w:right w:w="120" w:type="dxa"/>
+            </w:tcMar>
+            <w:hideMark/>
+          </w:tcPr>
+          <w:p>
+            <w:pPr>
+              <w:spacing w:after="480"/>
+              <w:jc w:val="center"/>
+              <w:rPr>
+                <w:rFonts w:eastAsia="Times New Roman"/>
+                <w:b/>
+                <w:bCs/>
+                <w:color w:val="000000"/>
+              </w:rPr>
+            </w:pPr>
+            <w:r>
+              <w:rPr>
+                <w:rFonts w:eastAsia="Times New Roman"/>
+                <w:b/>
+                <w:bCs/>
+                <w:color w:val="000000"/>
+              </w:rPr>
+              <w:t>Data Type</w:t>
+            </w:r>
+          </w:p>
+        </w:tc>
+        <w:tc>
+          <w:tcPr>
+            <w:tcW w:w="642" w:type="pct"/>
+            <w:shd w:val="clear" w:color="auto" w:fill="FFFFFF"/>
+            <w:tcMar>
+              <w:top w:w="100" w:type="dxa"/>
+              <w:left w:w="120" w:type="dxa"/>
+              <w:bottom w:w="100" w:type="dxa"/>
+              <w:right w:w="120" w:type="dxa"/>
+            </w:tcMar>
+            <w:hideMark/>
+          </w:tcPr>
+          <w:p>
+            <w:pPr>
+              <w:spacing w:after="480"/>
+              <w:jc w:val="center"/>
+              <w:rPr>
+                <w:rFonts w:eastAsia="Times New Roman"/>
+                <w:b/>
+                <w:bCs/>
+                <w:color w:val="000000"/>
+              </w:rPr>
+            </w:pPr>
+            <w:r>
+              <w:rPr>
+                <w:rFonts w:eastAsia="Times New Roman"/>
+                <w:b/>
+                <w:bCs/>
+                <w:color w:val="000000"/>
+              </w:rPr>
+              <w:t>Required</w:t>
+            </w:r>
+          </w:p>
+        </w:tc>
+        <w:tc>
+          <w:tcPr>
+            <w:tcW w:w="727" w:type="pct"/>
+            <w:shd w:val="clear" w:color="auto" w:fill="FFFFFF"/>
+            <w:tcMar>
+              <w:top w:w="100" w:type="dxa"/>
+              <w:left w:w="120" w:type="dxa"/>
+              <w:bottom w:w="100" w:type="dxa"/>
+              <w:right w:w="120" w:type="dxa"/>
+            </w:tcMar>
+            <w:hideMark/>
+          </w:tcPr>
+          <w:p>
+            <w:pPr>
+              <w:spacing w:after="480"/>
+              <w:jc w:val="center"/>
+              <w:rPr>
+                <w:rFonts w:eastAsia="Times New Roman"/>
+                <w:b/>
+                <w:bCs/>
+                <w:color w:val="000000"/>
+              </w:rPr>
+            </w:pPr>
+            <w:r>
+              <w:rPr>
+                <w:rFonts w:eastAsia="Times New Roman"/>
+                <w:b/>
+                <w:bCs/>
+                <w:color w:val="000000"/>
+              </w:rPr>
+              <w:t>Key</w:t>
+            </w:r>
+          </w:p>
+        </w:tc>
+        <w:tc>
+          <w:tcPr>
+            <w:tcW w:w="1577" w:type="pct"/>
+            <w:shd w:val="clear" w:color="auto" w:fill="FFFFFF"/>
+            <w:tcMar>
+              <w:top w:w="100" w:type="dxa"/>
+              <w:left w:w="120" w:type="dxa"/>
+              <w:bottom w:w="100" w:type="dxa"/>
+              <w:right w:w="120" w:type="dxa"/>
+            </w:tcMar>
+            <w:hideMark/>
+          </w:tcPr>
+          <w:p>
+            <w:pPr>
+              <w:spacing w:after="480"/>
+              <w:jc w:val="center"/>
+              <w:rPr>
+                <w:rFonts w:eastAsia="Times New Roman"/>
+                <w:b/>
+                <w:bCs/>
+                <w:color w:val="000000"/>
+              </w:rPr>
+            </w:pPr>
+            <w:r>
+              <w:rPr>
+                <w:rFonts w:eastAsia="Times New Roman"/>
+                <w:b/>
+                <w:bCs/>
+                <w:color w:val="000000"/>
+              </w:rPr>
+              <w:t>Description</w:t>
+            </w:r>
+          </w:p>
+        </w:tc>
+      </w:tr>
+      <w:tr>
+        <w:trPr>
+          <w:divId w:val="1414663851"/>
+          <w:cantSplit/>
+          <w:jc w:val="center"/>
+        </w:trPr>
+        <w:tc>
+          <w:tcPr>
+            <w:tcW w:w="0" w:type="auto"/>
+            <w:tcMar>
+              <w:top w:w="100" w:type="dxa"/>
+              <w:left w:w="120" w:type="dxa"/>
+              <w:bottom w:w="100" w:type="dxa"/>
+              <w:right w:w="120" w:type="dxa"/>
+            </w:tcMar>
+            <w:hideMark/>
+          </w:tcPr>
+          <w:p>
+            <w:pPr>
+              <w:spacing w:after="480"/>
+              <w:rPr>
+                <w:rFonts w:eastAsia="Times New Roman"/>
+                <w:color w:val="000000"/>
+              </w:rPr>
+            </w:pPr>
+            <w:r>
+              <w:rPr>
+                <w:rFonts w:eastAsia="Times New Roman"/>
+                <w:color w:val="000000"/>
+              </w:rPr>
+              <w:t>id</w:t>
+            </w:r>
+          </w:p>
+        </w:tc>
+        <w:tc>
+          <w:tcPr>
+            <w:tcW w:w="0" w:type="auto"/>
+            <w:tcMar>
+              <w:top w:w="100" w:type="dxa"/>
+              <w:left w:w="120" w:type="dxa"/>
+              <w:bottom w:w="100" w:type="dxa"/>
+              <w:right w:w="120" w:type="dxa"/>
+            </w:tcMar>
+            <w:hideMark/>
+          </w:tcPr>
+          <w:p>
+            <w:pPr>
+              <w:spacing w:after="480"/>
+              <w:rPr>
+                <w:rFonts w:eastAsia="Times New Roman"/>
+                <w:color w:val="000000"/>
+              </w:rPr>
+            </w:pPr>
+            <w:r>
+              <w:rPr>
+                <w:rFonts w:eastAsia="Times New Roman"/>
+                <w:color w:val="000000"/>
+              </w:rPr>
+              <w:t>BIGINT</w:t>
+            </w:r>
+          </w:p>
+        </w:tc>
+        <w:tc>
+          <w:tcPr>
+            <w:tcW w:w="0" w:type="auto"/>
+            <w:tcMar>
+              <w:top w:w="100" w:type="dxa"/>
+              <w:left w:w="120" w:type="dxa"/>
+              <w:bottom w:w="100" w:type="dxa"/>
+              <w:right w:w="120" w:type="dxa"/>
+            </w:tcMar>
+            <w:hideMark/>
+          </w:tcPr>
+          <w:p>
+            <w:pPr>
+              <w:spacing w:after="480"/>
+              <w:jc w:val="center"/>
+              <w:rPr>
+                <w:rFonts w:eastAsia="Times New Roman"/>
+                <w:color w:val="000000"/>
+              </w:rPr>
+            </w:pPr>
+            <w:r>
+              <w:rPr>
+                <w:rFonts w:eastAsia="Times New Roman"/>
+                <w:color w:val="000000"/>
+              </w:rPr>
+              <w:t>Yes</w:t>
+            </w:r>
+          </w:p>
+        </w:tc>
+        <w:tc>
+          <w:tcPr>
+            <w:tcW w:w="0" w:type="auto"/>
+            <w:tcMar>
+              <w:top w:w="100" w:type="dxa"/>
+              <w:left w:w="120" w:type="dxa"/>
+              <w:bottom w:w="100" w:type="dxa"/>
+              <w:right w:w="120" w:type="dxa"/>
+            </w:tcMar>
+            <w:hideMark/>
+          </w:tcPr>
+          <w:p>
+            <w:pPr>
+              <w:spacing w:after="480"/>
+              <w:jc w:val="center"/>
+              <w:rPr>
+                <w:rFonts w:eastAsia="Times New Roman"/>
+                <w:color w:val="000000"/>
+              </w:rPr>
+            </w:pPr>
+            <w:r>
+              <w:rPr>
+                <w:rFonts w:eastAsia="Times New Roman"/>
+                <w:color w:val="000000"/>
+              </w:rPr>
+              <w:t>Primary Key</w:t>
+            </w:r>
+          </w:p>
+        </w:tc>
+        <w:tc>
+          <w:tcPr>
+            <w:tcW w:w="0" w:type="auto"/>
+            <w:tcMar>
+              <w:top w:w="100" w:type="dxa"/>
+              <w:left w:w="120" w:type="dxa"/>
+              <w:bottom w:w="100" w:type="dxa"/>
+              <w:right w:w="120" w:type="dxa"/>
+            </w:tcMar>
+            <w:hideMark/>
+          </w:tcPr>
+          <w:p>
+            <w:pPr>
+              <w:spacing w:after="480"/>
+              <w:rPr>
+                <w:rFonts w:eastAsia="Times New Roman"/>
+                <w:color w:val="000000"/>
+              </w:rPr>
+            </w:pPr>
+            <w:r>
+              <w:rPr>
+                <w:rFonts w:eastAsia="Times New Roman"/>
+                <w:color w:val="000000"/>
+              </w:rPr>
+              <w:t>Unique identifier for the administrator account</w:t>
+            </w:r>
+          </w:p>
+        </w:tc>
+      </w:tr>
+      <w:tr>
+        <w:trPr>
+          <w:divId w:val="1414663851"/>
+          <w:cantSplit/>
+          <w:jc w:val="center"/>
+        </w:trPr>
+        <w:tc>
+          <w:tcPr>
+            <w:tcW w:w="0" w:type="auto"/>
+            <w:tcMar>
+              <w:top w:w="100" w:type="dxa"/>
+              <w:left w:w="120" w:type="dxa"/>
+              <w:bottom w:w="100" w:type="dxa"/>
+              <w:right w:w="120" w:type="dxa"/>
+            </w:tcMar>
+            <w:hideMark/>
+          </w:tcPr>
+          <w:p>
+            <w:pPr>
+              <w:spacing w:after="480"/>
+              <w:rPr>
+                <w:rFonts w:eastAsia="Times New Roman"/>
+                <w:color w:val="000000"/>
+              </w:rPr>
+            </w:pPr>
+            <w:r>
+              <w:rPr>
+                <w:rFonts w:eastAsia="Times New Roman"/>
+                <w:color w:val="000000"/>
+              </w:rPr>
+              <w:t>email</w:t>
+            </w:r>
+          </w:p>
+        </w:tc>
+        <w:tc>
+          <w:tcPr>
+            <w:tcW w:w="0" w:type="auto"/>
+            <w:tcMar>
+              <w:top w:w="100" w:type="dxa"/>
+              <w:left w:w="120" w:type="dxa"/>
+              <w:bottom w:w="100" w:type="dxa"/>
+              <w:right w:w="120" w:type="dxa"/>
+            </w:tcMar>
+            <w:hideMark/>
+          </w:tcPr>
+          <w:p>
+            <w:pPr>
+              <w:spacing w:after="480"/>
+              <w:rPr>
+                <w:rFonts w:eastAsia="Times New Roman"/>
+                <w:color w:val="000000"/>
+              </w:rPr>
+            </w:pPr>
+            <w:r>
+              <w:rPr>
+                <w:rFonts w:eastAsia="Times New Roman"/>
+                <w:color w:val="000000"/>
+              </w:rPr>
+              <w:t>VARCHAR(255)</w:t>
+            </w:r>
+          </w:p>
+        </w:tc>
+        <w:tc>
+          <w:tcPr>
+            <w:tcW w:w="0" w:type="auto"/>
+            <w:tcMar>
+              <w:top w:w="100" w:type="dxa"/>
+              <w:left w:w="120" w:type="dxa"/>
+              <w:bottom w:w="100" w:type="dxa"/>
+              <w:right w:w="120" w:type="dxa"/>
+            </w:tcMar>
+            <w:hideMark/>
+          </w:tcPr>
+          <w:p>
+            <w:pPr>
+              <w:spacing w:after="480"/>
+              <w:jc w:val="center"/>
+              <w:rPr>
+                <w:rFonts w:eastAsia="Times New Roman"/>
+                <w:color w:val="000000"/>
+              </w:rPr>
+            </w:pPr>
+            <w:r>
+              <w:rPr>
+                <w:rFonts w:eastAsia="Times New Roman"/>
+                <w:color w:val="000000"/>
+              </w:rPr>
+              <w:t>Yes</w:t>
+            </w:r>
+          </w:p>
+        </w:tc>
+        <w:tc>
+          <w:tcPr>
+            <w:tcW w:w="0" w:type="auto"/>
+            <w:tcMar>
+              <w:top w:w="100" w:type="dxa"/>
+              <w:left w:w="120" w:type="dxa"/>
+              <w:bottom w:w="100" w:type="dxa"/>
+              <w:right w:w="120" w:type="dxa"/>
+            </w:tcMar>
+            <w:hideMark/>
+          </w:tcPr>
+          <w:p>
+            <w:pPr>
+              <w:spacing w:after="480"/>
+              <w:jc w:val="center"/>
+              <w:rPr>
+                <w:rFonts w:eastAsia="Times New Roman"/>
+                <w:color w:val="000000"/>
+              </w:rPr>
+            </w:pPr>
+            <w:r>
+              <w:rPr>
+                <w:rFonts w:eastAsia="Times New Roman"/>
+                <w:color w:val="000000"/>
+              </w:rPr>
+              <w:t>Unique</w:t>
+            </w:r>
+          </w:p>
+        </w:tc>
+        <w:tc>
+          <w:tcPr>
+            <w:tcW w:w="0" w:type="auto"/>
+            <w:tcMar>
+              <w:top w:w="100" w:type="dxa"/>
+              <w:left w:w="120" w:type="dxa"/>
+              <w:bottom w:w="100" w:type="dxa"/>
+              <w:right w:w="120" w:type="dxa"/>
+            </w:tcMar>
+            <w:hideMark/>
+          </w:tcPr>
+          <w:p>
+            <w:pPr>
+              <w:spacing w:after="480"/>
+              <w:rPr>
+                <w:rFonts w:eastAsia="Times New Roman"/>
+                <w:color w:val="000000"/>
+              </w:rPr>
+            </w:pPr>
+            <w:r>
+              <w:rPr>
+                <w:rFonts w:eastAsia="Times New Roman"/>
+                <w:color w:val="000000"/>
+              </w:rPr>
+              <w:t>Administrator’s email address used for system login</w:t>
+            </w:r>
+          </w:p>
+        </w:tc>
+      </w:tr>
+      <w:tr>
+        <w:trPr>
+          <w:divId w:val="1414663851"/>
+          <w:cantSplit/>
+          <w:jc w:val="center"/>
+        </w:trPr>
+        <w:tc>
+          <w:tcPr>
+            <w:tcW w:w="0" w:type="auto"/>
+            <w:tcMar>
+              <w:top w:w="100" w:type="dxa"/>
+              <w:left w:w="120" w:type="dxa"/>
+              <w:bottom w:w="100" w:type="dxa"/>
+              <w:right w:w="120" w:type="dxa"/>
+            </w:tcMar>
+            <w:hideMark/>
+          </w:tcPr>
+          <w:p>
+            <w:pPr>
+              <w:spacing w:after="480"/>
+              <w:rPr>
+                <w:rFonts w:eastAsia="Times New Roman"/>
+                <w:color w:val="000000"/>
+              </w:rPr>
+            </w:pPr>
+            <w:r>
+              <w:rPr>
+                <w:rFonts w:eastAsia="Times New Roman"/>
+                <w:color w:val="000000"/>
+              </w:rPr>
+              <w:t>password_hash</w:t>
+            </w:r>
+          </w:p>
+        </w:tc>
+        <w:tc>
+          <w:tcPr>
+            <w:tcW w:w="0" w:type="auto"/>
+            <w:tcMar>
+              <w:top w:w="100" w:type="dxa"/>
+              <w:left w:w="120" w:type="dxa"/>
+              <w:bottom w:w="100" w:type="dxa"/>
+              <w:right w:w="120" w:type="dxa"/>
+            </w:tcMar>
+            <w:hideMark/>
+          </w:tcPr>
+          <w:p>
+            <w:pPr>
+              <w:spacing w:after="480"/>
+              <w:rPr>
+                <w:rFonts w:eastAsia="Times New Roman"/>
+                <w:color w:val="000000"/>
+              </w:rPr>
+            </w:pPr>
+            <w:r>
+              <w:rPr>
+                <w:rFonts w:eastAsia="Times New Roman"/>
+                <w:color w:val="000000"/>
+              </w:rPr>
+              <w:t>VARCHAR(255)</w:t>
+            </w:r>
+          </w:p>
+        </w:tc>
+        <w:tc>
+          <w:tcPr>
+            <w:tcW w:w="0" w:type="auto"/>
+            <w:tcMar>
+              <w:top w:w="100" w:type="dxa"/>
+              <w:left w:w="120" w:type="dxa"/>
+              <w:bottom w:w="100" w:type="dxa"/>
+              <w:right w:w="120" w:type="dxa"/>
+            </w:tcMar>
+            <w:hideMark/>
+          </w:tcPr>
+          <w:p>
+            <w:pPr>
+              <w:spacing w:after="480"/>
+              <w:jc w:val="center"/>
+              <w:rPr>
+                <w:rFonts w:eastAsia="Times New Roman"/>
+                <w:color w:val="000000"/>
+              </w:rPr>
+            </w:pPr>
+            <w:r>
+              <w:rPr>
+                <w:rFonts w:eastAsia="Times New Roman"/>
+                <w:color w:val="000000"/>
+              </w:rPr>
+              <w:t>Yes</w:t>
+            </w:r>
+          </w:p>
+        </w:tc>
+        <w:tc>
+          <w:tcPr>
+            <w:tcW w:w="0" w:type="auto"/>
+            <w:tcMar>
+              <w:top w:w="100" w:type="dxa"/>
+              <w:left w:w="120" w:type="dxa"/>
+              <w:bottom w:w="100" w:type="dxa"/>
+              <w:right w:w="120" w:type="dxa"/>
+            </w:tcMar>
+            <w:hideMark/>
+          </w:tcPr>
+          <w:p>
+            <w:pPr>
+              <w:spacing w:after="480"/>
+              <w:jc w:val="center"/>
+              <w:rPr>
+                <w:rFonts w:eastAsia="Times New Roman"/>
+                <w:color w:val="000000"/>
+              </w:rPr>
+            </w:pPr>
+            <w:r>
+              <w:rPr>
+                <w:rFonts w:eastAsia="Times New Roman"/>
+                <w:color w:val="000000"/>
+              </w:rPr>
+              <w:t>—</w:t>
+            </w:r>
+          </w:p>
+        </w:tc>
+        <w:tc>
+          <w:tcPr>
+            <w:tcW w:w="0" w:type="auto"/>
+            <w:tcMar>
+              <w:top w:w="100" w:type="dxa"/>
+              <w:left w:w="120" w:type="dxa"/>
+              <w:bottom w:w="100" w:type="dxa"/>
+              <w:right w:w="120" w:type="dxa"/>
+            </w:tcMar>
+            <w:hideMark/>
+          </w:tcPr>
+          <w:p>
+            <w:pPr>
+              <w:spacing w:after="480"/>
+              <w:rPr>
+                <w:rFonts w:eastAsia="Times New Roman"/>
+                <w:color w:val="000000"/>
+              </w:rPr>
+            </w:pPr>
+            <w:r>
+              <w:rPr>
+                <w:rFonts w:eastAsia="Times New Roman"/>
+                <w:color w:val="000000"/>
+              </w:rPr>
+              <w:t>Securely hashed administrator password</w:t>
+            </w:r>
+          </w:p>
+        </w:tc>
+      </w:tr>
+      <w:tr>
+        <w:trPr>
+          <w:divId w:val="1414663851"/>
+          <w:cantSplit/>
+          <w:jc w:val="center"/>
+        </w:trPr>
+        <w:tc>
+          <w:tcPr>
+            <w:tcW w:w="0" w:type="auto"/>
+            <w:tcMar>
+              <w:top w:w="100" w:type="dxa"/>
+              <w:left w:w="120" w:type="dxa"/>
+              <w:bottom w:w="100" w:type="dxa"/>
+              <w:right w:w="120" w:type="dxa"/>
+            </w:tcMar>
+            <w:hideMark/>
+          </w:tcPr>
+          <w:p>
+            <w:pPr>
+              <w:spacing w:after="480"/>
+              <w:rPr>
+                <w:rFonts w:eastAsia="Times New Roman"/>
+                <w:color w:val="000000"/>
+              </w:rPr>
+            </w:pPr>
+            <w:r>
+              <w:rPr>
+                <w:rFonts w:eastAsia="Times New Roman"/>
+                <w:color w:val="000000"/>
+              </w:rPr>
+              <w:t>reset_token_hash</w:t>
+            </w:r>
+          </w:p>
+        </w:tc>
+        <w:tc>
+          <w:tcPr>
+            <w:tcW w:w="0" w:type="auto"/>
+            <w:tcMar>
+              <w:top w:w="100" w:type="dxa"/>
+              <w:left w:w="120" w:type="dxa"/>
+              <w:bottom w:w="100" w:type="dxa"/>
+              <w:right w:w="120" w:type="dxa"/>
+            </w:tcMar>
+            <w:hideMark/>
+          </w:tcPr>
+          <w:p>
+            <w:pPr>
+              <w:spacing w:after="480"/>
+              <w:rPr>
+                <w:rFonts w:eastAsia="Times New Roman"/>
+                <w:color w:val="000000"/>
+              </w:rPr>
+            </w:pPr>
+            <w:r>
+              <w:rPr>
+                <w:rFonts w:eastAsia="Times New Roman"/>
+                <w:color w:val="000000"/>
+              </w:rPr>
+              <w:t>VARCHAR(255)</w:t>
+            </w:r>
+          </w:p>
+        </w:tc>
+        <w:tc>
+          <w:tcPr>
+            <w:tcW w:w="0" w:type="auto"/>
+            <w:tcMar>
+              <w:top w:w="100" w:type="dxa"/>
+              <w:left w:w="120" w:type="dxa"/>
+              <w:bottom w:w="100" w:type="dxa"/>
+              <w:right w:w="120" w:type="dxa"/>
+            </w:tcMar>
+            <w:hideMark/>
+          </w:tcPr>
+          <w:p>
+            <w:pPr>
+              <w:spacing w:after="480"/>
+              <w:jc w:val="center"/>
+              <w:rPr>
+                <w:rFonts w:eastAsia="Times New Roman"/>
+                <w:color w:val="000000"/>
+              </w:rPr>
+            </w:pPr>
+            <w:r>
+              <w:rPr>
+                <w:rFonts w:eastAsia="Times New Roman"/>
+                <w:color w:val="000000"/>
+              </w:rPr>
+              <w:t>No</w:t>
+            </w:r>
+          </w:p>
+        </w:tc>
+        <w:tc>
+          <w:tcPr>
+            <w:tcW w:w="0" w:type="auto"/>
+            <w:tcMar>
+              <w:top w:w="100" w:type="dxa"/>
+              <w:left w:w="120" w:type="dxa"/>
+              <w:bottom w:w="100" w:type="dxa"/>
+              <w:right w:w="120" w:type="dxa"/>
+            </w:tcMar>
+            <w:hideMark/>
+          </w:tcPr>
+          <w:p>
+            <w:pPr>
+              <w:spacing w:after="480"/>
+              <w:jc w:val="center"/>
+              <w:rPr>
+                <w:rFonts w:eastAsia="Times New Roman"/>
+                <w:color w:val="000000"/>
+              </w:rPr>
+            </w:pPr>
+            <w:r>
+              <w:rPr>
+                <w:rFonts w:eastAsia="Times New Roman"/>
+                <w:color w:val="000000"/>
+              </w:rPr>
+              <w:t>—</w:t>
+            </w:r>
+          </w:p>
+        </w:tc>
+        <w:tc>
+          <w:tcPr>
+            <w:tcW w:w="0" w:type="auto"/>
+            <w:tcMar>
+              <w:top w:w="100" w:type="dxa"/>
+              <w:left w:w="120" w:type="dxa"/>
+              <w:bottom w:w="100" w:type="dxa"/>
+              <w:right w:w="120" w:type="dxa"/>
+            </w:tcMar>
+            <w:hideMark/>
+          </w:tcPr>
+          <w:p>
+            <w:pPr>
+              <w:spacing w:after="480"/>
+              <w:rPr>
+                <w:rFonts w:eastAsia="Times New Roman"/>
+                <w:color w:val="000000"/>
+              </w:rPr>
+            </w:pPr>
+            <w:r>
+              <w:rPr>
+                <w:rFonts w:eastAsia="Times New Roman"/>
+                <w:color w:val="000000"/>
+              </w:rPr>
+              <w:t>Hashed password-reset token</w:t>
+            </w:r>
+          </w:p>
+        </w:tc>
+      </w:tr>
+      <w:tr>
+        <w:trPr>
+          <w:divId w:val="1414663851"/>
+          <w:cantSplit/>
+          <w:jc w:val="center"/>
+        </w:trPr>
+        <w:tc>
+          <w:tcPr>
+            <w:tcW w:w="0" w:type="auto"/>
+            <w:tcMar>
+              <w:top w:w="100" w:type="dxa"/>
+              <w:left w:w="120" w:type="dxa"/>
+              <w:bottom w:w="100" w:type="dxa"/>
+              <w:right w:w="120" w:type="dxa"/>
+            </w:tcMar>
+            <w:hideMark/>
+          </w:tcPr>
+          <w:p>
+            <w:pPr>
+              <w:spacing w:after="480"/>
+              <w:rPr>
+                <w:rFonts w:eastAsia="Times New Roman"/>
+                <w:color w:val="000000"/>
+              </w:rPr>
+            </w:pPr>
+            <w:r>
+              <w:rPr>
+                <w:rFonts w:eastAsia="Times New Roman"/>
+                <w:color w:val="000000"/>
+              </w:rPr>
+              <w:t>reset_expires_at</w:t>
+            </w:r>
+          </w:p>
+        </w:tc>
+        <w:tc>
+          <w:tcPr>
+            <w:tcW w:w="0" w:type="auto"/>
+            <w:tcMar>
+              <w:top w:w="100" w:type="dxa"/>
+              <w:left w:w="120" w:type="dxa"/>
+              <w:bottom w:w="100" w:type="dxa"/>
+              <w:right w:w="120" w:type="dxa"/>
+            </w:tcMar>
+            <w:hideMark/>
+          </w:tcPr>
+          <w:p>
+            <w:pPr>
+              <w:spacing w:after="480"/>
+              <w:rPr>
+                <w:rFonts w:eastAsia="Times New Roman"/>
+                <w:color w:val="000000"/>
+              </w:rPr>
+            </w:pPr>
+            <w:r>
+              <w:rPr>
+                <w:rFonts w:eastAsia="Times New Roman"/>
+                <w:color w:val="000000"/>
+              </w:rPr>
+              <w:t>DATETIME</w:t>
+            </w:r>
+          </w:p>
+        </w:tc>
+        <w:tc>
+          <w:tcPr>
+            <w:tcW w:w="0" w:type="auto"/>
+            <w:tcMar>
+              <w:top w:w="100" w:type="dxa"/>
+              <w:left w:w="120" w:type="dxa"/>
+              <w:bottom w:w="100" w:type="dxa"/>
+              <w:right w:w="120" w:type="dxa"/>
+            </w:tcMar>
+            <w:hideMark/>
+          </w:tcPr>
+          <w:p>
+            <w:pPr>
+              <w:spacing w:after="480"/>
+              <w:jc w:val="center"/>
+              <w:rPr>
+                <w:rFonts w:eastAsia="Times New Roman"/>
+                <w:color w:val="000000"/>
+              </w:rPr>
+            </w:pPr>
+            <w:r>
+              <w:rPr>
+                <w:rFonts w:eastAsia="Times New Roman"/>
+                <w:color w:val="000000"/>
+              </w:rPr>
+              <w:t>No</w:t>
+            </w:r>
+          </w:p>
+        </w:tc>
+        <w:tc>
+          <w:tcPr>
+            <w:tcW w:w="0" w:type="auto"/>
+            <w:tcMar>
+              <w:top w:w="100" w:type="dxa"/>
+              <w:left w:w="120" w:type="dxa"/>
+              <w:bottom w:w="100" w:type="dxa"/>
+              <w:right w:w="120" w:type="dxa"/>
+            </w:tcMar>
+            <w:hideMark/>
+          </w:tcPr>
+          <w:p>
+            <w:pPr>
+              <w:spacing w:after="480"/>
+              <w:jc w:val="center"/>
+              <w:rPr>
+                <w:rFonts w:eastAsia="Times New Roman"/>
+                <w:color w:val="000000"/>
+              </w:rPr>
+            </w:pPr>
+            <w:r>
+              <w:rPr>
+                <w:rFonts w:eastAsia="Times New Roman"/>
+                <w:color w:val="000000"/>
+              </w:rPr>
+              <w:t>—</w:t>
+            </w:r>
+          </w:p>
+        </w:tc>
+        <w:tc>
+          <w:tcPr>
+            <w:tcW w:w="0" w:type="auto"/>
+            <w:tcMar>
+              <w:top w:w="100" w:type="dxa"/>
+              <w:left w:w="120" w:type="dxa"/>
+              <w:bottom w:w="100" w:type="dxa"/>
+              <w:right w:w="120" w:type="dxa"/>
+            </w:tcMar>
+            <w:hideMark/>
+          </w:tcPr>
+          <w:p>
+            <w:pPr>
+              <w:spacing w:after="480"/>
+              <w:rPr>
+                <w:rFonts w:eastAsia="Times New Roman"/>
+                <w:color w:val="000000"/>
+              </w:rPr>
+            </w:pPr>
+            <w:r>
+              <w:rPr>
+                <w:rFonts w:eastAsia="Times New Roman"/>
+                <w:color w:val="000000"/>
+              </w:rPr>
+              <w:t>Expiration date and time of the reset token</w:t>
+            </w:r>
+          </w:p>
+        </w:tc>
+      </w:tr>
+      <w:tr>
+        <w:trPr>
+          <w:divId w:val="1414663851"/>
+          <w:cantSplit/>
+          <w:jc w:val="center"/>
+        </w:trPr>
+        <w:tc>
+          <w:tcPr>
+            <w:tcW w:w="0" w:type="auto"/>
+            <w:tcMar>
+              <w:top w:w="100" w:type="dxa"/>
+              <w:left w:w="120" w:type="dxa"/>
+              <w:bottom w:w="100" w:type="dxa"/>
+              <w:right w:w="120" w:type="dxa"/>
+            </w:tcMar>
+            <w:hideMark/>
+          </w:tcPr>
+          <w:p>
+            <w:pPr>
+              <w:spacing w:after="480"/>
+              <w:rPr>
+                <w:rFonts w:eastAsia="Times New Roman"/>
+                <w:color w:val="000000"/>
+              </w:rPr>
+            </w:pPr>
+            <w:r>
+              <w:rPr>
+                <w:rFonts w:eastAsia="Times New Roman"/>
+                <w:color w:val="000000"/>
+              </w:rPr>
+              <w:t>created_at</w:t>
+            </w:r>
+          </w:p>
+        </w:tc>
+        <w:tc>
+          <w:tcPr>
+            <w:tcW w:w="0" w:type="auto"/>
+            <w:tcMar>
+              <w:top w:w="100" w:type="dxa"/>
+              <w:left w:w="120" w:type="dxa"/>
+              <w:bottom w:w="100" w:type="dxa"/>
+              <w:right w:w="120" w:type="dxa"/>
+            </w:tcMar>
+            <w:hideMark/>
+          </w:tcPr>
+          <w:p>
+            <w:pPr>
+              <w:spacing w:after="480"/>
+              <w:rPr>
+                <w:rFonts w:eastAsia="Times New Roman"/>
+                <w:color w:val="000000"/>
+              </w:rPr>
+            </w:pPr>
+            <w:r>
+              <w:rPr>
+                <w:rFonts w:eastAsia="Times New Roman"/>
+                <w:color w:val="000000"/>
+              </w:rPr>
+              <w:t>DATETIME</w:t>
+            </w:r>
+          </w:p>
+        </w:tc>
+        <w:tc>
+          <w:tcPr>
+            <w:tcW w:w="0" w:type="auto"/>
+            <w:tcMar>
+              <w:top w:w="100" w:type="dxa"/>
+              <w:left w:w="120" w:type="dxa"/>
+              <w:bottom w:w="100" w:type="dxa"/>
+              <w:right w:w="120" w:type="dxa"/>
+            </w:tcMar>
+            <w:hideMark/>
+          </w:tcPr>
+          <w:p>
+            <w:pPr>
+              <w:spacing w:after="480"/>
+              <w:jc w:val="center"/>
+              <w:rPr>
+                <w:rFonts w:eastAsia="Times New Roman"/>
+                <w:color w:val="000000"/>
+              </w:rPr>
+            </w:pPr>
+            <w:r>
+              <w:rPr>
+                <w:rFonts w:eastAsia="Times New Roman"/>
+                <w:color w:val="000000"/>
+              </w:rPr>
+              <w:t>Yes</w:t>
+            </w:r>
+          </w:p>
+        </w:tc>
+        <w:tc>
+          <w:tcPr>
+            <w:tcW w:w="0" w:type="auto"/>
+            <w:tcMar>
+              <w:top w:w="100" w:type="dxa"/>
+              <w:left w:w="120" w:type="dxa"/>
+              <w:bottom w:w="100" w:type="dxa"/>
+              <w:right w:w="120" w:type="dxa"/>
+            </w:tcMar>
+            <w:hideMark/>
+          </w:tcPr>
+          <w:p>
+            <w:pPr>
+              <w:spacing w:after="480"/>
+              <w:jc w:val="center"/>
+              <w:rPr>
+                <w:rFonts w:eastAsia="Times New Roman"/>
+                <w:color w:val="000000"/>
+              </w:rPr>
+            </w:pPr>
+            <w:r>
+              <w:rPr>
+                <w:rFonts w:eastAsia="Times New Roman"/>
+                <w:color w:val="000000"/>
+              </w:rPr>
+              <w:t>—</w:t>
+            </w:r>
+          </w:p>
+        </w:tc>
+        <w:tc>
+          <w:tcPr>
+            <w:tcW w:w="0" w:type="auto"/>
+            <w:tcMar>
+              <w:top w:w="100" w:type="dxa"/>
+              <w:left w:w="120" w:type="dxa"/>
+              <w:bottom w:w="100" w:type="dxa"/>
+              <w:right w:w="120" w:type="dxa"/>
+            </w:tcMar>
+            <w:hideMark/>
+          </w:tcPr>
+          <w:p>
+            <w:pPr>
+              <w:spacing w:after="480"/>
+              <w:rPr>
+                <w:rFonts w:eastAsia="Times New Roman"/>
+                <w:color w:val="000000"/>
+              </w:rPr>
+            </w:pPr>
+            <w:r>
+              <w:rPr>
+                <w:rFonts w:eastAsia="Times New Roman"/>
+                <w:color w:val="000000"/>
+              </w:rPr>
+              <w:t>Date and time the account was created</w:t>
+            </w:r>
+          </w:p>
+        </w:tc>
+      </w:tr>
+      <w:tr>
+        <w:trPr>
+          <w:divId w:val="1414663851"/>
+          <w:cantSplit/>
+          <w:jc w:val="center"/>
+        </w:trPr>
+        <w:tc>
+          <w:tcPr>
+            <w:tcW w:w="0" w:type="auto"/>
+            <w:tcMar>
+              <w:top w:w="100" w:type="dxa"/>
+              <w:left w:w="120" w:type="dxa"/>
+              <w:bottom w:w="100" w:type="dxa"/>
+              <w:right w:w="120" w:type="dxa"/>
+            </w:tcMar>
+            <w:hideMark/>
+          </w:tcPr>
+          <w:p>
+            <w:pPr>
+              <w:spacing w:after="480"/>
+              <w:rPr>
+                <w:rFonts w:eastAsia="Times New Roman"/>
+                <w:color w:val="000000"/>
+              </w:rPr>
+            </w:pPr>
+            <w:r>
+              <w:rPr>
+                <w:rFonts w:eastAsia="Times New Roman"/>
+                <w:color w:val="000000"/>
+              </w:rPr>
+              <w:t>updated_at</w:t>
+            </w:r>
+          </w:p>
+        </w:tc>
+        <w:tc>
+          <w:tcPr>
+            <w:tcW w:w="0" w:type="auto"/>
+            <w:tcMar>
+              <w:top w:w="100" w:type="dxa"/>
+              <w:left w:w="120" w:type="dxa"/>
+              <w:bottom w:w="100" w:type="dxa"/>
+              <w:right w:w="120" w:type="dxa"/>
+            </w:tcMar>
+            <w:hideMark/>
+          </w:tcPr>
+          <w:p>
+            <w:pPr>
+              <w:spacing w:after="480"/>
+              <w:rPr>
+                <w:rFonts w:eastAsia="Times New Roman"/>
+                <w:color w:val="000000"/>
+              </w:rPr>
+            </w:pPr>
+            <w:r>
+              <w:rPr>
+                <w:rFonts w:eastAsia="Times New Roman"/>
+                <w:color w:val="000000"/>
+              </w:rPr>
+              <w:t>DATETIME</w:t>
+            </w:r>
+          </w:p>
+        </w:tc>
+        <w:tc>
+          <w:tcPr>
+            <w:tcW w:w="0" w:type="auto"/>
+            <w:tcMar>
+              <w:top w:w="100" w:type="dxa"/>
+              <w:left w:w="120" w:type="dxa"/>
+              <w:bottom w:w="100" w:type="dxa"/>
+              <w:right w:w="120" w:type="dxa"/>
+            </w:tcMar>
+            <w:hideMark/>
+          </w:tcPr>
+          <w:p>
+            <w:pPr>
+              <w:spacing w:after="480"/>
+              <w:jc w:val="center"/>
+              <w:rPr>
+                <w:rFonts w:eastAsia="Times New Roman"/>
+                <w:color w:val="000000"/>
+              </w:rPr>
+            </w:pPr>
+            <w:r>
+              <w:rPr>
+                <w:rFonts w:eastAsia="Times New Roman"/>
+                <w:color w:val="000000"/>
+              </w:rPr>
+              <w:t>Yes</w:t>
+            </w:r>
+          </w:p>
+        </w:tc>
+        <w:tc>
+          <w:tcPr>
+            <w:tcW w:w="0" w:type="auto"/>
+            <w:tcMar>
+              <w:top w:w="100" w:type="dxa"/>
+              <w:left w:w="120" w:type="dxa"/>
+              <w:bottom w:w="100" w:type="dxa"/>
+              <w:right w:w="120" w:type="dxa"/>
+            </w:tcMar>
+            <w:hideMark/>
+          </w:tcPr>
+          <w:p>
+            <w:pPr>
+              <w:spacing w:after="480"/>
+              <w:jc w:val="center"/>
+              <w:rPr>
+                <w:rFonts w:eastAsia="Times New Roman"/>
+                <w:color w:val="000000"/>
+              </w:rPr>
+            </w:pPr>
+            <w:r>
+              <w:rPr>
+                <w:rFonts w:eastAsia="Times New Roman"/>
+                <w:color w:val="000000"/>
+              </w:rPr>
+              <w:t>—</w:t>
+            </w:r>
+          </w:p>
+        </w:tc>
+        <w:tc>
+          <w:tcPr>
+            <w:tcW w:w="0" w:type="auto"/>
+            <w:tcMar>
+              <w:top w:w="100" w:type="dxa"/>
+              <w:left w:w="120" w:type="dxa"/>
+              <w:bottom w:w="100" w:type="dxa"/>
+              <w:right w:w="120" w:type="dxa"/>
+            </w:tcMar>
+            <w:hideMark/>
+          </w:tcPr>
+          <w:p>
+            <w:pPr>
+              <w:spacing w:after="480"/>
+              <w:rPr>
+                <w:rFonts w:eastAsia="Times New Roman"/>
+                <w:color w:val="000000"/>
+              </w:rPr>
+            </w:pPr>
+            <w:r>
+              <w:rPr>
+                <w:rFonts w:eastAsia="Times New Roman"/>
+                <w:color w:val="000000"/>
+              </w:rPr>
+              <w:t>Date and time the account was last updated</w:t>
+            </w:r>
+          </w:p>
+        </w:tc>
+      </w:tr>
+    </w:tbl>
     <w:p>
       <w:pPr>
         <w:keepNext/>
@@ -24,1250 +1274,10 @@
           <w:color w:val="000000"/>
           <w:lang w:val="en"/>
         </w:rPr>
+        <w:lastRenderedPageBreak/>
         <w:t>Table 1. Admins</w:t>
       </w:r>
     </w:p>
-    <w:tbl>
-      <w:tblPr>
-        <w:tblW w:w="5000" w:type="pct"/>
-        <w:tblBorders>
-          <w:top w:val="single" w:sz="4" w:space="0" w:color="000000"/>
-          <w:left w:val="single" w:sz="4" w:space="0" w:color="000000"/>
-          <w:bottom w:val="single" w:sz="4" w:space="0" w:color="000000"/>
-          <w:right w:val="single" w:sz="4" w:space="0" w:color="000000"/>
-          <w:insideH w:val="single" w:sz="4" w:space="0" w:color="000000"/>
-          <w:insideV w:val="single" w:sz="4" w:space="0" w:color="000000"/>
-        </w:tblBorders>
-        <w:tblCellMar>
-          <w:top w:w="15" w:type="dxa"/>
-          <w:left w:w="15" w:type="dxa"/>
-          <w:bottom w:w="15" w:type="dxa"/>
-          <w:right w:w="15" w:type="dxa"/>
-        </w:tblCellMar>
-        <w:tblLook w:val="04A0" w:firstRow="1" w:lastRow="0" w:firstColumn="1" w:lastColumn="0" w:noHBand="0" w:noVBand="1"/>
-      </w:tblPr>
-      <w:tblGrid>
-        <w:gridCol w:w="1907"/>
-        <w:gridCol w:w="1934"/>
-        <w:gridCol w:w="1200"/>
-        <w:gridCol w:w="1359"/>
-        <w:gridCol w:w="2950"/>
-      </w:tblGrid>
-      <w:tr>
-        <w:trPr>
-          <w:divId w:val="631641576"/>
-          <w:cantSplit/>
-          <w:tblHeader/>
-        </w:trPr>
-        <w:tc>
-          <w:tcPr>
-            <w:tcW w:w="1000" w:type="pct"/>
-            <w:shd w:val="clear" w:color="auto" w:fill="FFFFFF"/>
-            <w:tcMar>
-              <w:top w:w="100" w:type="dxa"/>
-              <w:left w:w="120" w:type="dxa"/>
-              <w:bottom w:w="100" w:type="dxa"/>
-              <w:right w:w="120" w:type="dxa"/>
-            </w:tcMar>
-            <w:hideMark/>
-          </w:tcPr>
-          <w:p>
-            <w:pPr>
-              <w:spacing w:after="480"/>
-              <w:jc w:val="center"/>
-              <w:rPr>
-                <w:rFonts w:eastAsia="Times New Roman"/>
-                <w:b/>
-                <w:bCs/>
-                <w:color w:val="000000"/>
-              </w:rPr>
-            </w:pPr>
-            <w:r>
-              <w:rPr>
-                <w:rFonts w:eastAsia="Times New Roman"/>
-                <w:b/>
-                <w:bCs/>
-                <w:color w:val="000000"/>
-              </w:rPr>
-              <w:t>Field</w:t>
-            </w:r>
-          </w:p>
-        </w:tc>
-        <w:tc>
-          <w:tcPr>
-            <w:tcW w:w="750" w:type="pct"/>
-            <w:shd w:val="clear" w:color="auto" w:fill="FFFFFF"/>
-            <w:tcMar>
-              <w:top w:w="100" w:type="dxa"/>
-              <w:left w:w="120" w:type="dxa"/>
-              <w:bottom w:w="100" w:type="dxa"/>
-              <w:right w:w="120" w:type="dxa"/>
-            </w:tcMar>
-            <w:hideMark/>
-          </w:tcPr>
-          <w:p>
-            <w:pPr>
-              <w:spacing w:after="480"/>
-              <w:jc w:val="center"/>
-              <w:rPr>
-                <w:rFonts w:eastAsia="Times New Roman"/>
-                <w:b/>
-                <w:bCs/>
-                <w:color w:val="000000"/>
-              </w:rPr>
-            </w:pPr>
-            <w:r>
-              <w:rPr>
-                <w:rFonts w:eastAsia="Times New Roman"/>
-                <w:b/>
-                <w:bCs/>
-                <w:color w:val="000000"/>
-              </w:rPr>
-              <w:t>Data Type</w:t>
-            </w:r>
-          </w:p>
-        </w:tc>
-        <w:tc>
-          <w:tcPr>
-            <w:tcW w:w="600" w:type="pct"/>
-            <w:shd w:val="clear" w:color="auto" w:fill="FFFFFF"/>
-            <w:tcMar>
-              <w:top w:w="100" w:type="dxa"/>
-              <w:left w:w="120" w:type="dxa"/>
-              <w:bottom w:w="100" w:type="dxa"/>
-              <w:right w:w="120" w:type="dxa"/>
-            </w:tcMar>
-            <w:hideMark/>
-          </w:tcPr>
-          <w:p>
-            <w:pPr>
-              <w:spacing w:after="480"/>
-              <w:jc w:val="center"/>
-              <w:rPr>
-                <w:rFonts w:eastAsia="Times New Roman"/>
-                <w:b/>
-                <w:bCs/>
-                <w:color w:val="000000"/>
-              </w:rPr>
-            </w:pPr>
-            <w:r>
-              <w:rPr>
-                <w:rFonts w:eastAsia="Times New Roman"/>
-                <w:b/>
-                <w:bCs/>
-                <w:color w:val="000000"/>
-              </w:rPr>
-              <w:t>Required</w:t>
-            </w:r>
-          </w:p>
-        </w:tc>
-        <w:tc>
-          <w:tcPr>
-            <w:tcW w:w="900" w:type="pct"/>
-            <w:shd w:val="clear" w:color="auto" w:fill="FFFFFF"/>
-            <w:tcMar>
-              <w:top w:w="100" w:type="dxa"/>
-              <w:left w:w="120" w:type="dxa"/>
-              <w:bottom w:w="100" w:type="dxa"/>
-              <w:right w:w="120" w:type="dxa"/>
-            </w:tcMar>
-            <w:hideMark/>
-          </w:tcPr>
-          <w:p>
-            <w:pPr>
-              <w:spacing w:after="480"/>
-              <w:jc w:val="center"/>
-              <w:rPr>
-                <w:rFonts w:eastAsia="Times New Roman"/>
-                <w:b/>
-                <w:bCs/>
-                <w:color w:val="000000"/>
-              </w:rPr>
-            </w:pPr>
-            <w:r>
-              <w:rPr>
-                <w:rFonts w:eastAsia="Times New Roman"/>
-                <w:b/>
-                <w:bCs/>
-                <w:color w:val="000000"/>
-              </w:rPr>
-              <w:t>Key</w:t>
-            </w:r>
-          </w:p>
-        </w:tc>
-        <w:tc>
-          <w:tcPr>
-            <w:tcW w:w="1750" w:type="pct"/>
-            <w:shd w:val="clear" w:color="auto" w:fill="FFFFFF"/>
-            <w:tcMar>
-              <w:top w:w="100" w:type="dxa"/>
-              <w:left w:w="120" w:type="dxa"/>
-              <w:bottom w:w="100" w:type="dxa"/>
-              <w:right w:w="120" w:type="dxa"/>
-            </w:tcMar>
-            <w:hideMark/>
-          </w:tcPr>
-          <w:p>
-            <w:pPr>
-              <w:spacing w:after="480"/>
-              <w:jc w:val="center"/>
-              <w:rPr>
-                <w:rFonts w:eastAsia="Times New Roman"/>
-                <w:b/>
-                <w:bCs/>
-                <w:color w:val="000000"/>
-              </w:rPr>
-            </w:pPr>
-            <w:r>
-              <w:rPr>
-                <w:rFonts w:eastAsia="Times New Roman"/>
-                <w:b/>
-                <w:bCs/>
-                <w:color w:val="000000"/>
-              </w:rPr>
-              <w:t>Description</w:t>
-            </w:r>
-          </w:p>
-        </w:tc>
-      </w:tr>
-      <w:tr>
-        <w:trPr>
-          <w:divId w:val="631641576"/>
-          <w:cantSplit/>
-        </w:trPr>
-        <w:tc>
-          <w:tcPr>
-            <w:tcW w:w="0" w:type="auto"/>
-            <w:tcMar>
-              <w:top w:w="100" w:type="dxa"/>
-              <w:left w:w="120" w:type="dxa"/>
-              <w:bottom w:w="100" w:type="dxa"/>
-              <w:right w:w="120" w:type="dxa"/>
-            </w:tcMar>
-            <w:hideMark/>
-          </w:tcPr>
-          <w:p>
-            <w:pPr>
-              <w:spacing w:after="480"/>
-              <w:rPr>
-                <w:rFonts w:eastAsia="Times New Roman"/>
-                <w:color w:val="000000"/>
-              </w:rPr>
-            </w:pPr>
-            <w:r>
-              <w:rPr>
-                <w:rFonts w:eastAsia="Times New Roman"/>
-                <w:color w:val="000000"/>
-              </w:rPr>
-              <w:t>id</w:t>
-            </w:r>
-          </w:p>
-        </w:tc>
-        <w:tc>
-          <w:tcPr>
-            <w:tcW w:w="0" w:type="auto"/>
-            <w:tcMar>
-              <w:top w:w="100" w:type="dxa"/>
-              <w:left w:w="120" w:type="dxa"/>
-              <w:bottom w:w="100" w:type="dxa"/>
-              <w:right w:w="120" w:type="dxa"/>
-            </w:tcMar>
-            <w:hideMark/>
-          </w:tcPr>
-          <w:p>
-            <w:pPr>
-              <w:spacing w:after="480"/>
-              <w:rPr>
-                <w:rFonts w:eastAsia="Times New Roman"/>
-                <w:color w:val="000000"/>
-              </w:rPr>
-            </w:pPr>
-            <w:r>
-              <w:rPr>
-                <w:rFonts w:eastAsia="Times New Roman"/>
-                <w:color w:val="000000"/>
-              </w:rPr>
-              <w:t>BIGINT</w:t>
-            </w:r>
-          </w:p>
-        </w:tc>
-        <w:tc>
-          <w:tcPr>
-            <w:tcW w:w="0" w:type="auto"/>
-            <w:tcMar>
-              <w:top w:w="100" w:type="dxa"/>
-              <w:left w:w="120" w:type="dxa"/>
-              <w:bottom w:w="100" w:type="dxa"/>
-              <w:right w:w="120" w:type="dxa"/>
-            </w:tcMar>
-            <w:hideMark/>
-          </w:tcPr>
-          <w:p>
-            <w:pPr>
-              <w:spacing w:after="480"/>
-              <w:jc w:val="center"/>
-              <w:rPr>
-                <w:rFonts w:eastAsia="Times New Roman"/>
-                <w:color w:val="000000"/>
-              </w:rPr>
-            </w:pPr>
-            <w:r>
-              <w:rPr>
-                <w:rFonts w:eastAsia="Times New Roman"/>
-                <w:color w:val="000000"/>
-              </w:rPr>
-              <w:t>Yes</w:t>
-            </w:r>
-          </w:p>
-        </w:tc>
-        <w:tc>
-          <w:tcPr>
-            <w:tcW w:w="0" w:type="auto"/>
-            <w:tcMar>
-              <w:top w:w="100" w:type="dxa"/>
-              <w:left w:w="120" w:type="dxa"/>
-              <w:bottom w:w="100" w:type="dxa"/>
-              <w:right w:w="120" w:type="dxa"/>
-            </w:tcMar>
-            <w:hideMark/>
-          </w:tcPr>
-          <w:p>
-            <w:pPr>
-              <w:spacing w:after="480"/>
-              <w:jc w:val="center"/>
-              <w:rPr>
-                <w:rFonts w:eastAsia="Times New Roman"/>
-                <w:color w:val="000000"/>
-              </w:rPr>
-            </w:pPr>
-            <w:r>
-              <w:rPr>
-                <w:rFonts w:eastAsia="Times New Roman"/>
-                <w:color w:val="000000"/>
-              </w:rPr>
-              <w:t>Primary Key</w:t>
-            </w:r>
-          </w:p>
-        </w:tc>
-        <w:tc>
-          <w:tcPr>
-            <w:tcW w:w="0" w:type="auto"/>
-            <w:tcMar>
-              <w:top w:w="100" w:type="dxa"/>
-              <w:left w:w="120" w:type="dxa"/>
-              <w:bottom w:w="100" w:type="dxa"/>
-              <w:right w:w="120" w:type="dxa"/>
-            </w:tcMar>
-            <w:hideMark/>
-          </w:tcPr>
-          <w:p>
-            <w:pPr>
-              <w:spacing w:after="480"/>
-              <w:rPr>
-                <w:rFonts w:eastAsia="Times New Roman"/>
-                <w:color w:val="000000"/>
-              </w:rPr>
-            </w:pPr>
-            <w:r>
-              <w:rPr>
-                <w:rFonts w:eastAsia="Times New Roman"/>
-                <w:color w:val="000000"/>
-              </w:rPr>
-              <w:t>Unique identifier for the administrator account</w:t>
-            </w:r>
-          </w:p>
-        </w:tc>
-      </w:tr>
-      <w:tr>
-        <w:trPr>
-          <w:divId w:val="631641576"/>
-          <w:cantSplit/>
-        </w:trPr>
-        <w:tc>
-          <w:tcPr>
-            <w:tcW w:w="0" w:type="auto"/>
-            <w:tcMar>
-              <w:top w:w="100" w:type="dxa"/>
-              <w:left w:w="120" w:type="dxa"/>
-              <w:bottom w:w="100" w:type="dxa"/>
-              <w:right w:w="120" w:type="dxa"/>
-            </w:tcMar>
-            <w:hideMark/>
-          </w:tcPr>
-          <w:p>
-            <w:pPr>
-              <w:spacing w:after="480"/>
-              <w:rPr>
-                <w:rFonts w:eastAsia="Times New Roman"/>
-                <w:color w:val="000000"/>
-              </w:rPr>
-            </w:pPr>
-            <w:r>
-              <w:rPr>
-                <w:rFonts w:eastAsia="Times New Roman"/>
-                <w:color w:val="000000"/>
-              </w:rPr>
-              <w:t>email</w:t>
-            </w:r>
-          </w:p>
-        </w:tc>
-        <w:tc>
-          <w:tcPr>
-            <w:tcW w:w="0" w:type="auto"/>
-            <w:tcMar>
-              <w:top w:w="100" w:type="dxa"/>
-              <w:left w:w="120" w:type="dxa"/>
-              <w:bottom w:w="100" w:type="dxa"/>
-              <w:right w:w="120" w:type="dxa"/>
-            </w:tcMar>
-            <w:hideMark/>
-          </w:tcPr>
-          <w:p>
-            <w:pPr>
-              <w:spacing w:after="480"/>
-              <w:rPr>
-                <w:rFonts w:eastAsia="Times New Roman"/>
-                <w:color w:val="000000"/>
-              </w:rPr>
-            </w:pPr>
-            <w:r>
-              <w:rPr>
-                <w:rFonts w:eastAsia="Times New Roman"/>
-                <w:color w:val="000000"/>
-              </w:rPr>
-              <w:t>VARCHAR(255)</w:t>
-            </w:r>
-          </w:p>
-        </w:tc>
-        <w:tc>
-          <w:tcPr>
-            <w:tcW w:w="0" w:type="auto"/>
-            <w:tcMar>
-              <w:top w:w="100" w:type="dxa"/>
-              <w:left w:w="120" w:type="dxa"/>
-              <w:bottom w:w="100" w:type="dxa"/>
-              <w:right w:w="120" w:type="dxa"/>
-            </w:tcMar>
-            <w:hideMark/>
-          </w:tcPr>
-          <w:p>
-            <w:pPr>
-              <w:spacing w:after="480"/>
-              <w:jc w:val="center"/>
-              <w:rPr>
-                <w:rFonts w:eastAsia="Times New Roman"/>
-                <w:color w:val="000000"/>
-              </w:rPr>
-            </w:pPr>
-            <w:r>
-              <w:rPr>
-                <w:rFonts w:eastAsia="Times New Roman"/>
-                <w:color w:val="000000"/>
-              </w:rPr>
-              <w:t>Yes</w:t>
-            </w:r>
-          </w:p>
-        </w:tc>
-        <w:tc>
-          <w:tcPr>
-            <w:tcW w:w="0" w:type="auto"/>
-            <w:tcMar>
-              <w:top w:w="100" w:type="dxa"/>
-              <w:left w:w="120" w:type="dxa"/>
-              <w:bottom w:w="100" w:type="dxa"/>
-              <w:right w:w="120" w:type="dxa"/>
-            </w:tcMar>
-            <w:hideMark/>
-          </w:tcPr>
-          <w:p>
-            <w:pPr>
-              <w:spacing w:after="480"/>
-              <w:jc w:val="center"/>
-              <w:rPr>
-                <w:rFonts w:eastAsia="Times New Roman"/>
-                <w:color w:val="000000"/>
-              </w:rPr>
-            </w:pPr>
-            <w:r>
-              <w:rPr>
-                <w:rFonts w:eastAsia="Times New Roman"/>
-                <w:color w:val="000000"/>
-              </w:rPr>
-              <w:t>Unique</w:t>
-            </w:r>
-          </w:p>
-        </w:tc>
-        <w:tc>
-          <w:tcPr>
-            <w:tcW w:w="0" w:type="auto"/>
-            <w:tcMar>
-              <w:top w:w="100" w:type="dxa"/>
-              <w:left w:w="120" w:type="dxa"/>
-              <w:bottom w:w="100" w:type="dxa"/>
-              <w:right w:w="120" w:type="dxa"/>
-            </w:tcMar>
-            <w:hideMark/>
-          </w:tcPr>
-          <w:p>
-            <w:pPr>
-              <w:spacing w:after="480"/>
-              <w:rPr>
-                <w:rFonts w:eastAsia="Times New Roman"/>
-                <w:color w:val="000000"/>
-              </w:rPr>
-            </w:pPr>
-            <w:r>
-              <w:rPr>
-                <w:rFonts w:eastAsia="Times New Roman"/>
-                <w:color w:val="000000"/>
-              </w:rPr>
-              <w:t>Administrator’s email address used for system login</w:t>
-            </w:r>
-          </w:p>
-        </w:tc>
-      </w:tr>
-      <w:tr>
-        <w:trPr>
-          <w:divId w:val="631641576"/>
-          <w:cantSplit/>
-        </w:trPr>
-        <w:tc>
-          <w:tcPr>
-            <w:tcW w:w="0" w:type="auto"/>
-            <w:tcMar>
-              <w:top w:w="100" w:type="dxa"/>
-              <w:left w:w="120" w:type="dxa"/>
-              <w:bottom w:w="100" w:type="dxa"/>
-              <w:right w:w="120" w:type="dxa"/>
-            </w:tcMar>
-            <w:hideMark/>
-          </w:tcPr>
-          <w:p>
-            <w:pPr>
-              <w:spacing w:after="480"/>
-              <w:rPr>
-                <w:rFonts w:eastAsia="Times New Roman"/>
-                <w:color w:val="000000"/>
-              </w:rPr>
-            </w:pPr>
-            <w:r>
-              <w:rPr>
-                <w:rFonts w:eastAsia="Times New Roman"/>
-                <w:color w:val="000000"/>
-              </w:rPr>
-              <w:t>password_hash</w:t>
-            </w:r>
-          </w:p>
-        </w:tc>
-        <w:tc>
-          <w:tcPr>
-            <w:tcW w:w="0" w:type="auto"/>
-            <w:tcMar>
-              <w:top w:w="100" w:type="dxa"/>
-              <w:left w:w="120" w:type="dxa"/>
-              <w:bottom w:w="100" w:type="dxa"/>
-              <w:right w:w="120" w:type="dxa"/>
-            </w:tcMar>
-            <w:hideMark/>
-          </w:tcPr>
-          <w:p>
-            <w:pPr>
-              <w:spacing w:after="480"/>
-              <w:rPr>
-                <w:rFonts w:eastAsia="Times New Roman"/>
-                <w:color w:val="000000"/>
-              </w:rPr>
-            </w:pPr>
-            <w:r>
-              <w:rPr>
-                <w:rFonts w:eastAsia="Times New Roman"/>
-                <w:color w:val="000000"/>
-              </w:rPr>
-              <w:t>VARCHAR(255)</w:t>
-            </w:r>
-          </w:p>
-        </w:tc>
-        <w:tc>
-          <w:tcPr>
-            <w:tcW w:w="0" w:type="auto"/>
-            <w:tcMar>
-              <w:top w:w="100" w:type="dxa"/>
-              <w:left w:w="120" w:type="dxa"/>
-              <w:bottom w:w="100" w:type="dxa"/>
-              <w:right w:w="120" w:type="dxa"/>
-            </w:tcMar>
-            <w:hideMark/>
-          </w:tcPr>
-          <w:p>
-            <w:pPr>
-              <w:spacing w:after="480"/>
-              <w:jc w:val="center"/>
-              <w:rPr>
-                <w:rFonts w:eastAsia="Times New Roman"/>
-                <w:color w:val="000000"/>
-              </w:rPr>
-            </w:pPr>
-            <w:r>
-              <w:rPr>
-                <w:rFonts w:eastAsia="Times New Roman"/>
-                <w:color w:val="000000"/>
-              </w:rPr>
-              <w:t>Yes</w:t>
-            </w:r>
-          </w:p>
-        </w:tc>
-        <w:tc>
-          <w:tcPr>
-            <w:tcW w:w="0" w:type="auto"/>
-            <w:tcMar>
-              <w:top w:w="100" w:type="dxa"/>
-              <w:left w:w="120" w:type="dxa"/>
-              <w:bottom w:w="100" w:type="dxa"/>
-              <w:right w:w="120" w:type="dxa"/>
-            </w:tcMar>
-            <w:hideMark/>
-          </w:tcPr>
-          <w:p>
-            <w:pPr>
-              <w:spacing w:after="480"/>
-              <w:jc w:val="center"/>
-              <w:rPr>
-                <w:rFonts w:eastAsia="Times New Roman"/>
-                <w:color w:val="000000"/>
-              </w:rPr>
-            </w:pPr>
-            <w:r>
-              <w:rPr>
-                <w:rFonts w:eastAsia="Times New Roman"/>
-                <w:color w:val="000000"/>
-              </w:rPr>
-              <w:t>—</w:t>
-            </w:r>
-          </w:p>
-        </w:tc>
-        <w:tc>
-          <w:tcPr>
-            <w:tcW w:w="0" w:type="auto"/>
-            <w:tcMar>
-              <w:top w:w="100" w:type="dxa"/>
-              <w:left w:w="120" w:type="dxa"/>
-              <w:bottom w:w="100" w:type="dxa"/>
-              <w:right w:w="120" w:type="dxa"/>
-            </w:tcMar>
-            <w:hideMark/>
-          </w:tcPr>
-          <w:p>
-            <w:pPr>
-              <w:spacing w:after="480"/>
-              <w:rPr>
-                <w:rFonts w:eastAsia="Times New Roman"/>
-                <w:color w:val="000000"/>
-              </w:rPr>
-            </w:pPr>
-            <w:r>
-              <w:rPr>
-                <w:rFonts w:eastAsia="Times New Roman"/>
-                <w:color w:val="000000"/>
-              </w:rPr>
-              <w:t>Securely hashed administrator password</w:t>
-            </w:r>
-          </w:p>
-        </w:tc>
-      </w:tr>
-      <w:tr>
-        <w:trPr>
-          <w:divId w:val="631641576"/>
-          <w:cantSplit/>
-        </w:trPr>
-        <w:tc>
-          <w:tcPr>
-            <w:tcW w:w="0" w:type="auto"/>
-            <w:tcMar>
-              <w:top w:w="100" w:type="dxa"/>
-              <w:left w:w="120" w:type="dxa"/>
-              <w:bottom w:w="100" w:type="dxa"/>
-              <w:right w:w="120" w:type="dxa"/>
-            </w:tcMar>
-            <w:hideMark/>
-          </w:tcPr>
-          <w:p>
-            <w:pPr>
-              <w:spacing w:after="480"/>
-              <w:rPr>
-                <w:rFonts w:eastAsia="Times New Roman"/>
-                <w:color w:val="000000"/>
-              </w:rPr>
-            </w:pPr>
-            <w:r>
-              <w:rPr>
-                <w:rFonts w:eastAsia="Times New Roman"/>
-                <w:color w:val="000000"/>
-              </w:rPr>
-              <w:t>reset_token_hash</w:t>
-            </w:r>
-          </w:p>
-        </w:tc>
-        <w:tc>
-          <w:tcPr>
-            <w:tcW w:w="0" w:type="auto"/>
-            <w:tcMar>
-              <w:top w:w="100" w:type="dxa"/>
-              <w:left w:w="120" w:type="dxa"/>
-              <w:bottom w:w="100" w:type="dxa"/>
-              <w:right w:w="120" w:type="dxa"/>
-            </w:tcMar>
-            <w:hideMark/>
-          </w:tcPr>
-          <w:p>
-            <w:pPr>
-              <w:spacing w:after="480"/>
-              <w:rPr>
-                <w:rFonts w:eastAsia="Times New Roman"/>
-                <w:color w:val="000000"/>
-              </w:rPr>
-            </w:pPr>
-            <w:r>
-              <w:rPr>
-                <w:rFonts w:eastAsia="Times New Roman"/>
-                <w:color w:val="000000"/>
-              </w:rPr>
-              <w:t>VARCHAR(255)</w:t>
-            </w:r>
-          </w:p>
-        </w:tc>
-        <w:tc>
-          <w:tcPr>
-            <w:tcW w:w="0" w:type="auto"/>
-            <w:tcMar>
-              <w:top w:w="100" w:type="dxa"/>
-              <w:left w:w="120" w:type="dxa"/>
-              <w:bottom w:w="100" w:type="dxa"/>
-              <w:right w:w="120" w:type="dxa"/>
-            </w:tcMar>
-            <w:hideMark/>
-          </w:tcPr>
-          <w:p>
-            <w:pPr>
-              <w:spacing w:after="480"/>
-              <w:jc w:val="center"/>
-              <w:rPr>
-                <w:rFonts w:eastAsia="Times New Roman"/>
-                <w:color w:val="000000"/>
-              </w:rPr>
-            </w:pPr>
-            <w:r>
-              <w:rPr>
-                <w:rFonts w:eastAsia="Times New Roman"/>
-                <w:color w:val="000000"/>
-              </w:rPr>
-              <w:t>No</w:t>
-            </w:r>
-          </w:p>
-        </w:tc>
-        <w:tc>
-          <w:tcPr>
-            <w:tcW w:w="0" w:type="auto"/>
-            <w:tcMar>
-              <w:top w:w="100" w:type="dxa"/>
-              <w:left w:w="120" w:type="dxa"/>
-              <w:bottom w:w="100" w:type="dxa"/>
-              <w:right w:w="120" w:type="dxa"/>
-            </w:tcMar>
-            <w:hideMark/>
-          </w:tcPr>
-          <w:p>
-            <w:pPr>
-              <w:spacing w:after="480"/>
-              <w:jc w:val="center"/>
-              <w:rPr>
-                <w:rFonts w:eastAsia="Times New Roman"/>
-                <w:color w:val="000000"/>
-              </w:rPr>
-            </w:pPr>
-            <w:r>
-              <w:rPr>
-                <w:rFonts w:eastAsia="Times New Roman"/>
-                <w:color w:val="000000"/>
-              </w:rPr>
-              <w:t>—</w:t>
-            </w:r>
-          </w:p>
-        </w:tc>
-        <w:tc>
-          <w:tcPr>
-            <w:tcW w:w="0" w:type="auto"/>
-            <w:tcMar>
-              <w:top w:w="100" w:type="dxa"/>
-              <w:left w:w="120" w:type="dxa"/>
-              <w:bottom w:w="100" w:type="dxa"/>
-              <w:right w:w="120" w:type="dxa"/>
-            </w:tcMar>
-            <w:hideMark/>
-          </w:tcPr>
-          <w:p>
-            <w:pPr>
-              <w:spacing w:after="480"/>
-              <w:rPr>
-                <w:rFonts w:eastAsia="Times New Roman"/>
-                <w:color w:val="000000"/>
-              </w:rPr>
-            </w:pPr>
-            <w:r>
-              <w:rPr>
-                <w:rFonts w:eastAsia="Times New Roman"/>
-                <w:color w:val="000000"/>
-              </w:rPr>
-              <w:t>Hashed password-reset token</w:t>
-            </w:r>
-          </w:p>
-        </w:tc>
-      </w:tr>
-      <w:tr>
-        <w:trPr>
-          <w:divId w:val="631641576"/>
-          <w:cantSplit/>
-        </w:trPr>
-        <w:tc>
-          <w:tcPr>
-            <w:tcW w:w="0" w:type="auto"/>
-            <w:tcMar>
-              <w:top w:w="100" w:type="dxa"/>
-              <w:left w:w="120" w:type="dxa"/>
-              <w:bottom w:w="100" w:type="dxa"/>
-              <w:right w:w="120" w:type="dxa"/>
-            </w:tcMar>
-            <w:hideMark/>
-          </w:tcPr>
-          <w:p>
-            <w:pPr>
-              <w:spacing w:after="480"/>
-              <w:rPr>
-                <w:rFonts w:eastAsia="Times New Roman"/>
-                <w:color w:val="000000"/>
-              </w:rPr>
-            </w:pPr>
-            <w:r>
-              <w:rPr>
-                <w:rFonts w:eastAsia="Times New Roman"/>
-                <w:color w:val="000000"/>
-              </w:rPr>
-              <w:t>reset_expires_at</w:t>
-            </w:r>
-          </w:p>
-        </w:tc>
-        <w:tc>
-          <w:tcPr>
-            <w:tcW w:w="0" w:type="auto"/>
-            <w:tcMar>
-              <w:top w:w="100" w:type="dxa"/>
-              <w:left w:w="120" w:type="dxa"/>
-              <w:bottom w:w="100" w:type="dxa"/>
-              <w:right w:w="120" w:type="dxa"/>
-            </w:tcMar>
-            <w:hideMark/>
-          </w:tcPr>
-          <w:p>
-            <w:pPr>
-              <w:spacing w:after="480"/>
-              <w:rPr>
-                <w:rFonts w:eastAsia="Times New Roman"/>
-                <w:color w:val="000000"/>
-              </w:rPr>
-            </w:pPr>
-            <w:r>
-              <w:rPr>
-                <w:rFonts w:eastAsia="Times New Roman"/>
-                <w:color w:val="000000"/>
-              </w:rPr>
-              <w:t>DATETIME</w:t>
-            </w:r>
-          </w:p>
-        </w:tc>
-        <w:tc>
-          <w:tcPr>
-            <w:tcW w:w="0" w:type="auto"/>
-            <w:tcMar>
-              <w:top w:w="100" w:type="dxa"/>
-              <w:left w:w="120" w:type="dxa"/>
-              <w:bottom w:w="100" w:type="dxa"/>
-              <w:right w:w="120" w:type="dxa"/>
-            </w:tcMar>
-            <w:hideMark/>
-          </w:tcPr>
-          <w:p>
-            <w:pPr>
-              <w:spacing w:after="480"/>
-              <w:jc w:val="center"/>
-              <w:rPr>
-                <w:rFonts w:eastAsia="Times New Roman"/>
-                <w:color w:val="000000"/>
-              </w:rPr>
-            </w:pPr>
-            <w:r>
-              <w:rPr>
-                <w:rFonts w:eastAsia="Times New Roman"/>
-                <w:color w:val="000000"/>
-              </w:rPr>
-              <w:t>No</w:t>
-            </w:r>
-          </w:p>
-        </w:tc>
-        <w:tc>
-          <w:tcPr>
-            <w:tcW w:w="0" w:type="auto"/>
-            <w:tcMar>
-              <w:top w:w="100" w:type="dxa"/>
-              <w:left w:w="120" w:type="dxa"/>
-              <w:bottom w:w="100" w:type="dxa"/>
-              <w:right w:w="120" w:type="dxa"/>
-            </w:tcMar>
-            <w:hideMark/>
-          </w:tcPr>
-          <w:p>
-            <w:pPr>
-              <w:spacing w:after="480"/>
-              <w:jc w:val="center"/>
-              <w:rPr>
-                <w:rFonts w:eastAsia="Times New Roman"/>
-                <w:color w:val="000000"/>
-              </w:rPr>
-            </w:pPr>
-            <w:r>
-              <w:rPr>
-                <w:rFonts w:eastAsia="Times New Roman"/>
-                <w:color w:val="000000"/>
-              </w:rPr>
-              <w:t>—</w:t>
-            </w:r>
-          </w:p>
-        </w:tc>
-        <w:tc>
-          <w:tcPr>
-            <w:tcW w:w="0" w:type="auto"/>
-            <w:tcMar>
-              <w:top w:w="100" w:type="dxa"/>
-              <w:left w:w="120" w:type="dxa"/>
-              <w:bottom w:w="100" w:type="dxa"/>
-              <w:right w:w="120" w:type="dxa"/>
-            </w:tcMar>
-            <w:hideMark/>
-          </w:tcPr>
-          <w:p>
-            <w:pPr>
-              <w:spacing w:after="480"/>
-              <w:rPr>
-                <w:rFonts w:eastAsia="Times New Roman"/>
-                <w:color w:val="000000"/>
-              </w:rPr>
-            </w:pPr>
-            <w:r>
-              <w:rPr>
-                <w:rFonts w:eastAsia="Times New Roman"/>
-                <w:color w:val="000000"/>
-              </w:rPr>
-              <w:t>Expiration date and time of the reset token</w:t>
-            </w:r>
-          </w:p>
-        </w:tc>
-      </w:tr>
-      <w:tr>
-        <w:trPr>
-          <w:divId w:val="631641576"/>
-          <w:cantSplit/>
-        </w:trPr>
-        <w:tc>
-          <w:tcPr>
-            <w:tcW w:w="0" w:type="auto"/>
-            <w:tcMar>
-              <w:top w:w="100" w:type="dxa"/>
-              <w:left w:w="120" w:type="dxa"/>
-              <w:bottom w:w="100" w:type="dxa"/>
-              <w:right w:w="120" w:type="dxa"/>
-            </w:tcMar>
-            <w:hideMark/>
-          </w:tcPr>
-          <w:p>
-            <w:pPr>
-              <w:spacing w:after="480"/>
-              <w:rPr>
-                <w:rFonts w:eastAsia="Times New Roman"/>
-                <w:color w:val="000000"/>
-              </w:rPr>
-            </w:pPr>
-            <w:r>
-              <w:rPr>
-                <w:rFonts w:eastAsia="Times New Roman"/>
-                <w:color w:val="000000"/>
-              </w:rPr>
-              <w:t>created_at</w:t>
-            </w:r>
-          </w:p>
-        </w:tc>
-        <w:tc>
-          <w:tcPr>
-            <w:tcW w:w="0" w:type="auto"/>
-            <w:tcMar>
-              <w:top w:w="100" w:type="dxa"/>
-              <w:left w:w="120" w:type="dxa"/>
-              <w:bottom w:w="100" w:type="dxa"/>
-              <w:right w:w="120" w:type="dxa"/>
-            </w:tcMar>
-            <w:hideMark/>
-          </w:tcPr>
-          <w:p>
-            <w:pPr>
-              <w:spacing w:after="480"/>
-              <w:rPr>
-                <w:rFonts w:eastAsia="Times New Roman"/>
-                <w:color w:val="000000"/>
-              </w:rPr>
-            </w:pPr>
-            <w:r>
-              <w:rPr>
-                <w:rFonts w:eastAsia="Times New Roman"/>
-                <w:color w:val="000000"/>
-              </w:rPr>
-              <w:t>DATETIME</w:t>
-            </w:r>
-          </w:p>
-        </w:tc>
-        <w:tc>
-          <w:tcPr>
-            <w:tcW w:w="0" w:type="auto"/>
-            <w:tcMar>
-              <w:top w:w="100" w:type="dxa"/>
-              <w:left w:w="120" w:type="dxa"/>
-              <w:bottom w:w="100" w:type="dxa"/>
-              <w:right w:w="120" w:type="dxa"/>
-            </w:tcMar>
-            <w:hideMark/>
-          </w:tcPr>
-          <w:p>
-            <w:pPr>
-              <w:spacing w:after="480"/>
-              <w:jc w:val="center"/>
-              <w:rPr>
-                <w:rFonts w:eastAsia="Times New Roman"/>
-                <w:color w:val="000000"/>
-              </w:rPr>
-            </w:pPr>
-            <w:r>
-              <w:rPr>
-                <w:rFonts w:eastAsia="Times New Roman"/>
-                <w:color w:val="000000"/>
-              </w:rPr>
-              <w:t>Yes</w:t>
-            </w:r>
-          </w:p>
-        </w:tc>
-        <w:tc>
-          <w:tcPr>
-            <w:tcW w:w="0" w:type="auto"/>
-            <w:tcMar>
-              <w:top w:w="100" w:type="dxa"/>
-              <w:left w:w="120" w:type="dxa"/>
-              <w:bottom w:w="100" w:type="dxa"/>
-              <w:right w:w="120" w:type="dxa"/>
-            </w:tcMar>
-            <w:hideMark/>
-          </w:tcPr>
-          <w:p>
-            <w:pPr>
-              <w:spacing w:after="480"/>
-              <w:jc w:val="center"/>
-              <w:rPr>
-                <w:rFonts w:eastAsia="Times New Roman"/>
-                <w:color w:val="000000"/>
-              </w:rPr>
-            </w:pPr>
-            <w:r>
-              <w:rPr>
-                <w:rFonts w:eastAsia="Times New Roman"/>
-                <w:color w:val="000000"/>
-              </w:rPr>
-              <w:t>—</w:t>
-            </w:r>
-          </w:p>
-        </w:tc>
-        <w:tc>
-          <w:tcPr>
-            <w:tcW w:w="0" w:type="auto"/>
-            <w:tcMar>
-              <w:top w:w="100" w:type="dxa"/>
-              <w:left w:w="120" w:type="dxa"/>
-              <w:bottom w:w="100" w:type="dxa"/>
-              <w:right w:w="120" w:type="dxa"/>
-            </w:tcMar>
-            <w:hideMark/>
-          </w:tcPr>
-          <w:p>
-            <w:pPr>
-              <w:spacing w:after="480"/>
-              <w:rPr>
-                <w:rFonts w:eastAsia="Times New Roman"/>
-                <w:color w:val="000000"/>
-              </w:rPr>
-            </w:pPr>
-            <w:r>
-              <w:rPr>
-                <w:rFonts w:eastAsia="Times New Roman"/>
-                <w:color w:val="000000"/>
-              </w:rPr>
-              <w:t>Date and time the account was created</w:t>
-            </w:r>
-          </w:p>
-        </w:tc>
-      </w:tr>
-      <w:tr>
-        <w:trPr>
-          <w:divId w:val="631641576"/>
-          <w:cantSplit/>
-        </w:trPr>
-        <w:tc>
-          <w:tcPr>
-            <w:tcW w:w="0" w:type="auto"/>
-            <w:tcMar>
-              <w:top w:w="100" w:type="dxa"/>
-              <w:left w:w="120" w:type="dxa"/>
-              <w:bottom w:w="100" w:type="dxa"/>
-              <w:right w:w="120" w:type="dxa"/>
-            </w:tcMar>
-            <w:hideMark/>
-          </w:tcPr>
-          <w:p>
-            <w:pPr>
-              <w:spacing w:after="480"/>
-              <w:rPr>
-                <w:rFonts w:eastAsia="Times New Roman"/>
-                <w:color w:val="000000"/>
-              </w:rPr>
-            </w:pPr>
-            <w:r>
-              <w:rPr>
-                <w:rFonts w:eastAsia="Times New Roman"/>
-                <w:color w:val="000000"/>
-              </w:rPr>
-              <w:lastRenderedPageBreak/>
-              <w:t>updated_at</w:t>
-            </w:r>
-          </w:p>
-        </w:tc>
-        <w:tc>
-          <w:tcPr>
-            <w:tcW w:w="0" w:type="auto"/>
-            <w:tcMar>
-              <w:top w:w="100" w:type="dxa"/>
-              <w:left w:w="120" w:type="dxa"/>
-              <w:bottom w:w="100" w:type="dxa"/>
-              <w:right w:w="120" w:type="dxa"/>
-            </w:tcMar>
-            <w:hideMark/>
-          </w:tcPr>
-          <w:p>
-            <w:pPr>
-              <w:spacing w:after="480"/>
-              <w:rPr>
-                <w:rFonts w:eastAsia="Times New Roman"/>
-                <w:color w:val="000000"/>
-              </w:rPr>
-            </w:pPr>
-            <w:r>
-              <w:rPr>
-                <w:rFonts w:eastAsia="Times New Roman"/>
-                <w:color w:val="000000"/>
-              </w:rPr>
-              <w:t>DATETIME</w:t>
-            </w:r>
-          </w:p>
-        </w:tc>
-        <w:tc>
-          <w:tcPr>
-            <w:tcW w:w="0" w:type="auto"/>
-            <w:tcMar>
-              <w:top w:w="100" w:type="dxa"/>
-              <w:left w:w="120" w:type="dxa"/>
-              <w:bottom w:w="100" w:type="dxa"/>
-              <w:right w:w="120" w:type="dxa"/>
-            </w:tcMar>
-            <w:hideMark/>
-          </w:tcPr>
-          <w:p>
-            <w:pPr>
-              <w:spacing w:after="480"/>
-              <w:jc w:val="center"/>
-              <w:rPr>
-                <w:rFonts w:eastAsia="Times New Roman"/>
-                <w:color w:val="000000"/>
-              </w:rPr>
-            </w:pPr>
-            <w:r>
-              <w:rPr>
-                <w:rFonts w:eastAsia="Times New Roman"/>
-                <w:color w:val="000000"/>
-              </w:rPr>
-              <w:t>Yes</w:t>
-            </w:r>
-          </w:p>
-        </w:tc>
-        <w:tc>
-          <w:tcPr>
-            <w:tcW w:w="0" w:type="auto"/>
-            <w:tcMar>
-              <w:top w:w="100" w:type="dxa"/>
-              <w:left w:w="120" w:type="dxa"/>
-              <w:bottom w:w="100" w:type="dxa"/>
-              <w:right w:w="120" w:type="dxa"/>
-            </w:tcMar>
-            <w:hideMark/>
-          </w:tcPr>
-          <w:p>
-            <w:pPr>
-              <w:spacing w:after="480"/>
-              <w:jc w:val="center"/>
-              <w:rPr>
-                <w:rFonts w:eastAsia="Times New Roman"/>
-                <w:color w:val="000000"/>
-              </w:rPr>
-            </w:pPr>
-            <w:r>
-              <w:rPr>
-                <w:rFonts w:eastAsia="Times New Roman"/>
-                <w:color w:val="000000"/>
-              </w:rPr>
-              <w:t>—</w:t>
-            </w:r>
-          </w:p>
-        </w:tc>
-        <w:tc>
-          <w:tcPr>
-            <w:tcW w:w="0" w:type="auto"/>
-            <w:tcMar>
-              <w:top w:w="100" w:type="dxa"/>
-              <w:left w:w="120" w:type="dxa"/>
-              <w:bottom w:w="100" w:type="dxa"/>
-              <w:right w:w="120" w:type="dxa"/>
-            </w:tcMar>
-            <w:hideMark/>
-          </w:tcPr>
-          <w:p>
-            <w:pPr>
-              <w:spacing w:after="480"/>
-              <w:rPr>
-                <w:rFonts w:eastAsia="Times New Roman"/>
-                <w:color w:val="000000"/>
-              </w:rPr>
-            </w:pPr>
-            <w:r>
-              <w:rPr>
-                <w:rFonts w:eastAsia="Times New Roman"/>
-                <w:color w:val="000000"/>
-              </w:rPr>
-              <w:t>Date and time the account was last updated</w:t>
-            </w:r>
-          </w:p>
-        </w:tc>
-      </w:tr>
-    </w:tbl>
     <w:p>
       <w:pPr>
         <w:keepNext/>
@@ -1295,6 +1305,7 @@
     <w:tbl>
       <w:tblPr>
         <w:tblW w:w="5000" w:type="pct"/>
+        <w:jc w:val="center"/>
         <w:tblBorders>
           <w:top w:val="single" w:sz="4" w:space="0" w:color="000000"/>
           <w:left w:val="single" w:sz="4" w:space="0" w:color="000000"/>
@@ -1314,19 +1325,20 @@
       <w:tblGrid>
         <w:gridCol w:w="1933"/>
         <w:gridCol w:w="1934"/>
-        <w:gridCol w:w="1200"/>
+        <w:gridCol w:w="1201"/>
         <w:gridCol w:w="1346"/>
-        <w:gridCol w:w="2937"/>
+        <w:gridCol w:w="2936"/>
       </w:tblGrid>
       <w:tr>
         <w:trPr>
           <w:divId w:val="631641576"/>
           <w:cantSplit/>
           <w:tblHeader/>
+          <w:jc w:val="center"/>
         </w:trPr>
         <w:tc>
           <w:tcPr>
-            <w:tcW w:w="1000" w:type="pct"/>
+            <w:tcW w:w="1034" w:type="pct"/>
             <w:shd w:val="clear" w:color="auto" w:fill="FFFFFF"/>
             <w:tcMar>
               <w:top w:w="100" w:type="dxa"/>
@@ -1360,7 +1372,7 @@
         </w:tc>
         <w:tc>
           <w:tcPr>
-            <w:tcW w:w="750" w:type="pct"/>
+            <w:tcW w:w="1034" w:type="pct"/>
             <w:shd w:val="clear" w:color="auto" w:fill="FFFFFF"/>
             <w:tcMar>
               <w:top w:w="100" w:type="dxa"/>
@@ -1394,7 +1406,7 @@
         </w:tc>
         <w:tc>
           <w:tcPr>
-            <w:tcW w:w="600" w:type="pct"/>
+            <w:tcW w:w="642" w:type="pct"/>
             <w:shd w:val="clear" w:color="auto" w:fill="FFFFFF"/>
             <w:tcMar>
               <w:top w:w="100" w:type="dxa"/>
@@ -1428,7 +1440,7 @@
         </w:tc>
         <w:tc>
           <w:tcPr>
-            <w:tcW w:w="900" w:type="pct"/>
+            <w:tcW w:w="720" w:type="pct"/>
             <w:shd w:val="clear" w:color="auto" w:fill="FFFFFF"/>
             <w:tcMar>
               <w:top w:w="100" w:type="dxa"/>
@@ -1462,7 +1474,7 @@
         </w:tc>
         <w:tc>
           <w:tcPr>
-            <w:tcW w:w="1750" w:type="pct"/>
+            <w:tcW w:w="1571" w:type="pct"/>
             <w:shd w:val="clear" w:color="auto" w:fill="FFFFFF"/>
             <w:tcMar>
               <w:top w:w="100" w:type="dxa"/>
@@ -1499,6 +1511,7 @@
         <w:trPr>
           <w:divId w:val="631641576"/>
           <w:cantSplit/>
+          <w:jc w:val="center"/>
         </w:trPr>
         <w:tc>
           <w:tcPr>
@@ -1647,6 +1660,7 @@
         <w:trPr>
           <w:divId w:val="631641576"/>
           <w:cantSplit/>
+          <w:jc w:val="center"/>
         </w:trPr>
         <w:tc>
           <w:tcPr>
@@ -1795,6 +1809,7 @@
         <w:trPr>
           <w:divId w:val="631641576"/>
           <w:cantSplit/>
+          <w:jc w:val="center"/>
         </w:trPr>
         <w:tc>
           <w:tcPr>
@@ -1943,6 +1958,7 @@
         <w:trPr>
           <w:divId w:val="631641576"/>
           <w:cantSplit/>
+          <w:jc w:val="center"/>
         </w:trPr>
         <w:tc>
           <w:tcPr>
@@ -2091,6 +2107,7 @@
         <w:trPr>
           <w:divId w:val="631641576"/>
           <w:cantSplit/>
+          <w:jc w:val="center"/>
         </w:trPr>
         <w:tc>
           <w:tcPr>
@@ -2239,6 +2256,7 @@
         <w:trPr>
           <w:divId w:val="631641576"/>
           <w:cantSplit/>
+          <w:jc w:val="center"/>
         </w:trPr>
         <w:tc>
           <w:tcPr>
@@ -2264,7 +2282,6 @@
                 <w:rFonts w:eastAsia="Times New Roman"/>
                 <w:color w:val="000000"/>
               </w:rPr>
-              <w:lastRenderedPageBreak/>
               <w:t>address</w:t>
             </w:r>
           </w:p>
@@ -2388,6 +2405,7 @@
         <w:trPr>
           <w:divId w:val="631641576"/>
           <w:cantSplit/>
+          <w:jc w:val="center"/>
         </w:trPr>
         <w:tc>
           <w:tcPr>
@@ -2536,6 +2554,7 @@
         <w:trPr>
           <w:divId w:val="631641576"/>
           <w:cantSplit/>
+          <w:jc w:val="center"/>
         </w:trPr>
         <w:tc>
           <w:tcPr>
@@ -2561,6 +2580,7 @@
                 <w:rFonts w:eastAsia="Times New Roman"/>
                 <w:color w:val="000000"/>
               </w:rPr>
+              <w:lastRenderedPageBreak/>
               <w:t>created_at</w:t>
             </w:r>
           </w:p>
@@ -2684,6 +2704,7 @@
         <w:trPr>
           <w:divId w:val="631641576"/>
           <w:cantSplit/>
+          <w:jc w:val="center"/>
         </w:trPr>
         <w:tc>
           <w:tcPr>
@@ -2856,6 +2877,7 @@
     <w:tbl>
       <w:tblPr>
         <w:tblW w:w="5000" w:type="pct"/>
+        <w:jc w:val="center"/>
         <w:tblBorders>
           <w:top w:val="single" w:sz="4" w:space="0" w:color="000000"/>
           <w:left w:val="single" w:sz="4" w:space="0" w:color="000000"/>
@@ -2875,8 +2897,8 @@
       <w:tblGrid>
         <w:gridCol w:w="1822"/>
         <w:gridCol w:w="1467"/>
-        <w:gridCol w:w="1200"/>
-        <w:gridCol w:w="1635"/>
+        <w:gridCol w:w="1201"/>
+        <w:gridCol w:w="1634"/>
         <w:gridCol w:w="3226"/>
       </w:tblGrid>
       <w:tr>
@@ -2884,10 +2906,11 @@
           <w:divId w:val="631641576"/>
           <w:cantSplit/>
           <w:tblHeader/>
+          <w:jc w:val="center"/>
         </w:trPr>
         <w:tc>
           <w:tcPr>
-            <w:tcW w:w="1000" w:type="pct"/>
+            <w:tcW w:w="974" w:type="pct"/>
             <w:shd w:val="clear" w:color="auto" w:fill="FFFFFF"/>
             <w:tcMar>
               <w:top w:w="100" w:type="dxa"/>
@@ -2921,7 +2944,7 @@
         </w:tc>
         <w:tc>
           <w:tcPr>
-            <w:tcW w:w="750" w:type="pct"/>
+            <w:tcW w:w="784" w:type="pct"/>
             <w:shd w:val="clear" w:color="auto" w:fill="FFFFFF"/>
             <w:tcMar>
               <w:top w:w="100" w:type="dxa"/>
@@ -2955,7 +2978,7 @@
         </w:tc>
         <w:tc>
           <w:tcPr>
-            <w:tcW w:w="600" w:type="pct"/>
+            <w:tcW w:w="642" w:type="pct"/>
             <w:shd w:val="clear" w:color="auto" w:fill="FFFFFF"/>
             <w:tcMar>
               <w:top w:w="100" w:type="dxa"/>
@@ -2989,7 +3012,7 @@
         </w:tc>
         <w:tc>
           <w:tcPr>
-            <w:tcW w:w="900" w:type="pct"/>
+            <w:tcW w:w="874" w:type="pct"/>
             <w:shd w:val="clear" w:color="auto" w:fill="FFFFFF"/>
             <w:tcMar>
               <w:top w:w="100" w:type="dxa"/>
@@ -3023,7 +3046,7 @@
         </w:tc>
         <w:tc>
           <w:tcPr>
-            <w:tcW w:w="1750" w:type="pct"/>
+            <w:tcW w:w="1725" w:type="pct"/>
             <w:shd w:val="clear" w:color="auto" w:fill="FFFFFF"/>
             <w:tcMar>
               <w:top w:w="100" w:type="dxa"/>
@@ -3060,6 +3083,7 @@
         <w:trPr>
           <w:divId w:val="631641576"/>
           <w:cantSplit/>
+          <w:jc w:val="center"/>
         </w:trPr>
         <w:tc>
           <w:tcPr>
@@ -3208,6 +3232,7 @@
         <w:trPr>
           <w:divId w:val="631641576"/>
           <w:cantSplit/>
+          <w:jc w:val="center"/>
         </w:trPr>
         <w:tc>
           <w:tcPr>
@@ -3374,12 +3399,14 @@
           <w:color w:val="000000"/>
           <w:lang w:val="en"/>
         </w:rPr>
+        <w:lastRenderedPageBreak/>
         <w:t>Table 4. Cart_Items</w:t>
       </w:r>
     </w:p>
     <w:tbl>
       <w:tblPr>
         <w:tblW w:w="5000" w:type="pct"/>
+        <w:jc w:val="center"/>
         <w:tblBorders>
           <w:top w:val="single" w:sz="4" w:space="0" w:color="000000"/>
           <w:left w:val="single" w:sz="4" w:space="0" w:color="000000"/>
@@ -3397,10 +3424,10 @@
         <w:tblLook w:val="04A0" w:firstRow="1" w:lastRow="0" w:firstColumn="1" w:lastColumn="0" w:noHBand="0" w:noVBand="1"/>
       </w:tblPr>
       <w:tblGrid>
-        <w:gridCol w:w="1850"/>
-        <w:gridCol w:w="1383"/>
-        <w:gridCol w:w="1200"/>
-        <w:gridCol w:w="1663"/>
+        <w:gridCol w:w="1849"/>
+        <w:gridCol w:w="1384"/>
+        <w:gridCol w:w="1201"/>
+        <w:gridCol w:w="1662"/>
         <w:gridCol w:w="3254"/>
       </w:tblGrid>
       <w:tr>
@@ -3408,10 +3435,11 @@
           <w:divId w:val="631641576"/>
           <w:cantSplit/>
           <w:tblHeader/>
+          <w:jc w:val="center"/>
         </w:trPr>
         <w:tc>
           <w:tcPr>
-            <w:tcW w:w="1000" w:type="pct"/>
+            <w:tcW w:w="989" w:type="pct"/>
             <w:shd w:val="clear" w:color="auto" w:fill="FFFFFF"/>
             <w:tcMar>
               <w:top w:w="100" w:type="dxa"/>
@@ -3445,7 +3473,7 @@
         </w:tc>
         <w:tc>
           <w:tcPr>
-            <w:tcW w:w="750" w:type="pct"/>
+            <w:tcW w:w="740" w:type="pct"/>
             <w:shd w:val="clear" w:color="auto" w:fill="FFFFFF"/>
             <w:tcMar>
               <w:top w:w="100" w:type="dxa"/>
@@ -3479,7 +3507,7 @@
         </w:tc>
         <w:tc>
           <w:tcPr>
-            <w:tcW w:w="600" w:type="pct"/>
+            <w:tcW w:w="642" w:type="pct"/>
             <w:shd w:val="clear" w:color="auto" w:fill="FFFFFF"/>
             <w:tcMar>
               <w:top w:w="100" w:type="dxa"/>
@@ -3513,7 +3541,7 @@
         </w:tc>
         <w:tc>
           <w:tcPr>
-            <w:tcW w:w="900" w:type="pct"/>
+            <w:tcW w:w="889" w:type="pct"/>
             <w:shd w:val="clear" w:color="auto" w:fill="FFFFFF"/>
             <w:tcMar>
               <w:top w:w="100" w:type="dxa"/>
@@ -3547,7 +3575,7 @@
         </w:tc>
         <w:tc>
           <w:tcPr>
-            <w:tcW w:w="1750" w:type="pct"/>
+            <w:tcW w:w="1740" w:type="pct"/>
             <w:shd w:val="clear" w:color="auto" w:fill="FFFFFF"/>
             <w:tcMar>
               <w:top w:w="100" w:type="dxa"/>
@@ -3584,6 +3612,7 @@
         <w:trPr>
           <w:divId w:val="631641576"/>
           <w:cantSplit/>
+          <w:jc w:val="center"/>
         </w:trPr>
         <w:tc>
           <w:tcPr>
@@ -3732,6 +3761,7 @@
         <w:trPr>
           <w:divId w:val="631641576"/>
           <w:cantSplit/>
+          <w:jc w:val="center"/>
         </w:trPr>
         <w:tc>
           <w:tcPr>
@@ -3880,6 +3910,7 @@
         <w:trPr>
           <w:divId w:val="631641576"/>
           <w:cantSplit/>
+          <w:jc w:val="center"/>
         </w:trPr>
         <w:tc>
           <w:tcPr>
@@ -4052,6 +4083,7 @@
     <w:tbl>
       <w:tblPr>
         <w:tblW w:w="5000" w:type="pct"/>
+        <w:jc w:val="center"/>
         <w:tblBorders>
           <w:top w:val="single" w:sz="4" w:space="0" w:color="000000"/>
           <w:left w:val="single" w:sz="4" w:space="0" w:color="000000"/>
@@ -4080,10 +4112,11 @@
           <w:divId w:val="631641576"/>
           <w:cantSplit/>
           <w:tblHeader/>
+          <w:jc w:val="center"/>
         </w:trPr>
         <w:tc>
           <w:tcPr>
-            <w:tcW w:w="1000" w:type="pct"/>
+            <w:tcW w:w="1583" w:type="pct"/>
             <w:shd w:val="clear" w:color="auto" w:fill="FFFFFF"/>
             <w:tcMar>
               <w:top w:w="100" w:type="dxa"/>
@@ -4117,7 +4150,7 @@
         </w:tc>
         <w:tc>
           <w:tcPr>
-            <w:tcW w:w="750" w:type="pct"/>
+            <w:tcW w:w="1034" w:type="pct"/>
             <w:shd w:val="clear" w:color="auto" w:fill="FFFFFF"/>
             <w:tcMar>
               <w:top w:w="100" w:type="dxa"/>
@@ -4151,7 +4184,7 @@
         </w:tc>
         <w:tc>
           <w:tcPr>
-            <w:tcW w:w="600" w:type="pct"/>
+            <w:tcW w:w="642" w:type="pct"/>
             <w:shd w:val="clear" w:color="auto" w:fill="FFFFFF"/>
             <w:tcMar>
               <w:top w:w="100" w:type="dxa"/>
@@ -4185,7 +4218,7 @@
         </w:tc>
         <w:tc>
           <w:tcPr>
-            <w:tcW w:w="900" w:type="pct"/>
+            <w:tcW w:w="542" w:type="pct"/>
             <w:shd w:val="clear" w:color="auto" w:fill="FFFFFF"/>
             <w:tcMar>
               <w:top w:w="100" w:type="dxa"/>
@@ -4219,7 +4252,7 @@
         </w:tc>
         <w:tc>
           <w:tcPr>
-            <w:tcW w:w="1750" w:type="pct"/>
+            <w:tcW w:w="1199" w:type="pct"/>
             <w:shd w:val="clear" w:color="auto" w:fill="FFFFFF"/>
             <w:tcMar>
               <w:top w:w="100" w:type="dxa"/>
@@ -4256,6 +4289,7 @@
         <w:trPr>
           <w:divId w:val="631641576"/>
           <w:cantSplit/>
+          <w:jc w:val="center"/>
         </w:trPr>
         <w:tc>
           <w:tcPr>
@@ -4404,6 +4438,7 @@
         <w:trPr>
           <w:divId w:val="631641576"/>
           <w:cantSplit/>
+          <w:jc w:val="center"/>
         </w:trPr>
         <w:tc>
           <w:tcPr>
@@ -4429,6 +4464,7 @@
                 <w:rFonts w:eastAsia="Times New Roman"/>
                 <w:color w:val="000000"/>
               </w:rPr>
+              <w:lastRenderedPageBreak/>
               <w:t>name</w:t>
             </w:r>
           </w:p>
@@ -4552,6 +4588,7 @@
         <w:trPr>
           <w:divId w:val="631641576"/>
           <w:cantSplit/>
+          <w:jc w:val="center"/>
         </w:trPr>
         <w:tc>
           <w:tcPr>
@@ -4700,6 +4737,7 @@
         <w:trPr>
           <w:divId w:val="631641576"/>
           <w:cantSplit/>
+          <w:jc w:val="center"/>
         </w:trPr>
         <w:tc>
           <w:tcPr>
@@ -4848,6 +4886,7 @@
         <w:trPr>
           <w:divId w:val="631641576"/>
           <w:cantSplit/>
+          <w:jc w:val="center"/>
         </w:trPr>
         <w:tc>
           <w:tcPr>
@@ -4996,6 +5035,7 @@
         <w:trPr>
           <w:divId w:val="631641576"/>
           <w:cantSplit/>
+          <w:jc w:val="center"/>
         </w:trPr>
         <w:tc>
           <w:tcPr>
@@ -5144,6 +5184,7 @@
         <w:trPr>
           <w:divId w:val="631641576"/>
           <w:cantSplit/>
+          <w:jc w:val="center"/>
         </w:trPr>
         <w:tc>
           <w:tcPr>
@@ -5292,6 +5333,7 @@
         <w:trPr>
           <w:divId w:val="631641576"/>
           <w:cantSplit/>
+          <w:jc w:val="center"/>
         </w:trPr>
         <w:tc>
           <w:tcPr>
@@ -5440,6 +5482,7 @@
         <w:trPr>
           <w:divId w:val="631641576"/>
           <w:cantSplit/>
+          <w:jc w:val="center"/>
         </w:trPr>
         <w:tc>
           <w:tcPr>
@@ -5465,6 +5508,7 @@
                 <w:rFonts w:eastAsia="Times New Roman"/>
                 <w:color w:val="000000"/>
               </w:rPr>
+              <w:lastRenderedPageBreak/>
               <w:t>image_url</w:t>
             </w:r>
           </w:p>
@@ -5588,6 +5632,7 @@
         <w:trPr>
           <w:divId w:val="631641576"/>
           <w:cantSplit/>
+          <w:jc w:val="center"/>
         </w:trPr>
         <w:tc>
           <w:tcPr>
@@ -5736,6 +5781,7 @@
         <w:trPr>
           <w:divId w:val="631641576"/>
           <w:cantSplit/>
+          <w:jc w:val="center"/>
         </w:trPr>
         <w:tc>
           <w:tcPr>
@@ -5884,6 +5930,7 @@
         <w:trPr>
           <w:divId w:val="631641576"/>
           <w:cantSplit/>
+          <w:jc w:val="center"/>
         </w:trPr>
         <w:tc>
           <w:tcPr>
@@ -6056,6 +6103,7 @@
     <w:tbl>
       <w:tblPr>
         <w:tblW w:w="5000" w:type="pct"/>
+        <w:jc w:val="center"/>
         <w:tblBorders>
           <w:top w:val="single" w:sz="4" w:space="0" w:color="000000"/>
           <w:left w:val="single" w:sz="4" w:space="0" w:color="000000"/>
@@ -6084,10 +6132,11 @@
           <w:divId w:val="631641576"/>
           <w:cantSplit/>
           <w:tblHeader/>
+          <w:jc w:val="center"/>
         </w:trPr>
         <w:tc>
           <w:tcPr>
-            <w:tcW w:w="1000" w:type="pct"/>
+            <w:tcW w:w="1654" w:type="pct"/>
             <w:shd w:val="clear" w:color="auto" w:fill="FFFFFF"/>
             <w:tcMar>
               <w:top w:w="100" w:type="dxa"/>
@@ -6121,7 +6170,7 @@
         </w:tc>
         <w:tc>
           <w:tcPr>
-            <w:tcW w:w="750" w:type="pct"/>
+            <w:tcW w:w="1034" w:type="pct"/>
             <w:shd w:val="clear" w:color="auto" w:fill="FFFFFF"/>
             <w:tcMar>
               <w:top w:w="100" w:type="dxa"/>
@@ -6155,7 +6204,7 @@
         </w:tc>
         <w:tc>
           <w:tcPr>
-            <w:tcW w:w="600" w:type="pct"/>
+            <w:tcW w:w="642" w:type="pct"/>
             <w:shd w:val="clear" w:color="auto" w:fill="FFFFFF"/>
             <w:tcMar>
               <w:top w:w="100" w:type="dxa"/>
@@ -6189,7 +6238,7 @@
         </w:tc>
         <w:tc>
           <w:tcPr>
-            <w:tcW w:w="900" w:type="pct"/>
+            <w:tcW w:w="542" w:type="pct"/>
             <w:shd w:val="clear" w:color="auto" w:fill="FFFFFF"/>
             <w:tcMar>
               <w:top w:w="100" w:type="dxa"/>
@@ -6223,7 +6272,7 @@
         </w:tc>
         <w:tc>
           <w:tcPr>
-            <w:tcW w:w="1750" w:type="pct"/>
+            <w:tcW w:w="1128" w:type="pct"/>
             <w:shd w:val="clear" w:color="auto" w:fill="FFFFFF"/>
             <w:tcMar>
               <w:top w:w="100" w:type="dxa"/>
@@ -6260,6 +6309,7 @@
         <w:trPr>
           <w:divId w:val="631641576"/>
           <w:cantSplit/>
+          <w:jc w:val="center"/>
         </w:trPr>
         <w:tc>
           <w:tcPr>
@@ -6408,6 +6458,7 @@
         <w:trPr>
           <w:divId w:val="631641576"/>
           <w:cantSplit/>
+          <w:jc w:val="center"/>
         </w:trPr>
         <w:tc>
           <w:tcPr>
@@ -6433,6 +6484,7 @@
                 <w:rFonts w:eastAsia="Times New Roman"/>
                 <w:color w:val="000000"/>
               </w:rPr>
+              <w:lastRenderedPageBreak/>
               <w:t>order_code</w:t>
             </w:r>
           </w:p>
@@ -6556,6 +6608,7 @@
         <w:trPr>
           <w:divId w:val="631641576"/>
           <w:cantSplit/>
+          <w:jc w:val="center"/>
         </w:trPr>
         <w:tc>
           <w:tcPr>
@@ -6704,6 +6757,7 @@
         <w:trPr>
           <w:divId w:val="631641576"/>
           <w:cantSplit/>
+          <w:jc w:val="center"/>
         </w:trPr>
         <w:tc>
           <w:tcPr>
@@ -6852,6 +6906,7 @@
         <w:trPr>
           <w:divId w:val="631641576"/>
           <w:cantSplit/>
+          <w:jc w:val="center"/>
         </w:trPr>
         <w:tc>
           <w:tcPr>
@@ -7000,6 +7055,7 @@
         <w:trPr>
           <w:divId w:val="631641576"/>
           <w:cantSplit/>
+          <w:jc w:val="center"/>
         </w:trPr>
         <w:tc>
           <w:tcPr>
@@ -7148,6 +7204,7 @@
         <w:trPr>
           <w:divId w:val="631641576"/>
           <w:cantSplit/>
+          <w:jc w:val="center"/>
         </w:trPr>
         <w:tc>
           <w:tcPr>
@@ -7296,6 +7353,7 @@
         <w:trPr>
           <w:divId w:val="631641576"/>
           <w:cantSplit/>
+          <w:jc w:val="center"/>
         </w:trPr>
         <w:tc>
           <w:tcPr>
@@ -7444,6 +7502,7 @@
         <w:trPr>
           <w:divId w:val="631641576"/>
           <w:cantSplit/>
+          <w:jc w:val="center"/>
         </w:trPr>
         <w:tc>
           <w:tcPr>
@@ -7469,6 +7528,7 @@
                 <w:rFonts w:eastAsia="Times New Roman"/>
                 <w:color w:val="000000"/>
               </w:rPr>
+              <w:lastRenderedPageBreak/>
               <w:t>total_centavos</w:t>
             </w:r>
           </w:p>
@@ -7592,6 +7652,7 @@
         <w:trPr>
           <w:divId w:val="631641576"/>
           <w:cantSplit/>
+          <w:jc w:val="center"/>
         </w:trPr>
         <w:tc>
           <w:tcPr>
@@ -7740,6 +7801,7 @@
         <w:trPr>
           <w:divId w:val="631641576"/>
           <w:cantSplit/>
+          <w:jc w:val="center"/>
         </w:trPr>
         <w:tc>
           <w:tcPr>
@@ -7888,6 +7950,7 @@
         <w:trPr>
           <w:divId w:val="631641576"/>
           <w:cantSplit/>
+          <w:jc w:val="center"/>
         </w:trPr>
         <w:tc>
           <w:tcPr>
@@ -8036,6 +8099,7 @@
         <w:trPr>
           <w:divId w:val="631641576"/>
           <w:cantSplit/>
+          <w:jc w:val="center"/>
         </w:trPr>
         <w:tc>
           <w:tcPr>
@@ -8184,6 +8248,7 @@
         <w:trPr>
           <w:divId w:val="631641576"/>
           <w:cantSplit/>
+          <w:jc w:val="center"/>
         </w:trPr>
         <w:tc>
           <w:tcPr>
@@ -8332,6 +8397,7 @@
         <w:trPr>
           <w:divId w:val="631641576"/>
           <w:cantSplit/>
+          <w:jc w:val="center"/>
         </w:trPr>
         <w:tc>
           <w:tcPr>
@@ -8480,6 +8546,7 @@
         <w:trPr>
           <w:divId w:val="631641576"/>
           <w:cantSplit/>
+          <w:jc w:val="center"/>
         </w:trPr>
         <w:tc>
           <w:tcPr>
@@ -8505,6 +8572,7 @@
                 <w:rFonts w:eastAsia="Times New Roman"/>
                 <w:color w:val="000000"/>
               </w:rPr>
+              <w:lastRenderedPageBreak/>
               <w:t>resubmit_count</w:t>
             </w:r>
           </w:p>
@@ -8628,6 +8696,7 @@
         <w:trPr>
           <w:divId w:val="631641576"/>
           <w:cantSplit/>
+          <w:jc w:val="center"/>
         </w:trPr>
         <w:tc>
           <w:tcPr>
@@ -8776,6 +8845,7 @@
         <w:trPr>
           <w:divId w:val="631641576"/>
           <w:cantSplit/>
+          <w:jc w:val="center"/>
         </w:trPr>
         <w:tc>
           <w:tcPr>
@@ -8924,6 +8994,7 @@
         <w:trPr>
           <w:divId w:val="631641576"/>
           <w:cantSplit/>
+          <w:jc w:val="center"/>
         </w:trPr>
         <w:tc>
           <w:tcPr>
@@ -9096,6 +9167,7 @@
     <w:tbl>
       <w:tblPr>
         <w:tblW w:w="5000" w:type="pct"/>
+        <w:jc w:val="center"/>
         <w:tblBorders>
           <w:top w:val="single" w:sz="4" w:space="0" w:color="000000"/>
           <w:left w:val="single" w:sz="4" w:space="0" w:color="000000"/>
@@ -9116,18 +9188,19 @@
         <w:gridCol w:w="2173"/>
         <w:gridCol w:w="1934"/>
         <w:gridCol w:w="1200"/>
-        <w:gridCol w:w="1226"/>
-        <w:gridCol w:w="2817"/>
+        <w:gridCol w:w="1227"/>
+        <w:gridCol w:w="2816"/>
       </w:tblGrid>
       <w:tr>
         <w:trPr>
           <w:divId w:val="631641576"/>
           <w:cantSplit/>
           <w:tblHeader/>
+          <w:jc w:val="center"/>
         </w:trPr>
         <w:tc>
           <w:tcPr>
-            <w:tcW w:w="1000" w:type="pct"/>
+            <w:tcW w:w="1162" w:type="pct"/>
             <w:shd w:val="clear" w:color="auto" w:fill="FFFFFF"/>
             <w:tcMar>
               <w:top w:w="100" w:type="dxa"/>
@@ -9161,7 +9234,7 @@
         </w:tc>
         <w:tc>
           <w:tcPr>
-            <w:tcW w:w="750" w:type="pct"/>
+            <w:tcW w:w="1034" w:type="pct"/>
             <w:shd w:val="clear" w:color="auto" w:fill="FFFFFF"/>
             <w:tcMar>
               <w:top w:w="100" w:type="dxa"/>
@@ -9195,7 +9268,7 @@
         </w:tc>
         <w:tc>
           <w:tcPr>
-            <w:tcW w:w="600" w:type="pct"/>
+            <w:tcW w:w="642" w:type="pct"/>
             <w:shd w:val="clear" w:color="auto" w:fill="FFFFFF"/>
             <w:tcMar>
               <w:top w:w="100" w:type="dxa"/>
@@ -9229,7 +9302,7 @@
         </w:tc>
         <w:tc>
           <w:tcPr>
-            <w:tcW w:w="900" w:type="pct"/>
+            <w:tcW w:w="656" w:type="pct"/>
             <w:shd w:val="clear" w:color="auto" w:fill="FFFFFF"/>
             <w:tcMar>
               <w:top w:w="100" w:type="dxa"/>
@@ -9263,7 +9336,7 @@
         </w:tc>
         <w:tc>
           <w:tcPr>
-            <w:tcW w:w="1750" w:type="pct"/>
+            <w:tcW w:w="1506" w:type="pct"/>
             <w:shd w:val="clear" w:color="auto" w:fill="FFFFFF"/>
             <w:tcMar>
               <w:top w:w="100" w:type="dxa"/>
@@ -9300,6 +9373,7 @@
         <w:trPr>
           <w:divId w:val="631641576"/>
           <w:cantSplit/>
+          <w:jc w:val="center"/>
         </w:trPr>
         <w:tc>
           <w:tcPr>
@@ -9448,6 +9522,7 @@
         <w:trPr>
           <w:divId w:val="631641576"/>
           <w:cantSplit/>
+          <w:jc w:val="center"/>
         </w:trPr>
         <w:tc>
           <w:tcPr>
@@ -9473,6 +9548,7 @@
                 <w:rFonts w:eastAsia="Times New Roman"/>
                 <w:color w:val="000000"/>
               </w:rPr>
+              <w:lastRenderedPageBreak/>
               <w:t>order_id</w:t>
             </w:r>
           </w:p>
@@ -9596,6 +9672,7 @@
         <w:trPr>
           <w:divId w:val="631641576"/>
           <w:cantSplit/>
+          <w:jc w:val="center"/>
         </w:trPr>
         <w:tc>
           <w:tcPr>
@@ -9744,6 +9821,7 @@
         <w:trPr>
           <w:divId w:val="631641576"/>
           <w:cantSplit/>
+          <w:jc w:val="center"/>
         </w:trPr>
         <w:tc>
           <w:tcPr>
@@ -9892,6 +9970,7 @@
         <w:trPr>
           <w:divId w:val="631641576"/>
           <w:cantSplit/>
+          <w:jc w:val="center"/>
         </w:trPr>
         <w:tc>
           <w:tcPr>
@@ -10040,6 +10119,7 @@
         <w:trPr>
           <w:divId w:val="631641576"/>
           <w:cantSplit/>
+          <w:jc w:val="center"/>
         </w:trPr>
         <w:tc>
           <w:tcPr>
@@ -10188,6 +10268,7 @@
         <w:trPr>
           <w:divId w:val="631641576"/>
           <w:cantSplit/>
+          <w:jc w:val="center"/>
         </w:trPr>
         <w:tc>
           <w:tcPr>
@@ -10336,6 +10417,7 @@
         <w:trPr>
           <w:divId w:val="631641576"/>
           <w:cantSplit/>
+          <w:jc w:val="center"/>
         </w:trPr>
         <w:tc>
           <w:tcPr>
@@ -10502,12 +10584,14 @@
           <w:color w:val="000000"/>
           <w:lang w:val="en"/>
         </w:rPr>
+        <w:lastRenderedPageBreak/>
         <w:t>Table 8. Payments</w:t>
       </w:r>
     </w:p>
     <w:tbl>
       <w:tblPr>
         <w:tblW w:w="5000" w:type="pct"/>
+        <w:jc w:val="center"/>
         <w:tblBorders>
           <w:top w:val="single" w:sz="4" w:space="0" w:color="000000"/>
           <w:left w:val="single" w:sz="4" w:space="0" w:color="000000"/>
@@ -10536,10 +10620,11 @@
           <w:divId w:val="631641576"/>
           <w:cantSplit/>
           <w:tblHeader/>
+          <w:jc w:val="center"/>
         </w:trPr>
         <w:tc>
           <w:tcPr>
-            <w:tcW w:w="1000" w:type="pct"/>
+            <w:tcW w:w="1127" w:type="pct"/>
             <w:shd w:val="clear" w:color="auto" w:fill="FFFFFF"/>
             <w:tcMar>
               <w:top w:w="100" w:type="dxa"/>
@@ -10573,7 +10658,7 @@
         </w:tc>
         <w:tc>
           <w:tcPr>
-            <w:tcW w:w="750" w:type="pct"/>
+            <w:tcW w:w="1034" w:type="pct"/>
             <w:shd w:val="clear" w:color="auto" w:fill="FFFFFF"/>
             <w:tcMar>
               <w:top w:w="100" w:type="dxa"/>
@@ -10607,7 +10692,7 @@
         </w:tc>
         <w:tc>
           <w:tcPr>
-            <w:tcW w:w="600" w:type="pct"/>
+            <w:tcW w:w="642" w:type="pct"/>
             <w:shd w:val="clear" w:color="auto" w:fill="FFFFFF"/>
             <w:tcMar>
               <w:top w:w="100" w:type="dxa"/>
@@ -10641,7 +10726,7 @@
         </w:tc>
         <w:tc>
           <w:tcPr>
-            <w:tcW w:w="900" w:type="pct"/>
+            <w:tcW w:w="673" w:type="pct"/>
             <w:shd w:val="clear" w:color="auto" w:fill="FFFFFF"/>
             <w:tcMar>
               <w:top w:w="100" w:type="dxa"/>
@@ -10675,7 +10760,7 @@
         </w:tc>
         <w:tc>
           <w:tcPr>
-            <w:tcW w:w="1750" w:type="pct"/>
+            <w:tcW w:w="1524" w:type="pct"/>
             <w:shd w:val="clear" w:color="auto" w:fill="FFFFFF"/>
             <w:tcMar>
               <w:top w:w="100" w:type="dxa"/>
@@ -10712,6 +10797,7 @@
         <w:trPr>
           <w:divId w:val="631641576"/>
           <w:cantSplit/>
+          <w:jc w:val="center"/>
         </w:trPr>
         <w:tc>
           <w:tcPr>
@@ -10860,6 +10946,7 @@
         <w:trPr>
           <w:divId w:val="631641576"/>
           <w:cantSplit/>
+          <w:jc w:val="center"/>
         </w:trPr>
         <w:tc>
           <w:tcPr>
@@ -11008,6 +11095,7 @@
         <w:trPr>
           <w:divId w:val="631641576"/>
           <w:cantSplit/>
+          <w:jc w:val="center"/>
         </w:trPr>
         <w:tc>
           <w:tcPr>
@@ -11156,6 +11244,7 @@
         <w:trPr>
           <w:divId w:val="631641576"/>
           <w:cantSplit/>
+          <w:jc w:val="center"/>
         </w:trPr>
         <w:tc>
           <w:tcPr>
@@ -11304,6 +11393,7 @@
         <w:trPr>
           <w:divId w:val="631641576"/>
           <w:cantSplit/>
+          <w:jc w:val="center"/>
         </w:trPr>
         <w:tc>
           <w:tcPr>
@@ -11452,6 +11542,7 @@
         <w:trPr>
           <w:divId w:val="631641576"/>
           <w:cantSplit/>
+          <w:jc w:val="center"/>
         </w:trPr>
         <w:tc>
           <w:tcPr>
@@ -11600,6 +11691,7 @@
         <w:trPr>
           <w:divId w:val="631641576"/>
           <w:cantSplit/>
+          <w:jc w:val="center"/>
         </w:trPr>
         <w:tc>
           <w:tcPr>
@@ -11748,6 +11840,7 @@
         <w:trPr>
           <w:divId w:val="631641576"/>
           <w:cantSplit/>
+          <w:jc w:val="center"/>
         </w:trPr>
         <w:tc>
           <w:tcPr>
@@ -11896,6 +11989,7 @@
         <w:trPr>
           <w:divId w:val="631641576"/>
           <w:cantSplit/>
+          <w:jc w:val="center"/>
         </w:trPr>
         <w:tc>
           <w:tcPr>
@@ -12044,6 +12138,7 @@
         <w:trPr>
           <w:divId w:val="631641576"/>
           <w:cantSplit/>
+          <w:jc w:val="center"/>
         </w:trPr>
         <w:tc>
           <w:tcPr>
@@ -12215,7 +12310,8 @@
     </w:p>
     <w:tbl>
       <w:tblPr>
-        <w:tblW w:w="5000" w:type="pct"/>
+        <w:tblW w:w="5020" w:type="pct"/>
+        <w:jc w:val="center"/>
         <w:tblBorders>
           <w:top w:val="single" w:sz="4" w:space="0" w:color="000000"/>
           <w:left w:val="single" w:sz="4" w:space="0" w:color="000000"/>
@@ -12244,10 +12340,11 @@
           <w:divId w:val="631641576"/>
           <w:cantSplit/>
           <w:tblHeader/>
+          <w:jc w:val="center"/>
         </w:trPr>
         <w:tc>
           <w:tcPr>
-            <w:tcW w:w="1000" w:type="pct"/>
+            <w:tcW w:w="1441" w:type="pct"/>
             <w:shd w:val="clear" w:color="auto" w:fill="FFFFFF"/>
             <w:tcMar>
               <w:top w:w="100" w:type="dxa"/>
@@ -12281,7 +12378,7 @@
         </w:tc>
         <w:tc>
           <w:tcPr>
-            <w:tcW w:w="750" w:type="pct"/>
+            <w:tcW w:w="1030" w:type="pct"/>
             <w:shd w:val="clear" w:color="auto" w:fill="FFFFFF"/>
             <w:tcMar>
               <w:top w:w="100" w:type="dxa"/>
@@ -12315,7 +12412,7 @@
         </w:tc>
         <w:tc>
           <w:tcPr>
-            <w:tcW w:w="600" w:type="pct"/>
+            <w:tcW w:w="639" w:type="pct"/>
             <w:shd w:val="clear" w:color="auto" w:fill="FFFFFF"/>
             <w:tcMar>
               <w:top w:w="100" w:type="dxa"/>
@@ -12349,7 +12446,7 @@
         </w:tc>
         <w:tc>
           <w:tcPr>
-            <w:tcW w:w="900" w:type="pct"/>
+            <w:tcW w:w="540" w:type="pct"/>
             <w:shd w:val="clear" w:color="auto" w:fill="FFFFFF"/>
             <w:tcMar>
               <w:top w:w="100" w:type="dxa"/>
@@ -12383,7 +12480,7 @@
         </w:tc>
         <w:tc>
           <w:tcPr>
-            <w:tcW w:w="1750" w:type="pct"/>
+            <w:tcW w:w="1350" w:type="pct"/>
             <w:shd w:val="clear" w:color="auto" w:fill="FFFFFF"/>
             <w:tcMar>
               <w:top w:w="100" w:type="dxa"/>
@@ -12420,6 +12517,7 @@
         <w:trPr>
           <w:divId w:val="631641576"/>
           <w:cantSplit/>
+          <w:jc w:val="center"/>
         </w:trPr>
         <w:tc>
           <w:tcPr>
@@ -12568,6 +12666,7 @@
         <w:trPr>
           <w:divId w:val="631641576"/>
           <w:cantSplit/>
+          <w:jc w:val="center"/>
         </w:trPr>
         <w:tc>
           <w:tcPr>
@@ -12716,6 +12815,7 @@
         <w:trPr>
           <w:divId w:val="631641576"/>
           <w:cantSplit/>
+          <w:jc w:val="center"/>
         </w:trPr>
         <w:tc>
           <w:tcPr>
@@ -12864,6 +12964,7 @@
         <w:trPr>
           <w:divId w:val="631641576"/>
           <w:cantSplit/>
+          <w:jc w:val="center"/>
         </w:trPr>
         <w:tc>
           <w:tcPr>
@@ -13012,6 +13113,7 @@
         <w:trPr>
           <w:divId w:val="631641576"/>
           <w:cantSplit/>
+          <w:jc w:val="center"/>
         </w:trPr>
         <w:tc>
           <w:tcPr>
@@ -13160,6 +13262,7 @@
         <w:trPr>
           <w:divId w:val="631641576"/>
           <w:cantSplit/>
+          <w:jc w:val="center"/>
         </w:trPr>
         <w:tc>
           <w:tcPr>
@@ -13308,6 +13411,7 @@
         <w:trPr>
           <w:divId w:val="631641576"/>
           <w:cantSplit/>
+          <w:jc w:val="center"/>
         </w:trPr>
         <w:tc>
           <w:tcPr>
@@ -13456,6 +13560,7 @@
         <w:trPr>
           <w:divId w:val="631641576"/>
           <w:cantSplit/>
+          <w:jc w:val="center"/>
         </w:trPr>
         <w:tc>
           <w:tcPr>
@@ -13604,6 +13709,7 @@
         <w:trPr>
           <w:divId w:val="631641576"/>
           <w:cantSplit/>
+          <w:jc w:val="center"/>
         </w:trPr>
         <w:tc>
           <w:tcPr>
@@ -13752,6 +13858,7 @@
         <w:trPr>
           <w:divId w:val="631641576"/>
           <w:cantSplit/>
+          <w:jc w:val="center"/>
         </w:trPr>
         <w:tc>
           <w:tcPr>
@@ -13900,6 +14007,7 @@
         <w:trPr>
           <w:divId w:val="631641576"/>
           <w:cantSplit/>
+          <w:jc w:val="center"/>
         </w:trPr>
         <w:tc>
           <w:tcPr>
@@ -14048,6 +14156,7 @@
         <w:trPr>
           <w:divId w:val="631641576"/>
           <w:cantSplit/>
+          <w:jc w:val="center"/>
         </w:trPr>
         <w:tc>
           <w:tcPr>
@@ -14196,6 +14305,7 @@
         <w:trPr>
           <w:divId w:val="631641576"/>
           <w:cantSplit/>
+          <w:jc w:val="center"/>
         </w:trPr>
         <w:tc>
           <w:tcPr>
@@ -14368,6 +14478,7 @@
     <w:tbl>
       <w:tblPr>
         <w:tblW w:w="5000" w:type="pct"/>
+        <w:jc w:val="center"/>
         <w:tblBorders>
           <w:top w:val="single" w:sz="4" w:space="0" w:color="000000"/>
           <w:left w:val="single" w:sz="4" w:space="0" w:color="000000"/>
@@ -14385,9 +14496,9 @@
         <w:tblLook w:val="04A0" w:firstRow="1" w:lastRow="0" w:firstColumn="1" w:lastColumn="0" w:noHBand="0" w:noVBand="1"/>
       </w:tblPr>
       <w:tblGrid>
-        <w:gridCol w:w="1706"/>
+        <w:gridCol w:w="1705"/>
         <w:gridCol w:w="1814"/>
-        <w:gridCol w:w="1200"/>
+        <w:gridCol w:w="1201"/>
         <w:gridCol w:w="1520"/>
         <w:gridCol w:w="3110"/>
       </w:tblGrid>
@@ -14396,10 +14507,11 @@
           <w:divId w:val="631641576"/>
           <w:cantSplit/>
           <w:tblHeader/>
+          <w:jc w:val="center"/>
         </w:trPr>
         <w:tc>
           <w:tcPr>
-            <w:tcW w:w="1000" w:type="pct"/>
+            <w:tcW w:w="912" w:type="pct"/>
             <w:shd w:val="clear" w:color="auto" w:fill="FFFFFF"/>
             <w:tcMar>
               <w:top w:w="100" w:type="dxa"/>
@@ -14433,7 +14545,7 @@
         </w:tc>
         <w:tc>
           <w:tcPr>
-            <w:tcW w:w="750" w:type="pct"/>
+            <w:tcW w:w="970" w:type="pct"/>
             <w:shd w:val="clear" w:color="auto" w:fill="FFFFFF"/>
             <w:tcMar>
               <w:top w:w="100" w:type="dxa"/>
@@ -14467,7 +14579,7 @@
         </w:tc>
         <w:tc>
           <w:tcPr>
-            <w:tcW w:w="600" w:type="pct"/>
+            <w:tcW w:w="642" w:type="pct"/>
             <w:shd w:val="clear" w:color="auto" w:fill="FFFFFF"/>
             <w:tcMar>
               <w:top w:w="100" w:type="dxa"/>
@@ -14501,7 +14613,7 @@
         </w:tc>
         <w:tc>
           <w:tcPr>
-            <w:tcW w:w="900" w:type="pct"/>
+            <w:tcW w:w="813" w:type="pct"/>
             <w:shd w:val="clear" w:color="auto" w:fill="FFFFFF"/>
             <w:tcMar>
               <w:top w:w="100" w:type="dxa"/>
@@ -14535,7 +14647,7 @@
         </w:tc>
         <w:tc>
           <w:tcPr>
-            <w:tcW w:w="1750" w:type="pct"/>
+            <w:tcW w:w="1663" w:type="pct"/>
             <w:shd w:val="clear" w:color="auto" w:fill="FFFFFF"/>
             <w:tcMar>
               <w:top w:w="100" w:type="dxa"/>
@@ -14572,6 +14684,7 @@
         <w:trPr>
           <w:divId w:val="631641576"/>
           <w:cantSplit/>
+          <w:jc w:val="center"/>
         </w:trPr>
         <w:tc>
           <w:tcPr>
@@ -14720,6 +14833,7 @@
         <w:trPr>
           <w:divId w:val="631641576"/>
           <w:cantSplit/>
+          <w:jc w:val="center"/>
         </w:trPr>
         <w:tc>
           <w:tcPr>
@@ -14868,6 +14982,7 @@
         <w:trPr>
           <w:divId w:val="631641576"/>
           <w:cantSplit/>
+          <w:jc w:val="center"/>
         </w:trPr>
         <w:tc>
           <w:tcPr>
@@ -15016,6 +15131,7 @@
         <w:trPr>
           <w:divId w:val="631641576"/>
           <w:cantSplit/>
+          <w:jc w:val="center"/>
         </w:trPr>
         <w:tc>
           <w:tcPr>
@@ -15164,6 +15280,7 @@
         <w:trPr>
           <w:divId w:val="631641576"/>
           <w:cantSplit/>
+          <w:jc w:val="center"/>
         </w:trPr>
         <w:tc>
           <w:tcPr>
@@ -15312,6 +15429,7 @@
         <w:trPr>
           <w:divId w:val="631641576"/>
           <w:cantSplit/>
+          <w:jc w:val="center"/>
         </w:trPr>
         <w:tc>
           <w:tcPr>
@@ -15460,6 +15578,7 @@
         <w:trPr>
           <w:divId w:val="631641576"/>
           <w:cantSplit/>
+          <w:jc w:val="center"/>
         </w:trPr>
         <w:tc>
           <w:tcPr>
@@ -15632,6 +15751,7 @@
     <w:tbl>
       <w:tblPr>
         <w:tblW w:w="5000" w:type="pct"/>
+        <w:jc w:val="center"/>
         <w:tblBorders>
           <w:top w:val="single" w:sz="4" w:space="0" w:color="000000"/>
           <w:left w:val="single" w:sz="4" w:space="0" w:color="000000"/>
@@ -15652,18 +15772,19 @@
         <w:gridCol w:w="1640"/>
         <w:gridCol w:w="1934"/>
         <w:gridCol w:w="1200"/>
-        <w:gridCol w:w="1409"/>
-        <w:gridCol w:w="3167"/>
+        <w:gridCol w:w="1408"/>
+        <w:gridCol w:w="3168"/>
       </w:tblGrid>
       <w:tr>
         <w:trPr>
           <w:divId w:val="631641576"/>
           <w:cantSplit/>
           <w:tblHeader/>
+          <w:jc w:val="center"/>
         </w:trPr>
         <w:tc>
           <w:tcPr>
-            <w:tcW w:w="1000" w:type="pct"/>
+            <w:tcW w:w="877" w:type="pct"/>
             <w:shd w:val="clear" w:color="auto" w:fill="FFFFFF"/>
             <w:tcMar>
               <w:top w:w="100" w:type="dxa"/>
@@ -15697,7 +15818,7 @@
         </w:tc>
         <w:tc>
           <w:tcPr>
-            <w:tcW w:w="750" w:type="pct"/>
+            <w:tcW w:w="1034" w:type="pct"/>
             <w:shd w:val="clear" w:color="auto" w:fill="FFFFFF"/>
             <w:tcMar>
               <w:top w:w="100" w:type="dxa"/>
@@ -15731,7 +15852,7 @@
         </w:tc>
         <w:tc>
           <w:tcPr>
-            <w:tcW w:w="600" w:type="pct"/>
+            <w:tcW w:w="642" w:type="pct"/>
             <w:shd w:val="clear" w:color="auto" w:fill="FFFFFF"/>
             <w:tcMar>
               <w:top w:w="100" w:type="dxa"/>
@@ -15765,7 +15886,7 @@
         </w:tc>
         <w:tc>
           <w:tcPr>
-            <w:tcW w:w="900" w:type="pct"/>
+            <w:tcW w:w="753" w:type="pct"/>
             <w:shd w:val="clear" w:color="auto" w:fill="FFFFFF"/>
             <w:tcMar>
               <w:top w:w="100" w:type="dxa"/>
@@ -15799,7 +15920,7 @@
         </w:tc>
         <w:tc>
           <w:tcPr>
-            <w:tcW w:w="1750" w:type="pct"/>
+            <w:tcW w:w="1694" w:type="pct"/>
             <w:shd w:val="clear" w:color="auto" w:fill="FFFFFF"/>
             <w:tcMar>
               <w:top w:w="100" w:type="dxa"/>
@@ -15836,6 +15957,7 @@
         <w:trPr>
           <w:divId w:val="631641576"/>
           <w:cantSplit/>
+          <w:jc w:val="center"/>
         </w:trPr>
         <w:tc>
           <w:tcPr>
@@ -15984,6 +16106,7 @@
         <w:trPr>
           <w:divId w:val="631641576"/>
           <w:cantSplit/>
+          <w:jc w:val="center"/>
         </w:trPr>
         <w:tc>
           <w:tcPr>
@@ -16132,6 +16255,7 @@
         <w:trPr>
           <w:divId w:val="631641576"/>
           <w:cantSplit/>
+          <w:jc w:val="center"/>
         </w:trPr>
         <w:tc>
           <w:tcPr>
@@ -16280,6 +16404,7 @@
         <w:trPr>
           <w:divId w:val="631641576"/>
           <w:cantSplit/>
+          <w:jc w:val="center"/>
         </w:trPr>
         <w:tc>
           <w:tcPr>
@@ -16428,6 +16553,7 @@
         <w:trPr>
           <w:divId w:val="631641576"/>
           <w:cantSplit/>
+          <w:jc w:val="center"/>
         </w:trPr>
         <w:tc>
           <w:tcPr>
@@ -16576,6 +16702,7 @@
         <w:trPr>
           <w:divId w:val="631641576"/>
           <w:cantSplit/>
+          <w:jc w:val="center"/>
         </w:trPr>
         <w:tc>
           <w:tcPr>
@@ -16724,6 +16851,7 @@
         <w:trPr>
           <w:divId w:val="631641576"/>
           <w:cantSplit/>
+          <w:jc w:val="center"/>
         </w:trPr>
         <w:tc>
           <w:tcPr>
@@ -16872,6 +17000,7 @@
         <w:trPr>
           <w:divId w:val="631641576"/>
           <w:cantSplit/>
+          <w:jc w:val="center"/>
         </w:trPr>
         <w:tc>
           <w:tcPr>
@@ -17044,6 +17173,7 @@
     <w:tbl>
       <w:tblPr>
         <w:tblW w:w="5000" w:type="pct"/>
+        <w:jc w:val="center"/>
         <w:tblBorders>
           <w:top w:val="single" w:sz="4" w:space="0" w:color="000000"/>
           <w:left w:val="single" w:sz="4" w:space="0" w:color="000000"/>
@@ -17063,8 +17193,8 @@
       <w:tblGrid>
         <w:gridCol w:w="2559"/>
         <w:gridCol w:w="1934"/>
-        <w:gridCol w:w="1200"/>
-        <w:gridCol w:w="1033"/>
+        <w:gridCol w:w="1201"/>
+        <w:gridCol w:w="1032"/>
         <w:gridCol w:w="2624"/>
       </w:tblGrid>
       <w:tr>
@@ -17072,10 +17202,11 @@
           <w:divId w:val="631641576"/>
           <w:cantSplit/>
           <w:tblHeader/>
+          <w:jc w:val="center"/>
         </w:trPr>
         <w:tc>
           <w:tcPr>
-            <w:tcW w:w="1000" w:type="pct"/>
+            <w:tcW w:w="1368" w:type="pct"/>
             <w:shd w:val="clear" w:color="auto" w:fill="FFFFFF"/>
             <w:tcMar>
               <w:top w:w="100" w:type="dxa"/>
@@ -17109,7 +17240,7 @@
         </w:tc>
         <w:tc>
           <w:tcPr>
-            <w:tcW w:w="750" w:type="pct"/>
+            <w:tcW w:w="1034" w:type="pct"/>
             <w:shd w:val="clear" w:color="auto" w:fill="FFFFFF"/>
             <w:tcMar>
               <w:top w:w="100" w:type="dxa"/>
@@ -17143,7 +17274,7 @@
         </w:tc>
         <w:tc>
           <w:tcPr>
-            <w:tcW w:w="600" w:type="pct"/>
+            <w:tcW w:w="642" w:type="pct"/>
             <w:shd w:val="clear" w:color="auto" w:fill="FFFFFF"/>
             <w:tcMar>
               <w:top w:w="100" w:type="dxa"/>
@@ -17177,7 +17308,7 @@
         </w:tc>
         <w:tc>
           <w:tcPr>
-            <w:tcW w:w="900" w:type="pct"/>
+            <w:tcW w:w="552" w:type="pct"/>
             <w:shd w:val="clear" w:color="auto" w:fill="FFFFFF"/>
             <w:tcMar>
               <w:top w:w="100" w:type="dxa"/>
@@ -17211,7 +17342,7 @@
         </w:tc>
         <w:tc>
           <w:tcPr>
-            <w:tcW w:w="1750" w:type="pct"/>
+            <w:tcW w:w="1403" w:type="pct"/>
             <w:shd w:val="clear" w:color="auto" w:fill="FFFFFF"/>
             <w:tcMar>
               <w:top w:w="100" w:type="dxa"/>
@@ -17248,6 +17379,7 @@
         <w:trPr>
           <w:divId w:val="631641576"/>
           <w:cantSplit/>
+          <w:jc w:val="center"/>
         </w:trPr>
         <w:tc>
           <w:tcPr>
@@ -17396,6 +17528,7 @@
         <w:trPr>
           <w:divId w:val="631641576"/>
           <w:cantSplit/>
+          <w:jc w:val="center"/>
         </w:trPr>
         <w:tc>
           <w:tcPr>
@@ -17544,6 +17677,7 @@
         <w:trPr>
           <w:divId w:val="631641576"/>
           <w:cantSplit/>
+          <w:jc w:val="center"/>
         </w:trPr>
         <w:tc>
           <w:tcPr>
@@ -17692,6 +17826,7 @@
         <w:trPr>
           <w:divId w:val="631641576"/>
           <w:cantSplit/>
+          <w:jc w:val="center"/>
         </w:trPr>
         <w:tc>
           <w:tcPr>
@@ -17840,6 +17975,7 @@
         <w:trPr>
           <w:divId w:val="631641576"/>
           <w:cantSplit/>
+          <w:jc w:val="center"/>
         </w:trPr>
         <w:tc>
           <w:tcPr>
@@ -17988,6 +18124,7 @@
         <w:trPr>
           <w:divId w:val="631641576"/>
           <w:cantSplit/>
+          <w:jc w:val="center"/>
         </w:trPr>
         <w:tc>
           <w:tcPr>
@@ -18136,6 +18273,7 @@
         <w:trPr>
           <w:divId w:val="631641576"/>
           <w:cantSplit/>
+          <w:jc w:val="center"/>
         </w:trPr>
         <w:tc>
           <w:tcPr>
@@ -18308,6 +18446,7 @@
     <w:tbl>
       <w:tblPr>
         <w:tblW w:w="5000" w:type="pct"/>
+        <w:jc w:val="center"/>
         <w:tblBorders>
           <w:top w:val="single" w:sz="4" w:space="0" w:color="000000"/>
           <w:left w:val="single" w:sz="4" w:space="0" w:color="000000"/>
@@ -18328,18 +18467,19 @@
         <w:gridCol w:w="2173"/>
         <w:gridCol w:w="1934"/>
         <w:gridCol w:w="1200"/>
-        <w:gridCol w:w="1226"/>
-        <w:gridCol w:w="2817"/>
+        <w:gridCol w:w="1227"/>
+        <w:gridCol w:w="2816"/>
       </w:tblGrid>
       <w:tr>
         <w:trPr>
           <w:divId w:val="631641576"/>
           <w:cantSplit/>
           <w:tblHeader/>
+          <w:jc w:val="center"/>
         </w:trPr>
         <w:tc>
           <w:tcPr>
-            <w:tcW w:w="1000" w:type="pct"/>
+            <w:tcW w:w="1162" w:type="pct"/>
             <w:shd w:val="clear" w:color="auto" w:fill="FFFFFF"/>
             <w:tcMar>
               <w:top w:w="100" w:type="dxa"/>
@@ -18373,7 +18513,7 @@
         </w:tc>
         <w:tc>
           <w:tcPr>
-            <w:tcW w:w="750" w:type="pct"/>
+            <w:tcW w:w="1034" w:type="pct"/>
             <w:shd w:val="clear" w:color="auto" w:fill="FFFFFF"/>
             <w:tcMar>
               <w:top w:w="100" w:type="dxa"/>
@@ -18407,7 +18547,7 @@
         </w:tc>
         <w:tc>
           <w:tcPr>
-            <w:tcW w:w="600" w:type="pct"/>
+            <w:tcW w:w="642" w:type="pct"/>
             <w:shd w:val="clear" w:color="auto" w:fill="FFFFFF"/>
             <w:tcMar>
               <w:top w:w="100" w:type="dxa"/>
@@ -18441,7 +18581,7 @@
         </w:tc>
         <w:tc>
           <w:tcPr>
-            <w:tcW w:w="900" w:type="pct"/>
+            <w:tcW w:w="656" w:type="pct"/>
             <w:shd w:val="clear" w:color="auto" w:fill="FFFFFF"/>
             <w:tcMar>
               <w:top w:w="100" w:type="dxa"/>
@@ -18475,7 +18615,7 @@
         </w:tc>
         <w:tc>
           <w:tcPr>
-            <w:tcW w:w="1750" w:type="pct"/>
+            <w:tcW w:w="1506" w:type="pct"/>
             <w:shd w:val="clear" w:color="auto" w:fill="FFFFFF"/>
             <w:tcMar>
               <w:top w:w="100" w:type="dxa"/>
@@ -18512,6 +18652,7 @@
         <w:trPr>
           <w:divId w:val="631641576"/>
           <w:cantSplit/>
+          <w:jc w:val="center"/>
         </w:trPr>
         <w:tc>
           <w:tcPr>
@@ -18660,6 +18801,7 @@
         <w:trPr>
           <w:divId w:val="631641576"/>
           <w:cantSplit/>
+          <w:jc w:val="center"/>
         </w:trPr>
         <w:tc>
           <w:tcPr>
@@ -18808,6 +18950,7 @@
         <w:trPr>
           <w:divId w:val="631641576"/>
           <w:cantSplit/>
+          <w:jc w:val="center"/>
         </w:trPr>
         <w:tc>
           <w:tcPr>
@@ -18956,6 +19099,7 @@
         <w:trPr>
           <w:divId w:val="631641576"/>
           <w:cantSplit/>
+          <w:jc w:val="center"/>
         </w:trPr>
         <w:tc>
           <w:tcPr>
@@ -19104,6 +19248,7 @@
         <w:trPr>
           <w:divId w:val="631641576"/>
           <w:cantSplit/>
+          <w:jc w:val="center"/>
         </w:trPr>
         <w:tc>
           <w:tcPr>
@@ -19252,6 +19397,7 @@
         <w:trPr>
           <w:divId w:val="631641576"/>
           <w:cantSplit/>
+          <w:jc w:val="center"/>
         </w:trPr>
         <w:tc>
           <w:tcPr>
@@ -19400,6 +19546,7 @@
         <w:trPr>
           <w:divId w:val="631641576"/>
           <w:cantSplit/>
+          <w:jc w:val="center"/>
         </w:trPr>
         <w:tc>
           <w:tcPr>
@@ -19548,6 +19695,7 @@
         <w:trPr>
           <w:divId w:val="631641576"/>
           <w:cantSplit/>
+          <w:jc w:val="center"/>
         </w:trPr>
         <w:tc>
           <w:tcPr>
@@ -19696,6 +19844,7 @@
         <w:trPr>
           <w:divId w:val="631641576"/>
           <w:cantSplit/>
+          <w:jc w:val="center"/>
         </w:trPr>
         <w:tc>
           <w:tcPr>
@@ -19868,6 +20017,7 @@
     <w:tbl>
       <w:tblPr>
         <w:tblW w:w="5000" w:type="pct"/>
+        <w:jc w:val="center"/>
         <w:tblBorders>
           <w:top w:val="single" w:sz="4" w:space="0" w:color="000000"/>
           <w:left w:val="single" w:sz="4" w:space="0" w:color="000000"/>
@@ -19888,18 +20038,19 @@
         <w:gridCol w:w="1920"/>
         <w:gridCol w:w="1934"/>
         <w:gridCol w:w="1200"/>
-        <w:gridCol w:w="1353"/>
-        <w:gridCol w:w="2943"/>
+        <w:gridCol w:w="1354"/>
+        <w:gridCol w:w="2942"/>
       </w:tblGrid>
       <w:tr>
         <w:trPr>
           <w:divId w:val="631641576"/>
           <w:cantSplit/>
           <w:tblHeader/>
+          <w:jc w:val="center"/>
         </w:trPr>
         <w:tc>
           <w:tcPr>
-            <w:tcW w:w="1000" w:type="pct"/>
+            <w:tcW w:w="1027" w:type="pct"/>
             <w:shd w:val="clear" w:color="auto" w:fill="FFFFFF"/>
             <w:tcMar>
               <w:top w:w="100" w:type="dxa"/>
@@ -19933,7 +20084,7 @@
         </w:tc>
         <w:tc>
           <w:tcPr>
-            <w:tcW w:w="750" w:type="pct"/>
+            <w:tcW w:w="1034" w:type="pct"/>
             <w:shd w:val="clear" w:color="auto" w:fill="FFFFFF"/>
             <w:tcMar>
               <w:top w:w="100" w:type="dxa"/>
@@ -19967,7 +20118,7 @@
         </w:tc>
         <w:tc>
           <w:tcPr>
-            <w:tcW w:w="600" w:type="pct"/>
+            <w:tcW w:w="642" w:type="pct"/>
             <w:shd w:val="clear" w:color="auto" w:fill="FFFFFF"/>
             <w:tcMar>
               <w:top w:w="100" w:type="dxa"/>
@@ -20001,7 +20152,7 @@
         </w:tc>
         <w:tc>
           <w:tcPr>
-            <w:tcW w:w="900" w:type="pct"/>
+            <w:tcW w:w="724" w:type="pct"/>
             <w:shd w:val="clear" w:color="auto" w:fill="FFFFFF"/>
             <w:tcMar>
               <w:top w:w="100" w:type="dxa"/>
@@ -20035,7 +20186,7 @@
         </w:tc>
         <w:tc>
           <w:tcPr>
-            <w:tcW w:w="1750" w:type="pct"/>
+            <w:tcW w:w="1574" w:type="pct"/>
             <w:shd w:val="clear" w:color="auto" w:fill="FFFFFF"/>
             <w:tcMar>
               <w:top w:w="100" w:type="dxa"/>
@@ -20072,6 +20223,7 @@
         <w:trPr>
           <w:divId w:val="631641576"/>
           <w:cantSplit/>
+          <w:jc w:val="center"/>
         </w:trPr>
         <w:tc>
           <w:tcPr>
@@ -20220,6 +20372,7 @@
         <w:trPr>
           <w:divId w:val="631641576"/>
           <w:cantSplit/>
+          <w:jc w:val="center"/>
         </w:trPr>
         <w:tc>
           <w:tcPr>
@@ -20368,6 +20521,7 @@
         <w:trPr>
           <w:divId w:val="631641576"/>
           <w:cantSplit/>
+          <w:jc w:val="center"/>
         </w:trPr>
         <w:tc>
           <w:tcPr>
@@ -20516,6 +20670,7 @@
         <w:trPr>
           <w:divId w:val="631641576"/>
           <w:cantSplit/>
+          <w:jc w:val="center"/>
         </w:trPr>
         <w:tc>
           <w:tcPr>
@@ -20664,6 +20819,7 @@
         <w:trPr>
           <w:divId w:val="631641576"/>
           <w:cantSplit/>
+          <w:jc w:val="center"/>
         </w:trPr>
         <w:tc>
           <w:tcPr>
@@ -20812,6 +20968,7 @@
         <w:trPr>
           <w:divId w:val="631641576"/>
           <w:cantSplit/>
+          <w:jc w:val="center"/>
         </w:trPr>
         <w:tc>
           <w:tcPr>
@@ -20960,6 +21117,7 @@
         <w:trPr>
           <w:divId w:val="631641576"/>
           <w:cantSplit/>
+          <w:jc w:val="center"/>
         </w:trPr>
         <w:tc>
           <w:tcPr>
@@ -21108,6 +21266,7 @@
         <w:trPr>
           <w:divId w:val="631641576"/>
           <w:cantSplit/>
+          <w:jc w:val="center"/>
         </w:trPr>
         <w:tc>
           <w:tcPr>
@@ -21256,6 +21415,7 @@
         <w:trPr>
           <w:divId w:val="631641576"/>
           <w:cantSplit/>
+          <w:jc w:val="center"/>
         </w:trPr>
         <w:tc>
           <w:tcPr>
@@ -21404,6 +21564,7 @@
         <w:trPr>
           <w:divId w:val="631641576"/>
           <w:cantSplit/>
+          <w:jc w:val="center"/>
         </w:trPr>
         <w:tc>
           <w:tcPr>
@@ -21576,6 +21737,7 @@
     <w:tbl>
       <w:tblPr>
         <w:tblW w:w="5000" w:type="pct"/>
+        <w:jc w:val="center"/>
         <w:tblBorders>
           <w:top w:val="single" w:sz="4" w:space="0" w:color="000000"/>
           <w:left w:val="single" w:sz="4" w:space="0" w:color="000000"/>
@@ -21596,18 +21758,19 @@
         <w:gridCol w:w="1827"/>
         <w:gridCol w:w="1934"/>
         <w:gridCol w:w="1200"/>
-        <w:gridCol w:w="1319"/>
-        <w:gridCol w:w="3070"/>
+        <w:gridCol w:w="1318"/>
+        <w:gridCol w:w="3071"/>
       </w:tblGrid>
       <w:tr>
         <w:trPr>
           <w:divId w:val="631641576"/>
           <w:cantSplit/>
           <w:tblHeader/>
+          <w:jc w:val="center"/>
         </w:trPr>
         <w:tc>
           <w:tcPr>
-            <w:tcW w:w="1000" w:type="pct"/>
+            <w:tcW w:w="977" w:type="pct"/>
             <w:shd w:val="clear" w:color="auto" w:fill="FFFFFF"/>
             <w:tcMar>
               <w:top w:w="100" w:type="dxa"/>
@@ -21641,7 +21804,7 @@
         </w:tc>
         <w:tc>
           <w:tcPr>
-            <w:tcW w:w="750" w:type="pct"/>
+            <w:tcW w:w="1034" w:type="pct"/>
             <w:shd w:val="clear" w:color="auto" w:fill="FFFFFF"/>
             <w:tcMar>
               <w:top w:w="100" w:type="dxa"/>
@@ -21675,7 +21838,7 @@
         </w:tc>
         <w:tc>
           <w:tcPr>
-            <w:tcW w:w="600" w:type="pct"/>
+            <w:tcW w:w="642" w:type="pct"/>
             <w:shd w:val="clear" w:color="auto" w:fill="FFFFFF"/>
             <w:tcMar>
               <w:top w:w="100" w:type="dxa"/>
@@ -21709,7 +21872,7 @@
         </w:tc>
         <w:tc>
           <w:tcPr>
-            <w:tcW w:w="900" w:type="pct"/>
+            <w:tcW w:w="705" w:type="pct"/>
             <w:shd w:val="clear" w:color="auto" w:fill="FFFFFF"/>
             <w:tcMar>
               <w:top w:w="100" w:type="dxa"/>
@@ -21743,7 +21906,7 @@
         </w:tc>
         <w:tc>
           <w:tcPr>
-            <w:tcW w:w="1750" w:type="pct"/>
+            <w:tcW w:w="1642" w:type="pct"/>
             <w:shd w:val="clear" w:color="auto" w:fill="FFFFFF"/>
             <w:tcMar>
               <w:top w:w="100" w:type="dxa"/>
@@ -21780,6 +21943,7 @@
         <w:trPr>
           <w:divId w:val="631641576"/>
           <w:cantSplit/>
+          <w:jc w:val="center"/>
         </w:trPr>
         <w:tc>
           <w:tcPr>
@@ -21928,6 +22092,7 @@
         <w:trPr>
           <w:divId w:val="631641576"/>
           <w:cantSplit/>
+          <w:jc w:val="center"/>
         </w:trPr>
         <w:tc>
           <w:tcPr>
@@ -22076,6 +22241,7 @@
         <w:trPr>
           <w:divId w:val="631641576"/>
           <w:cantSplit/>
+          <w:jc w:val="center"/>
         </w:trPr>
         <w:tc>
           <w:tcPr>
@@ -22224,6 +22390,7 @@
         <w:trPr>
           <w:divId w:val="631641576"/>
           <w:cantSplit/>
+          <w:jc w:val="center"/>
         </w:trPr>
         <w:tc>
           <w:tcPr>
@@ -22372,6 +22539,7 @@
         <w:trPr>
           <w:divId w:val="631641576"/>
           <w:cantSplit/>
+          <w:jc w:val="center"/>
         </w:trPr>
         <w:tc>
           <w:tcPr>
@@ -22520,6 +22688,7 @@
         <w:trPr>
           <w:divId w:val="631641576"/>
           <w:cantSplit/>
+          <w:jc w:val="center"/>
         </w:trPr>
         <w:tc>
           <w:tcPr>
@@ -22668,6 +22837,7 @@
         <w:trPr>
           <w:divId w:val="631641576"/>
           <w:cantSplit/>
+          <w:jc w:val="center"/>
         </w:trPr>
         <w:tc>
           <w:tcPr>
@@ -22816,6 +22986,7 @@
         <w:trPr>
           <w:divId w:val="631641576"/>
           <w:cantSplit/>
+          <w:jc w:val="center"/>
         </w:trPr>
         <w:tc>
           <w:tcPr>
@@ -22964,6 +23135,7 @@
         <w:trPr>
           <w:divId w:val="631641576"/>
           <w:cantSplit/>
+          <w:jc w:val="center"/>
         </w:trPr>
         <w:tc>
           <w:tcPr>
@@ -23112,6 +23284,7 @@
         <w:trPr>
           <w:divId w:val="631641576"/>
           <w:cantSplit/>
+          <w:jc w:val="center"/>
         </w:trPr>
         <w:tc>
           <w:tcPr>
@@ -23284,6 +23457,7 @@
     <w:tbl>
       <w:tblPr>
         <w:tblW w:w="5000" w:type="pct"/>
+        <w:jc w:val="center"/>
         <w:tblBorders>
           <w:top w:val="single" w:sz="4" w:space="0" w:color="000000"/>
           <w:left w:val="single" w:sz="4" w:space="0" w:color="000000"/>
@@ -23301,21 +23475,22 @@
         <w:tblLook w:val="04A0" w:firstRow="1" w:lastRow="0" w:firstColumn="1" w:lastColumn="0" w:noHBand="0" w:noVBand="1"/>
       </w:tblPr>
       <w:tblGrid>
-        <w:gridCol w:w="1666"/>
+        <w:gridCol w:w="1665"/>
         <w:gridCol w:w="1934"/>
-        <w:gridCol w:w="1200"/>
-        <w:gridCol w:w="1480"/>
-        <w:gridCol w:w="3070"/>
+        <w:gridCol w:w="1201"/>
+        <w:gridCol w:w="1479"/>
+        <w:gridCol w:w="3071"/>
       </w:tblGrid>
       <w:tr>
         <w:trPr>
           <w:divId w:val="631641576"/>
           <w:cantSplit/>
           <w:tblHeader/>
+          <w:jc w:val="center"/>
         </w:trPr>
         <w:tc>
           <w:tcPr>
-            <w:tcW w:w="1000" w:type="pct"/>
+            <w:tcW w:w="891" w:type="pct"/>
             <w:shd w:val="clear" w:color="auto" w:fill="FFFFFF"/>
             <w:tcMar>
               <w:top w:w="100" w:type="dxa"/>
@@ -23349,7 +23524,7 @@
         </w:tc>
         <w:tc>
           <w:tcPr>
-            <w:tcW w:w="750" w:type="pct"/>
+            <w:tcW w:w="1034" w:type="pct"/>
             <w:shd w:val="clear" w:color="auto" w:fill="FFFFFF"/>
             <w:tcMar>
               <w:top w:w="100" w:type="dxa"/>
@@ -23383,7 +23558,7 @@
         </w:tc>
         <w:tc>
           <w:tcPr>
-            <w:tcW w:w="600" w:type="pct"/>
+            <w:tcW w:w="642" w:type="pct"/>
             <w:shd w:val="clear" w:color="auto" w:fill="FFFFFF"/>
             <w:tcMar>
               <w:top w:w="100" w:type="dxa"/>
@@ -23417,7 +23592,7 @@
         </w:tc>
         <w:tc>
           <w:tcPr>
-            <w:tcW w:w="900" w:type="pct"/>
+            <w:tcW w:w="791" w:type="pct"/>
             <w:shd w:val="clear" w:color="auto" w:fill="FFFFFF"/>
             <w:tcMar>
               <w:top w:w="100" w:type="dxa"/>
@@ -23451,7 +23626,7 @@
         </w:tc>
         <w:tc>
           <w:tcPr>
-            <w:tcW w:w="1750" w:type="pct"/>
+            <w:tcW w:w="1642" w:type="pct"/>
             <w:shd w:val="clear" w:color="auto" w:fill="FFFFFF"/>
             <w:tcMar>
               <w:top w:w="100" w:type="dxa"/>
@@ -23488,6 +23663,7 @@
         <w:trPr>
           <w:divId w:val="631641576"/>
           <w:cantSplit/>
+          <w:jc w:val="center"/>
         </w:trPr>
         <w:tc>
           <w:tcPr>
@@ -23636,6 +23812,7 @@
         <w:trPr>
           <w:divId w:val="631641576"/>
           <w:cantSplit/>
+          <w:jc w:val="center"/>
         </w:trPr>
         <w:tc>
           <w:tcPr>
@@ -23784,6 +23961,7 @@
         <w:trPr>
           <w:divId w:val="631641576"/>
           <w:cantSplit/>
+          <w:jc w:val="center"/>
         </w:trPr>
         <w:tc>
           <w:tcPr>
@@ -23932,6 +24110,7 @@
         <w:trPr>
           <w:divId w:val="631641576"/>
           <w:cantSplit/>
+          <w:jc w:val="center"/>
         </w:trPr>
         <w:tc>
           <w:tcPr>
@@ -24080,6 +24259,7 @@
         <w:trPr>
           <w:divId w:val="631641576"/>
           <w:cantSplit/>
+          <w:jc w:val="center"/>
         </w:trPr>
         <w:tc>
           <w:tcPr>
@@ -24228,6 +24408,7 @@
         <w:trPr>
           <w:divId w:val="631641576"/>
           <w:cantSplit/>
+          <w:jc w:val="center"/>
         </w:trPr>
         <w:tc>
           <w:tcPr>
@@ -24376,6 +24557,7 @@
         <w:trPr>
           <w:divId w:val="631641576"/>
           <w:cantSplit/>
+          <w:jc w:val="center"/>
         </w:trPr>
         <w:tc>
           <w:tcPr>
@@ -24524,6 +24706,7 @@
         <w:trPr>
           <w:divId w:val="631641576"/>
           <w:cantSplit/>
+          <w:jc w:val="center"/>
         </w:trPr>
         <w:tc>
           <w:tcPr>
@@ -24672,6 +24855,7 @@
         <w:trPr>
           <w:divId w:val="631641576"/>
           <w:cantSplit/>
+          <w:jc w:val="center"/>
         </w:trPr>
         <w:tc>
           <w:tcPr>
@@ -24844,6 +25028,7 @@
     <w:tbl>
       <w:tblPr>
         <w:tblW w:w="5000" w:type="pct"/>
+        <w:jc w:val="center"/>
         <w:tblBorders>
           <w:top w:val="single" w:sz="4" w:space="0" w:color="000000"/>
           <w:left w:val="single" w:sz="4" w:space="0" w:color="000000"/>
@@ -24861,21 +25046,22 @@
         <w:tblLook w:val="04A0" w:firstRow="1" w:lastRow="0" w:firstColumn="1" w:lastColumn="0" w:noHBand="0" w:noVBand="1"/>
       </w:tblPr>
       <w:tblGrid>
-        <w:gridCol w:w="1666"/>
+        <w:gridCol w:w="1665"/>
         <w:gridCol w:w="1934"/>
-        <w:gridCol w:w="1200"/>
-        <w:gridCol w:w="1480"/>
-        <w:gridCol w:w="3070"/>
+        <w:gridCol w:w="1201"/>
+        <w:gridCol w:w="1479"/>
+        <w:gridCol w:w="3071"/>
       </w:tblGrid>
       <w:tr>
         <w:trPr>
           <w:divId w:val="631641576"/>
           <w:cantSplit/>
           <w:tblHeader/>
+          <w:jc w:val="center"/>
         </w:trPr>
         <w:tc>
           <w:tcPr>
-            <w:tcW w:w="1000" w:type="pct"/>
+            <w:tcW w:w="891" w:type="pct"/>
             <w:shd w:val="clear" w:color="auto" w:fill="FFFFFF"/>
             <w:tcMar>
               <w:top w:w="100" w:type="dxa"/>
@@ -24909,7 +25095,7 @@
         </w:tc>
         <w:tc>
           <w:tcPr>
-            <w:tcW w:w="750" w:type="pct"/>
+            <w:tcW w:w="1034" w:type="pct"/>
             <w:shd w:val="clear" w:color="auto" w:fill="FFFFFF"/>
             <w:tcMar>
               <w:top w:w="100" w:type="dxa"/>
@@ -24943,7 +25129,7 @@
         </w:tc>
         <w:tc>
           <w:tcPr>
-            <w:tcW w:w="600" w:type="pct"/>
+            <w:tcW w:w="642" w:type="pct"/>
             <w:shd w:val="clear" w:color="auto" w:fill="FFFFFF"/>
             <w:tcMar>
               <w:top w:w="100" w:type="dxa"/>
@@ -24977,7 +25163,7 @@
         </w:tc>
         <w:tc>
           <w:tcPr>
-            <w:tcW w:w="900" w:type="pct"/>
+            <w:tcW w:w="791" w:type="pct"/>
             <w:shd w:val="clear" w:color="auto" w:fill="FFFFFF"/>
             <w:tcMar>
               <w:top w:w="100" w:type="dxa"/>
@@ -25011,7 +25197,7 @@
         </w:tc>
         <w:tc>
           <w:tcPr>
-            <w:tcW w:w="1750" w:type="pct"/>
+            <w:tcW w:w="1642" w:type="pct"/>
             <w:shd w:val="clear" w:color="auto" w:fill="FFFFFF"/>
             <w:tcMar>
               <w:top w:w="100" w:type="dxa"/>
@@ -25048,6 +25234,7 @@
         <w:trPr>
           <w:divId w:val="631641576"/>
           <w:cantSplit/>
+          <w:jc w:val="center"/>
         </w:trPr>
         <w:tc>
           <w:tcPr>
@@ -25196,6 +25383,7 @@
         <w:trPr>
           <w:divId w:val="631641576"/>
           <w:cantSplit/>
+          <w:jc w:val="center"/>
         </w:trPr>
         <w:tc>
           <w:tcPr>
@@ -25344,6 +25532,7 @@
         <w:trPr>
           <w:divId w:val="631641576"/>
           <w:cantSplit/>
+          <w:jc w:val="center"/>
         </w:trPr>
         <w:tc>
           <w:tcPr>
@@ -25492,6 +25681,7 @@
         <w:trPr>
           <w:divId w:val="631641576"/>
           <w:cantSplit/>
+          <w:jc w:val="center"/>
         </w:trPr>
         <w:tc>
           <w:tcPr>
@@ -25640,6 +25830,7 @@
         <w:trPr>
           <w:divId w:val="631641576"/>
           <w:cantSplit/>
+          <w:jc w:val="center"/>
         </w:trPr>
         <w:tc>
           <w:tcPr>
@@ -25788,6 +25979,7 @@
         <w:trPr>
           <w:divId w:val="631641576"/>
           <w:cantSplit/>
+          <w:jc w:val="center"/>
         </w:trPr>
         <w:tc>
           <w:tcPr>
@@ -25936,6 +26128,7 @@
         <w:trPr>
           <w:divId w:val="631641576"/>
           <w:cantSplit/>
+          <w:jc w:val="center"/>
         </w:trPr>
         <w:tc>
           <w:tcPr>
@@ -26084,6 +26277,7 @@
         <w:trPr>
           <w:divId w:val="631641576"/>
           <w:cantSplit/>
+          <w:jc w:val="center"/>
         </w:trPr>
         <w:tc>
           <w:tcPr>
@@ -26232,6 +26426,7 @@
         <w:trPr>
           <w:divId w:val="631641576"/>
           <w:cantSplit/>
+          <w:jc w:val="center"/>
         </w:trPr>
         <w:tc>
           <w:tcPr>
@@ -26404,6 +26599,7 @@
     <w:tbl>
       <w:tblPr>
         <w:tblW w:w="5000" w:type="pct"/>
+        <w:jc w:val="center"/>
         <w:tblBorders>
           <w:top w:val="single" w:sz="4" w:space="0" w:color="000000"/>
           <w:left w:val="single" w:sz="4" w:space="0" w:color="000000"/>
@@ -26421,21 +26617,22 @@
         <w:tblLook w:val="04A0" w:firstRow="1" w:lastRow="0" w:firstColumn="1" w:lastColumn="0" w:noHBand="0" w:noVBand="1"/>
       </w:tblPr>
       <w:tblGrid>
-        <w:gridCol w:w="1666"/>
+        <w:gridCol w:w="1665"/>
         <w:gridCol w:w="1934"/>
-        <w:gridCol w:w="1200"/>
-        <w:gridCol w:w="1480"/>
-        <w:gridCol w:w="3070"/>
+        <w:gridCol w:w="1201"/>
+        <w:gridCol w:w="1479"/>
+        <w:gridCol w:w="3071"/>
       </w:tblGrid>
       <w:tr>
         <w:trPr>
           <w:divId w:val="631641576"/>
           <w:cantSplit/>
           <w:tblHeader/>
+          <w:jc w:val="center"/>
         </w:trPr>
         <w:tc>
           <w:tcPr>
-            <w:tcW w:w="1000" w:type="pct"/>
+            <w:tcW w:w="891" w:type="pct"/>
             <w:shd w:val="clear" w:color="auto" w:fill="FFFFFF"/>
             <w:tcMar>
               <w:top w:w="100" w:type="dxa"/>
@@ -26469,7 +26666,7 @@
         </w:tc>
         <w:tc>
           <w:tcPr>
-            <w:tcW w:w="750" w:type="pct"/>
+            <w:tcW w:w="1034" w:type="pct"/>
             <w:shd w:val="clear" w:color="auto" w:fill="FFFFFF"/>
             <w:tcMar>
               <w:top w:w="100" w:type="dxa"/>
@@ -26503,7 +26700,7 @@
         </w:tc>
         <w:tc>
           <w:tcPr>
-            <w:tcW w:w="600" w:type="pct"/>
+            <w:tcW w:w="642" w:type="pct"/>
             <w:shd w:val="clear" w:color="auto" w:fill="FFFFFF"/>
             <w:tcMar>
               <w:top w:w="100" w:type="dxa"/>
@@ -26537,7 +26734,7 @@
         </w:tc>
         <w:tc>
           <w:tcPr>
-            <w:tcW w:w="900" w:type="pct"/>
+            <w:tcW w:w="791" w:type="pct"/>
             <w:shd w:val="clear" w:color="auto" w:fill="FFFFFF"/>
             <w:tcMar>
               <w:top w:w="100" w:type="dxa"/>
@@ -26571,7 +26768,7 @@
         </w:tc>
         <w:tc>
           <w:tcPr>
-            <w:tcW w:w="1750" w:type="pct"/>
+            <w:tcW w:w="1642" w:type="pct"/>
             <w:shd w:val="clear" w:color="auto" w:fill="FFFFFF"/>
             <w:tcMar>
               <w:top w:w="100" w:type="dxa"/>
@@ -26608,6 +26805,7 @@
         <w:trPr>
           <w:divId w:val="631641576"/>
           <w:cantSplit/>
+          <w:jc w:val="center"/>
         </w:trPr>
         <w:tc>
           <w:tcPr>
@@ -26756,6 +26954,7 @@
         <w:trPr>
           <w:divId w:val="631641576"/>
           <w:cantSplit/>
+          <w:jc w:val="center"/>
         </w:trPr>
         <w:tc>
           <w:tcPr>
@@ -26904,6 +27103,7 @@
         <w:trPr>
           <w:divId w:val="631641576"/>
           <w:cantSplit/>
+          <w:jc w:val="center"/>
         </w:trPr>
         <w:tc>
           <w:tcPr>

</xml_diff>

<commit_message>
docs: insert complete centered data dictionary into WeBake-CHAPTER1-2.docx
</commit_message>
<xml_diff>
--- a/docs/data-dictionary.docx
+++ b/docs/data-dictionary.docx
@@ -362,6 +362,7 @@
         <w:trPr>
           <w:divId w:val="1414663851"/>
           <w:cantSplit/>
+          <w:trHeight w:val="1009"/>
           <w:jc w:val="center"/>
         </w:trPr>
         <w:tc>
@@ -411,12 +412,21 @@
                 <w:color w:val="000000"/>
               </w:rPr>
             </w:pPr>
-            <w:r>
-              <w:rPr>
-                <w:rFonts w:eastAsia="Times New Roman"/>
-                <w:color w:val="000000"/>
-              </w:rPr>
-              <w:t>VARCHAR(255)</w:t>
+            <w:proofErr w:type="gramStart"/>
+            <w:r>
+              <w:rPr>
+                <w:rFonts w:eastAsia="Times New Roman"/>
+                <w:color w:val="000000"/>
+              </w:rPr>
+              <w:t>VARCHAR(</w:t>
+            </w:r>
+            <w:proofErr w:type="gramEnd"/>
+            <w:r>
+              <w:rPr>
+                <w:rFonts w:eastAsia="Times New Roman"/>
+                <w:color w:val="000000"/>
+              </w:rPr>
+              <w:t>255)</w:t>
             </w:r>
           </w:p>
         </w:tc>
@@ -532,6 +542,7 @@
                 <w:color w:val="000000"/>
               </w:rPr>
             </w:pPr>
+            <w:proofErr w:type="spellStart"/>
             <w:r>
               <w:rPr>
                 <w:rFonts w:eastAsia="Times New Roman"/>
@@ -539,33 +550,43 @@
               </w:rPr>
               <w:t>password_hash</w:t>
             </w:r>
-          </w:p>
-        </w:tc>
-        <w:tc>
-          <w:tcPr>
-            <w:tcW w:w="0" w:type="auto"/>
-            <w:tcMar>
-              <w:top w:w="100" w:type="dxa"/>
-              <w:left w:w="120" w:type="dxa"/>
-              <w:bottom w:w="100" w:type="dxa"/>
-              <w:right w:w="120" w:type="dxa"/>
-            </w:tcMar>
-            <w:hideMark/>
-          </w:tcPr>
-          <w:p>
-            <w:pPr>
-              <w:spacing w:after="480"/>
-              <w:rPr>
-                <w:rFonts w:eastAsia="Times New Roman"/>
-                <w:color w:val="000000"/>
-              </w:rPr>
-            </w:pPr>
-            <w:r>
-              <w:rPr>
-                <w:rFonts w:eastAsia="Times New Roman"/>
-                <w:color w:val="000000"/>
-              </w:rPr>
-              <w:t>VARCHAR(255)</w:t>
+            <w:proofErr w:type="spellEnd"/>
+          </w:p>
+        </w:tc>
+        <w:tc>
+          <w:tcPr>
+            <w:tcW w:w="0" w:type="auto"/>
+            <w:tcMar>
+              <w:top w:w="100" w:type="dxa"/>
+              <w:left w:w="120" w:type="dxa"/>
+              <w:bottom w:w="100" w:type="dxa"/>
+              <w:right w:w="120" w:type="dxa"/>
+            </w:tcMar>
+            <w:hideMark/>
+          </w:tcPr>
+          <w:p>
+            <w:pPr>
+              <w:spacing w:after="480"/>
+              <w:rPr>
+                <w:rFonts w:eastAsia="Times New Roman"/>
+                <w:color w:val="000000"/>
+              </w:rPr>
+            </w:pPr>
+            <w:proofErr w:type="gramStart"/>
+            <w:r>
+              <w:rPr>
+                <w:rFonts w:eastAsia="Times New Roman"/>
+                <w:color w:val="000000"/>
+              </w:rPr>
+              <w:t>VARCHAR(</w:t>
+            </w:r>
+            <w:proofErr w:type="gramEnd"/>
+            <w:r>
+              <w:rPr>
+                <w:rFonts w:eastAsia="Times New Roman"/>
+                <w:color w:val="000000"/>
+              </w:rPr>
+              <w:t>255)</w:t>
             </w:r>
           </w:p>
         </w:tc>
@@ -618,13 +639,6 @@
                 <w:color w:val="000000"/>
               </w:rPr>
             </w:pPr>
-            <w:r>
-              <w:rPr>
-                <w:rFonts w:eastAsia="Times New Roman"/>
-                <w:color w:val="000000"/>
-              </w:rPr>
-              <w:t>—</w:t>
-            </w:r>
           </w:p>
         </w:tc>
         <w:tc>
@@ -681,6 +695,7 @@
                 <w:color w:val="000000"/>
               </w:rPr>
             </w:pPr>
+            <w:proofErr w:type="spellStart"/>
             <w:r>
               <w:rPr>
                 <w:rFonts w:eastAsia="Times New Roman"/>
@@ -688,33 +703,43 @@
               </w:rPr>
               <w:t>reset_token_hash</w:t>
             </w:r>
-          </w:p>
-        </w:tc>
-        <w:tc>
-          <w:tcPr>
-            <w:tcW w:w="0" w:type="auto"/>
-            <w:tcMar>
-              <w:top w:w="100" w:type="dxa"/>
-              <w:left w:w="120" w:type="dxa"/>
-              <w:bottom w:w="100" w:type="dxa"/>
-              <w:right w:w="120" w:type="dxa"/>
-            </w:tcMar>
-            <w:hideMark/>
-          </w:tcPr>
-          <w:p>
-            <w:pPr>
-              <w:spacing w:after="480"/>
-              <w:rPr>
-                <w:rFonts w:eastAsia="Times New Roman"/>
-                <w:color w:val="000000"/>
-              </w:rPr>
-            </w:pPr>
-            <w:r>
-              <w:rPr>
-                <w:rFonts w:eastAsia="Times New Roman"/>
-                <w:color w:val="000000"/>
-              </w:rPr>
-              <w:t>VARCHAR(255)</w:t>
+            <w:proofErr w:type="spellEnd"/>
+          </w:p>
+        </w:tc>
+        <w:tc>
+          <w:tcPr>
+            <w:tcW w:w="0" w:type="auto"/>
+            <w:tcMar>
+              <w:top w:w="100" w:type="dxa"/>
+              <w:left w:w="120" w:type="dxa"/>
+              <w:bottom w:w="100" w:type="dxa"/>
+              <w:right w:w="120" w:type="dxa"/>
+            </w:tcMar>
+            <w:hideMark/>
+          </w:tcPr>
+          <w:p>
+            <w:pPr>
+              <w:spacing w:after="480"/>
+              <w:rPr>
+                <w:rFonts w:eastAsia="Times New Roman"/>
+                <w:color w:val="000000"/>
+              </w:rPr>
+            </w:pPr>
+            <w:proofErr w:type="gramStart"/>
+            <w:r>
+              <w:rPr>
+                <w:rFonts w:eastAsia="Times New Roman"/>
+                <w:color w:val="000000"/>
+              </w:rPr>
+              <w:t>VARCHAR(</w:t>
+            </w:r>
+            <w:proofErr w:type="gramEnd"/>
+            <w:r>
+              <w:rPr>
+                <w:rFonts w:eastAsia="Times New Roman"/>
+                <w:color w:val="000000"/>
+              </w:rPr>
+              <w:t>255)</w:t>
             </w:r>
           </w:p>
         </w:tc>
@@ -767,13 +792,6 @@
                 <w:color w:val="000000"/>
               </w:rPr>
             </w:pPr>
-            <w:r>
-              <w:rPr>
-                <w:rFonts w:eastAsia="Times New Roman"/>
-                <w:color w:val="000000"/>
-              </w:rPr>
-              <w:t>—</w:t>
-            </w:r>
           </w:p>
         </w:tc>
         <w:tc>
@@ -830,6 +848,7 @@
                 <w:color w:val="000000"/>
               </w:rPr>
             </w:pPr>
+            <w:proofErr w:type="spellStart"/>
             <w:r>
               <w:rPr>
                 <w:rFonts w:eastAsia="Times New Roman"/>
@@ -837,6 +856,7 @@
               </w:rPr>
               <w:t>reset_expires_at</w:t>
             </w:r>
+            <w:proofErr w:type="spellEnd"/>
           </w:p>
         </w:tc>
         <w:tc>
@@ -916,13 +936,6 @@
                 <w:color w:val="000000"/>
               </w:rPr>
             </w:pPr>
-            <w:r>
-              <w:rPr>
-                <w:rFonts w:eastAsia="Times New Roman"/>
-                <w:color w:val="000000"/>
-              </w:rPr>
-              <w:t>—</w:t>
-            </w:r>
           </w:p>
         </w:tc>
         <w:tc>
@@ -979,6 +992,7 @@
                 <w:color w:val="000000"/>
               </w:rPr>
             </w:pPr>
+            <w:proofErr w:type="spellStart"/>
             <w:r>
               <w:rPr>
                 <w:rFonts w:eastAsia="Times New Roman"/>
@@ -986,6 +1000,7 @@
               </w:rPr>
               <w:t>created_at</w:t>
             </w:r>
+            <w:proofErr w:type="spellEnd"/>
           </w:p>
         </w:tc>
         <w:tc>
@@ -1065,13 +1080,6 @@
                 <w:color w:val="000000"/>
               </w:rPr>
             </w:pPr>
-            <w:r>
-              <w:rPr>
-                <w:rFonts w:eastAsia="Times New Roman"/>
-                <w:color w:val="000000"/>
-              </w:rPr>
-              <w:t>—</w:t>
-            </w:r>
           </w:p>
         </w:tc>
         <w:tc>
@@ -1128,6 +1136,7 @@
                 <w:color w:val="000000"/>
               </w:rPr>
             </w:pPr>
+            <w:proofErr w:type="spellStart"/>
             <w:r>
               <w:rPr>
                 <w:rFonts w:eastAsia="Times New Roman"/>
@@ -1135,6 +1144,7 @@
               </w:rPr>
               <w:t>updated_at</w:t>
             </w:r>
+            <w:proofErr w:type="spellEnd"/>
           </w:p>
         </w:tc>
         <w:tc>
@@ -1214,13 +1224,6 @@
                 <w:color w:val="000000"/>
               </w:rPr>
             </w:pPr>
-            <w:r>
-              <w:rPr>
-                <w:rFonts w:eastAsia="Times New Roman"/>
-                <w:color w:val="000000"/>
-              </w:rPr>
-              <w:t>—</w:t>
-            </w:r>
           </w:p>
         </w:tc>
         <w:tc>
@@ -1681,6 +1684,7 @@
                 <w:color w:val="000000"/>
               </w:rPr>
             </w:pPr>
+            <w:proofErr w:type="spellStart"/>
             <w:r>
               <w:rPr>
                 <w:rFonts w:eastAsia="Times New Roman"/>
@@ -1688,33 +1692,43 @@
               </w:rPr>
               <w:t>full_name</w:t>
             </w:r>
-          </w:p>
-        </w:tc>
-        <w:tc>
-          <w:tcPr>
-            <w:tcW w:w="0" w:type="auto"/>
-            <w:tcMar>
-              <w:top w:w="100" w:type="dxa"/>
-              <w:left w:w="120" w:type="dxa"/>
-              <w:bottom w:w="100" w:type="dxa"/>
-              <w:right w:w="120" w:type="dxa"/>
-            </w:tcMar>
-            <w:hideMark/>
-          </w:tcPr>
-          <w:p>
-            <w:pPr>
-              <w:spacing w:after="480"/>
-              <w:rPr>
-                <w:rFonts w:eastAsia="Times New Roman"/>
-                <w:color w:val="000000"/>
-              </w:rPr>
-            </w:pPr>
-            <w:r>
-              <w:rPr>
-                <w:rFonts w:eastAsia="Times New Roman"/>
-                <w:color w:val="000000"/>
-              </w:rPr>
-              <w:t>VARCHAR(255)</w:t>
+            <w:proofErr w:type="spellEnd"/>
+          </w:p>
+        </w:tc>
+        <w:tc>
+          <w:tcPr>
+            <w:tcW w:w="0" w:type="auto"/>
+            <w:tcMar>
+              <w:top w:w="100" w:type="dxa"/>
+              <w:left w:w="120" w:type="dxa"/>
+              <w:bottom w:w="100" w:type="dxa"/>
+              <w:right w:w="120" w:type="dxa"/>
+            </w:tcMar>
+            <w:hideMark/>
+          </w:tcPr>
+          <w:p>
+            <w:pPr>
+              <w:spacing w:after="480"/>
+              <w:rPr>
+                <w:rFonts w:eastAsia="Times New Roman"/>
+                <w:color w:val="000000"/>
+              </w:rPr>
+            </w:pPr>
+            <w:proofErr w:type="gramStart"/>
+            <w:r>
+              <w:rPr>
+                <w:rFonts w:eastAsia="Times New Roman"/>
+                <w:color w:val="000000"/>
+              </w:rPr>
+              <w:t>VARCHAR(</w:t>
+            </w:r>
+            <w:proofErr w:type="gramEnd"/>
+            <w:r>
+              <w:rPr>
+                <w:rFonts w:eastAsia="Times New Roman"/>
+                <w:color w:val="000000"/>
+              </w:rPr>
+              <w:t>255)</w:t>
             </w:r>
           </w:p>
         </w:tc>
@@ -1858,12 +1872,21 @@
                 <w:color w:val="000000"/>
               </w:rPr>
             </w:pPr>
-            <w:r>
-              <w:rPr>
-                <w:rFonts w:eastAsia="Times New Roman"/>
-                <w:color w:val="000000"/>
-              </w:rPr>
-              <w:t>VARCHAR(255)</w:t>
+            <w:proofErr w:type="gramStart"/>
+            <w:r>
+              <w:rPr>
+                <w:rFonts w:eastAsia="Times New Roman"/>
+                <w:color w:val="000000"/>
+              </w:rPr>
+              <w:t>VARCHAR(</w:t>
+            </w:r>
+            <w:proofErr w:type="gramEnd"/>
+            <w:r>
+              <w:rPr>
+                <w:rFonts w:eastAsia="Times New Roman"/>
+                <w:color w:val="000000"/>
+              </w:rPr>
+              <w:t>255)</w:t>
             </w:r>
           </w:p>
         </w:tc>
@@ -1979,6 +2002,7 @@
                 <w:color w:val="000000"/>
               </w:rPr>
             </w:pPr>
+            <w:proofErr w:type="spellStart"/>
             <w:r>
               <w:rPr>
                 <w:rFonts w:eastAsia="Times New Roman"/>
@@ -1986,6 +2010,7 @@
               </w:rPr>
               <w:t>email_verified_at</w:t>
             </w:r>
+            <w:proofErr w:type="spellEnd"/>
           </w:p>
         </w:tc>
         <w:tc>
@@ -2156,12 +2181,21 @@
                 <w:color w:val="000000"/>
               </w:rPr>
             </w:pPr>
-            <w:r>
-              <w:rPr>
-                <w:rFonts w:eastAsia="Times New Roman"/>
-                <w:color w:val="000000"/>
-              </w:rPr>
-              <w:t>VARCHAR(50)</w:t>
+            <w:proofErr w:type="gramStart"/>
+            <w:r>
+              <w:rPr>
+                <w:rFonts w:eastAsia="Times New Roman"/>
+                <w:color w:val="000000"/>
+              </w:rPr>
+              <w:t>VARCHAR(</w:t>
+            </w:r>
+            <w:proofErr w:type="gramEnd"/>
+            <w:r>
+              <w:rPr>
+                <w:rFonts w:eastAsia="Times New Roman"/>
+                <w:color w:val="000000"/>
+              </w:rPr>
+              <w:t>50)</w:t>
             </w:r>
           </w:p>
         </w:tc>
@@ -2426,6 +2460,7 @@
                 <w:color w:val="000000"/>
               </w:rPr>
             </w:pPr>
+            <w:proofErr w:type="spellStart"/>
             <w:r>
               <w:rPr>
                 <w:rFonts w:eastAsia="Times New Roman"/>
@@ -2433,33 +2468,43 @@
               </w:rPr>
               <w:t>password_hash</w:t>
             </w:r>
-          </w:p>
-        </w:tc>
-        <w:tc>
-          <w:tcPr>
-            <w:tcW w:w="0" w:type="auto"/>
-            <w:tcMar>
-              <w:top w:w="100" w:type="dxa"/>
-              <w:left w:w="120" w:type="dxa"/>
-              <w:bottom w:w="100" w:type="dxa"/>
-              <w:right w:w="120" w:type="dxa"/>
-            </w:tcMar>
-            <w:hideMark/>
-          </w:tcPr>
-          <w:p>
-            <w:pPr>
-              <w:spacing w:after="480"/>
-              <w:rPr>
-                <w:rFonts w:eastAsia="Times New Roman"/>
-                <w:color w:val="000000"/>
-              </w:rPr>
-            </w:pPr>
-            <w:r>
-              <w:rPr>
-                <w:rFonts w:eastAsia="Times New Roman"/>
-                <w:color w:val="000000"/>
-              </w:rPr>
-              <w:t>VARCHAR(255)</w:t>
+            <w:proofErr w:type="spellEnd"/>
+          </w:p>
+        </w:tc>
+        <w:tc>
+          <w:tcPr>
+            <w:tcW w:w="0" w:type="auto"/>
+            <w:tcMar>
+              <w:top w:w="100" w:type="dxa"/>
+              <w:left w:w="120" w:type="dxa"/>
+              <w:bottom w:w="100" w:type="dxa"/>
+              <w:right w:w="120" w:type="dxa"/>
+            </w:tcMar>
+            <w:hideMark/>
+          </w:tcPr>
+          <w:p>
+            <w:pPr>
+              <w:spacing w:after="480"/>
+              <w:rPr>
+                <w:rFonts w:eastAsia="Times New Roman"/>
+                <w:color w:val="000000"/>
+              </w:rPr>
+            </w:pPr>
+            <w:proofErr w:type="gramStart"/>
+            <w:r>
+              <w:rPr>
+                <w:rFonts w:eastAsia="Times New Roman"/>
+                <w:color w:val="000000"/>
+              </w:rPr>
+              <w:t>VARCHAR(</w:t>
+            </w:r>
+            <w:proofErr w:type="gramEnd"/>
+            <w:r>
+              <w:rPr>
+                <w:rFonts w:eastAsia="Times New Roman"/>
+                <w:color w:val="000000"/>
+              </w:rPr>
+              <w:t>255)</w:t>
             </w:r>
           </w:p>
         </w:tc>
@@ -2575,6 +2620,7 @@
                 <w:color w:val="000000"/>
               </w:rPr>
             </w:pPr>
+            <w:proofErr w:type="spellStart"/>
             <w:r>
               <w:rPr>
                 <w:rFonts w:eastAsia="Times New Roman"/>
@@ -2583,6 +2629,7 @@
               <w:lastRenderedPageBreak/>
               <w:t>created_at</w:t>
             </w:r>
+            <w:proofErr w:type="spellEnd"/>
           </w:p>
         </w:tc>
         <w:tc>
@@ -2725,6 +2772,7 @@
                 <w:color w:val="000000"/>
               </w:rPr>
             </w:pPr>
+            <w:proofErr w:type="spellStart"/>
             <w:r>
               <w:rPr>
                 <w:rFonts w:eastAsia="Times New Roman"/>
@@ -2732,6 +2780,7 @@
               </w:rPr>
               <w:t>updated_at</w:t>
             </w:r>
+            <w:proofErr w:type="spellEnd"/>
           </w:p>
         </w:tc>
         <w:tc>
@@ -3104,6 +3153,7 @@
                 <w:color w:val="000000"/>
               </w:rPr>
             </w:pPr>
+            <w:proofErr w:type="spellStart"/>
             <w:r>
               <w:rPr>
                 <w:rFonts w:eastAsia="Times New Roman"/>
@@ -3111,6 +3161,7 @@
               </w:rPr>
               <w:t>member_id</w:t>
             </w:r>
+            <w:proofErr w:type="spellEnd"/>
           </w:p>
         </w:tc>
         <w:tc>
@@ -3253,6 +3304,7 @@
                 <w:color w:val="000000"/>
               </w:rPr>
             </w:pPr>
+            <w:proofErr w:type="spellStart"/>
             <w:r>
               <w:rPr>
                 <w:rFonts w:eastAsia="Times New Roman"/>
@@ -3260,6 +3312,7 @@
               </w:rPr>
               <w:t>updated_at</w:t>
             </w:r>
+            <w:proofErr w:type="spellEnd"/>
           </w:p>
         </w:tc>
         <w:tc>
@@ -3400,8 +3453,20 @@
           <w:lang w:val="en"/>
         </w:rPr>
         <w:lastRenderedPageBreak/>
-        <w:t>Table 4. Cart_Items</w:t>
+        <w:t xml:space="preserve">Table 4. </w:t>
       </w:r>
+      <w:proofErr w:type="spellStart"/>
+      <w:r>
+        <w:rPr>
+          <w:rFonts w:eastAsia="Times New Roman"/>
+          <w:b/>
+          <w:bCs/>
+          <w:color w:val="000000"/>
+          <w:lang w:val="en"/>
+        </w:rPr>
+        <w:t>Cart_Items</w:t>
+      </w:r>
+      <w:proofErr w:type="spellEnd"/>
     </w:p>
     <w:tbl>
       <w:tblPr>
@@ -3633,6 +3698,7 @@
                 <w:color w:val="000000"/>
               </w:rPr>
             </w:pPr>
+            <w:proofErr w:type="spellStart"/>
             <w:r>
               <w:rPr>
                 <w:rFonts w:eastAsia="Times New Roman"/>
@@ -3640,6 +3706,7 @@
               </w:rPr>
               <w:t>member_id</w:t>
             </w:r>
+            <w:proofErr w:type="spellEnd"/>
           </w:p>
         </w:tc>
         <w:tc>
@@ -3752,7 +3819,23 @@
                 <w:rFonts w:eastAsia="Times New Roman"/>
                 <w:color w:val="000000"/>
               </w:rPr>
-              <w:t>References carts(member_id) identifying the active cart</w:t>
+              <w:t>References carts(</w:t>
+            </w:r>
+            <w:proofErr w:type="spellStart"/>
+            <w:r>
+              <w:rPr>
+                <w:rFonts w:eastAsia="Times New Roman"/>
+                <w:color w:val="000000"/>
+              </w:rPr>
+              <w:t>member_id</w:t>
+            </w:r>
+            <w:proofErr w:type="spellEnd"/>
+            <w:r>
+              <w:rPr>
+                <w:rFonts w:eastAsia="Times New Roman"/>
+                <w:color w:val="000000"/>
+              </w:rPr>
+              <w:t>) identifying the active cart</w:t>
             </w:r>
           </w:p>
         </w:tc>
@@ -3782,6 +3865,7 @@
                 <w:color w:val="000000"/>
               </w:rPr>
             </w:pPr>
+            <w:proofErr w:type="spellStart"/>
             <w:r>
               <w:rPr>
                 <w:rFonts w:eastAsia="Times New Roman"/>
@@ -3789,6 +3873,7 @@
               </w:rPr>
               <w:t>product_id</w:t>
             </w:r>
+            <w:proofErr w:type="spellEnd"/>
           </w:p>
         </w:tc>
         <w:tc>
@@ -4488,12 +4573,21 @@
                 <w:color w:val="000000"/>
               </w:rPr>
             </w:pPr>
-            <w:r>
-              <w:rPr>
-                <w:rFonts w:eastAsia="Times New Roman"/>
-                <w:color w:val="000000"/>
-              </w:rPr>
-              <w:t>VARCHAR(255)</w:t>
+            <w:proofErr w:type="gramStart"/>
+            <w:r>
+              <w:rPr>
+                <w:rFonts w:eastAsia="Times New Roman"/>
+                <w:color w:val="000000"/>
+              </w:rPr>
+              <w:t>VARCHAR(</w:t>
+            </w:r>
+            <w:proofErr w:type="gramEnd"/>
+            <w:r>
+              <w:rPr>
+                <w:rFonts w:eastAsia="Times New Roman"/>
+                <w:color w:val="000000"/>
+              </w:rPr>
+              <w:t>255)</w:t>
             </w:r>
           </w:p>
         </w:tc>
@@ -4579,7 +4673,23 @@
                 <w:rFonts w:eastAsia="Times New Roman"/>
                 <w:color w:val="000000"/>
               </w:rPr>
-              <w:t>Official product name (e.g., Mamon, Otap, Butter Toast)</w:t>
+              <w:t xml:space="preserve">Official product name (e.g., Mamon, </w:t>
+            </w:r>
+            <w:proofErr w:type="spellStart"/>
+            <w:r>
+              <w:rPr>
+                <w:rFonts w:eastAsia="Times New Roman"/>
+                <w:color w:val="000000"/>
+              </w:rPr>
+              <w:t>Otap</w:t>
+            </w:r>
+            <w:proofErr w:type="spellEnd"/>
+            <w:r>
+              <w:rPr>
+                <w:rFonts w:eastAsia="Times New Roman"/>
+                <w:color w:val="000000"/>
+              </w:rPr>
+              <w:t>, Butter Toast)</w:t>
             </w:r>
           </w:p>
         </w:tc>
@@ -4758,6 +4868,7 @@
                 <w:color w:val="000000"/>
               </w:rPr>
             </w:pPr>
+            <w:proofErr w:type="spellStart"/>
             <w:r>
               <w:rPr>
                 <w:rFonts w:eastAsia="Times New Roman"/>
@@ -4765,6 +4876,7 @@
               </w:rPr>
               <w:t>price_bundle_centavos</w:t>
             </w:r>
+            <w:proofErr w:type="spellEnd"/>
           </w:p>
         </w:tc>
         <w:tc>
@@ -4907,6 +5019,7 @@
                 <w:color w:val="000000"/>
               </w:rPr>
             </w:pPr>
+            <w:proofErr w:type="spellStart"/>
             <w:r>
               <w:rPr>
                 <w:rFonts w:eastAsia="Times New Roman"/>
@@ -4914,6 +5027,7 @@
               </w:rPr>
               <w:t>pieces_per_bundle</w:t>
             </w:r>
+            <w:proofErr w:type="spellEnd"/>
           </w:p>
         </w:tc>
         <w:tc>
@@ -5056,6 +5170,7 @@
                 <w:color w:val="000000"/>
               </w:rPr>
             </w:pPr>
+            <w:proofErr w:type="spellStart"/>
             <w:r>
               <w:rPr>
                 <w:rFonts w:eastAsia="Times New Roman"/>
@@ -5063,6 +5178,7 @@
               </w:rPr>
               <w:t>piece_price_centavos</w:t>
             </w:r>
+            <w:proofErr w:type="spellEnd"/>
           </w:p>
         </w:tc>
         <w:tc>
@@ -5205,6 +5321,7 @@
                 <w:color w:val="000000"/>
               </w:rPr>
             </w:pPr>
+            <w:proofErr w:type="spellStart"/>
             <w:r>
               <w:rPr>
                 <w:rFonts w:eastAsia="Times New Roman"/>
@@ -5212,6 +5329,7 @@
               </w:rPr>
               <w:t>stock_pieces</w:t>
             </w:r>
+            <w:proofErr w:type="spellEnd"/>
           </w:p>
         </w:tc>
         <w:tc>
@@ -5354,6 +5472,7 @@
                 <w:color w:val="000000"/>
               </w:rPr>
             </w:pPr>
+            <w:proofErr w:type="spellStart"/>
             <w:r>
               <w:rPr>
                 <w:rFonts w:eastAsia="Times New Roman"/>
@@ -5361,6 +5480,7 @@
               </w:rPr>
               <w:t>low_stock_threshold_pieces</w:t>
             </w:r>
+            <w:proofErr w:type="spellEnd"/>
           </w:p>
         </w:tc>
         <w:tc>
@@ -5503,6 +5623,7 @@
                 <w:color w:val="000000"/>
               </w:rPr>
             </w:pPr>
+            <w:proofErr w:type="spellStart"/>
             <w:r>
               <w:rPr>
                 <w:rFonts w:eastAsia="Times New Roman"/>
@@ -5511,6 +5632,7 @@
               <w:lastRenderedPageBreak/>
               <w:t>image_url</w:t>
             </w:r>
+            <w:proofErr w:type="spellEnd"/>
           </w:p>
         </w:tc>
         <w:tc>
@@ -5653,6 +5775,7 @@
                 <w:color w:val="000000"/>
               </w:rPr>
             </w:pPr>
+            <w:proofErr w:type="spellStart"/>
             <w:r>
               <w:rPr>
                 <w:rFonts w:eastAsia="Times New Roman"/>
@@ -5660,6 +5783,7 @@
               </w:rPr>
               <w:t>is_archived</w:t>
             </w:r>
+            <w:proofErr w:type="spellEnd"/>
           </w:p>
         </w:tc>
         <w:tc>
@@ -5802,6 +5926,7 @@
                 <w:color w:val="000000"/>
               </w:rPr>
             </w:pPr>
+            <w:proofErr w:type="spellStart"/>
             <w:r>
               <w:rPr>
                 <w:rFonts w:eastAsia="Times New Roman"/>
@@ -5809,6 +5934,7 @@
               </w:rPr>
               <w:t>created_at</w:t>
             </w:r>
+            <w:proofErr w:type="spellEnd"/>
           </w:p>
         </w:tc>
         <w:tc>
@@ -5951,6 +6077,7 @@
                 <w:color w:val="000000"/>
               </w:rPr>
             </w:pPr>
+            <w:proofErr w:type="spellStart"/>
             <w:r>
               <w:rPr>
                 <w:rFonts w:eastAsia="Times New Roman"/>
@@ -5958,6 +6085,7 @@
               </w:rPr>
               <w:t>updated_at</w:t>
             </w:r>
+            <w:proofErr w:type="spellEnd"/>
           </w:p>
         </w:tc>
         <w:tc>
@@ -6479,6 +6607,7 @@
                 <w:color w:val="000000"/>
               </w:rPr>
             </w:pPr>
+            <w:proofErr w:type="spellStart"/>
             <w:r>
               <w:rPr>
                 <w:rFonts w:eastAsia="Times New Roman"/>
@@ -6487,33 +6616,43 @@
               <w:lastRenderedPageBreak/>
               <w:t>order_code</w:t>
             </w:r>
-          </w:p>
-        </w:tc>
-        <w:tc>
-          <w:tcPr>
-            <w:tcW w:w="0" w:type="auto"/>
-            <w:tcMar>
-              <w:top w:w="100" w:type="dxa"/>
-              <w:left w:w="120" w:type="dxa"/>
-              <w:bottom w:w="100" w:type="dxa"/>
-              <w:right w:w="120" w:type="dxa"/>
-            </w:tcMar>
-            <w:hideMark/>
-          </w:tcPr>
-          <w:p>
-            <w:pPr>
-              <w:spacing w:after="480"/>
-              <w:rPr>
-                <w:rFonts w:eastAsia="Times New Roman"/>
-                <w:color w:val="000000"/>
-              </w:rPr>
-            </w:pPr>
-            <w:r>
-              <w:rPr>
-                <w:rFonts w:eastAsia="Times New Roman"/>
-                <w:color w:val="000000"/>
-              </w:rPr>
-              <w:t>VARCHAR(50)</w:t>
+            <w:proofErr w:type="spellEnd"/>
+          </w:p>
+        </w:tc>
+        <w:tc>
+          <w:tcPr>
+            <w:tcW w:w="0" w:type="auto"/>
+            <w:tcMar>
+              <w:top w:w="100" w:type="dxa"/>
+              <w:left w:w="120" w:type="dxa"/>
+              <w:bottom w:w="100" w:type="dxa"/>
+              <w:right w:w="120" w:type="dxa"/>
+            </w:tcMar>
+            <w:hideMark/>
+          </w:tcPr>
+          <w:p>
+            <w:pPr>
+              <w:spacing w:after="480"/>
+              <w:rPr>
+                <w:rFonts w:eastAsia="Times New Roman"/>
+                <w:color w:val="000000"/>
+              </w:rPr>
+            </w:pPr>
+            <w:proofErr w:type="gramStart"/>
+            <w:r>
+              <w:rPr>
+                <w:rFonts w:eastAsia="Times New Roman"/>
+                <w:color w:val="000000"/>
+              </w:rPr>
+              <w:t>VARCHAR(</w:t>
+            </w:r>
+            <w:proofErr w:type="gramEnd"/>
+            <w:r>
+              <w:rPr>
+                <w:rFonts w:eastAsia="Times New Roman"/>
+                <w:color w:val="000000"/>
+              </w:rPr>
+              <w:t>50)</w:t>
             </w:r>
           </w:p>
         </w:tc>
@@ -6629,6 +6768,7 @@
                 <w:color w:val="000000"/>
               </w:rPr>
             </w:pPr>
+            <w:proofErr w:type="spellStart"/>
             <w:r>
               <w:rPr>
                 <w:rFonts w:eastAsia="Times New Roman"/>
@@ -6636,6 +6776,7 @@
               </w:rPr>
               <w:t>member_id</w:t>
             </w:r>
+            <w:proofErr w:type="spellEnd"/>
           </w:p>
         </w:tc>
         <w:tc>
@@ -6778,6 +6919,7 @@
                 <w:color w:val="000000"/>
               </w:rPr>
             </w:pPr>
+            <w:proofErr w:type="spellStart"/>
             <w:r>
               <w:rPr>
                 <w:rFonts w:eastAsia="Times New Roman"/>
@@ -6785,33 +6927,43 @@
               </w:rPr>
               <w:t>customer_name</w:t>
             </w:r>
-          </w:p>
-        </w:tc>
-        <w:tc>
-          <w:tcPr>
-            <w:tcW w:w="0" w:type="auto"/>
-            <w:tcMar>
-              <w:top w:w="100" w:type="dxa"/>
-              <w:left w:w="120" w:type="dxa"/>
-              <w:bottom w:w="100" w:type="dxa"/>
-              <w:right w:w="120" w:type="dxa"/>
-            </w:tcMar>
-            <w:hideMark/>
-          </w:tcPr>
-          <w:p>
-            <w:pPr>
-              <w:spacing w:after="480"/>
-              <w:rPr>
-                <w:rFonts w:eastAsia="Times New Roman"/>
-                <w:color w:val="000000"/>
-              </w:rPr>
-            </w:pPr>
-            <w:r>
-              <w:rPr>
-                <w:rFonts w:eastAsia="Times New Roman"/>
-                <w:color w:val="000000"/>
-              </w:rPr>
-              <w:t>VARCHAR(255)</w:t>
+            <w:proofErr w:type="spellEnd"/>
+          </w:p>
+        </w:tc>
+        <w:tc>
+          <w:tcPr>
+            <w:tcW w:w="0" w:type="auto"/>
+            <w:tcMar>
+              <w:top w:w="100" w:type="dxa"/>
+              <w:left w:w="120" w:type="dxa"/>
+              <w:bottom w:w="100" w:type="dxa"/>
+              <w:right w:w="120" w:type="dxa"/>
+            </w:tcMar>
+            <w:hideMark/>
+          </w:tcPr>
+          <w:p>
+            <w:pPr>
+              <w:spacing w:after="480"/>
+              <w:rPr>
+                <w:rFonts w:eastAsia="Times New Roman"/>
+                <w:color w:val="000000"/>
+              </w:rPr>
+            </w:pPr>
+            <w:proofErr w:type="gramStart"/>
+            <w:r>
+              <w:rPr>
+                <w:rFonts w:eastAsia="Times New Roman"/>
+                <w:color w:val="000000"/>
+              </w:rPr>
+              <w:t>VARCHAR(</w:t>
+            </w:r>
+            <w:proofErr w:type="gramEnd"/>
+            <w:r>
+              <w:rPr>
+                <w:rFonts w:eastAsia="Times New Roman"/>
+                <w:color w:val="000000"/>
+              </w:rPr>
+              <w:t>255)</w:t>
             </w:r>
           </w:p>
         </w:tc>
@@ -6927,6 +7079,7 @@
                 <w:color w:val="000000"/>
               </w:rPr>
             </w:pPr>
+            <w:proofErr w:type="spellStart"/>
             <w:r>
               <w:rPr>
                 <w:rFonts w:eastAsia="Times New Roman"/>
@@ -6934,33 +7087,43 @@
               </w:rPr>
               <w:t>customer_email</w:t>
             </w:r>
-          </w:p>
-        </w:tc>
-        <w:tc>
-          <w:tcPr>
-            <w:tcW w:w="0" w:type="auto"/>
-            <w:tcMar>
-              <w:top w:w="100" w:type="dxa"/>
-              <w:left w:w="120" w:type="dxa"/>
-              <w:bottom w:w="100" w:type="dxa"/>
-              <w:right w:w="120" w:type="dxa"/>
-            </w:tcMar>
-            <w:hideMark/>
-          </w:tcPr>
-          <w:p>
-            <w:pPr>
-              <w:spacing w:after="480"/>
-              <w:rPr>
-                <w:rFonts w:eastAsia="Times New Roman"/>
-                <w:color w:val="000000"/>
-              </w:rPr>
-            </w:pPr>
-            <w:r>
-              <w:rPr>
-                <w:rFonts w:eastAsia="Times New Roman"/>
-                <w:color w:val="000000"/>
-              </w:rPr>
-              <w:t>VARCHAR(255)</w:t>
+            <w:proofErr w:type="spellEnd"/>
+          </w:p>
+        </w:tc>
+        <w:tc>
+          <w:tcPr>
+            <w:tcW w:w="0" w:type="auto"/>
+            <w:tcMar>
+              <w:top w:w="100" w:type="dxa"/>
+              <w:left w:w="120" w:type="dxa"/>
+              <w:bottom w:w="100" w:type="dxa"/>
+              <w:right w:w="120" w:type="dxa"/>
+            </w:tcMar>
+            <w:hideMark/>
+          </w:tcPr>
+          <w:p>
+            <w:pPr>
+              <w:spacing w:after="480"/>
+              <w:rPr>
+                <w:rFonts w:eastAsia="Times New Roman"/>
+                <w:color w:val="000000"/>
+              </w:rPr>
+            </w:pPr>
+            <w:proofErr w:type="gramStart"/>
+            <w:r>
+              <w:rPr>
+                <w:rFonts w:eastAsia="Times New Roman"/>
+                <w:color w:val="000000"/>
+              </w:rPr>
+              <w:t>VARCHAR(</w:t>
+            </w:r>
+            <w:proofErr w:type="gramEnd"/>
+            <w:r>
+              <w:rPr>
+                <w:rFonts w:eastAsia="Times New Roman"/>
+                <w:color w:val="000000"/>
+              </w:rPr>
+              <w:t>255)</w:t>
             </w:r>
           </w:p>
         </w:tc>
@@ -7076,6 +7239,7 @@
                 <w:color w:val="000000"/>
               </w:rPr>
             </w:pPr>
+            <w:proofErr w:type="spellStart"/>
             <w:r>
               <w:rPr>
                 <w:rFonts w:eastAsia="Times New Roman"/>
@@ -7083,33 +7247,43 @@
               </w:rPr>
               <w:t>customer_contact</w:t>
             </w:r>
-          </w:p>
-        </w:tc>
-        <w:tc>
-          <w:tcPr>
-            <w:tcW w:w="0" w:type="auto"/>
-            <w:tcMar>
-              <w:top w:w="100" w:type="dxa"/>
-              <w:left w:w="120" w:type="dxa"/>
-              <w:bottom w:w="100" w:type="dxa"/>
-              <w:right w:w="120" w:type="dxa"/>
-            </w:tcMar>
-            <w:hideMark/>
-          </w:tcPr>
-          <w:p>
-            <w:pPr>
-              <w:spacing w:after="480"/>
-              <w:rPr>
-                <w:rFonts w:eastAsia="Times New Roman"/>
-                <w:color w:val="000000"/>
-              </w:rPr>
-            </w:pPr>
-            <w:r>
-              <w:rPr>
-                <w:rFonts w:eastAsia="Times New Roman"/>
-                <w:color w:val="000000"/>
-              </w:rPr>
-              <w:t>VARCHAR(50)</w:t>
+            <w:proofErr w:type="spellEnd"/>
+          </w:p>
+        </w:tc>
+        <w:tc>
+          <w:tcPr>
+            <w:tcW w:w="0" w:type="auto"/>
+            <w:tcMar>
+              <w:top w:w="100" w:type="dxa"/>
+              <w:left w:w="120" w:type="dxa"/>
+              <w:bottom w:w="100" w:type="dxa"/>
+              <w:right w:w="120" w:type="dxa"/>
+            </w:tcMar>
+            <w:hideMark/>
+          </w:tcPr>
+          <w:p>
+            <w:pPr>
+              <w:spacing w:after="480"/>
+              <w:rPr>
+                <w:rFonts w:eastAsia="Times New Roman"/>
+                <w:color w:val="000000"/>
+              </w:rPr>
+            </w:pPr>
+            <w:proofErr w:type="gramStart"/>
+            <w:r>
+              <w:rPr>
+                <w:rFonts w:eastAsia="Times New Roman"/>
+                <w:color w:val="000000"/>
+              </w:rPr>
+              <w:t>VARCHAR(</w:t>
+            </w:r>
+            <w:proofErr w:type="gramEnd"/>
+            <w:r>
+              <w:rPr>
+                <w:rFonts w:eastAsia="Times New Roman"/>
+                <w:color w:val="000000"/>
+              </w:rPr>
+              <w:t>50)</w:t>
             </w:r>
           </w:p>
         </w:tc>
@@ -7225,6 +7399,7 @@
                 <w:color w:val="000000"/>
               </w:rPr>
             </w:pPr>
+            <w:proofErr w:type="spellStart"/>
             <w:r>
               <w:rPr>
                 <w:rFonts w:eastAsia="Times New Roman"/>
@@ -7232,6 +7407,7 @@
               </w:rPr>
               <w:t>delivery_address</w:t>
             </w:r>
+            <w:proofErr w:type="spellEnd"/>
           </w:p>
         </w:tc>
         <w:tc>
@@ -7374,6 +7550,7 @@
                 <w:color w:val="000000"/>
               </w:rPr>
             </w:pPr>
+            <w:proofErr w:type="spellStart"/>
             <w:r>
               <w:rPr>
                 <w:rFonts w:eastAsia="Times New Roman"/>
@@ -7381,6 +7558,7 @@
               </w:rPr>
               <w:t>subtotal_centavos</w:t>
             </w:r>
+            <w:proofErr w:type="spellEnd"/>
           </w:p>
         </w:tc>
         <w:tc>
@@ -7523,6 +7701,7 @@
                 <w:color w:val="000000"/>
               </w:rPr>
             </w:pPr>
+            <w:proofErr w:type="spellStart"/>
             <w:r>
               <w:rPr>
                 <w:rFonts w:eastAsia="Times New Roman"/>
@@ -7531,6 +7710,7 @@
               <w:lastRenderedPageBreak/>
               <w:t>total_centavos</w:t>
             </w:r>
+            <w:proofErr w:type="spellEnd"/>
           </w:p>
         </w:tc>
         <w:tc>
@@ -7673,6 +7853,7 @@
                 <w:color w:val="000000"/>
               </w:rPr>
             </w:pPr>
+            <w:proofErr w:type="spellStart"/>
             <w:r>
               <w:rPr>
                 <w:rFonts w:eastAsia="Times New Roman"/>
@@ -7680,6 +7861,7 @@
               </w:rPr>
               <w:t>downpayment_centavos</w:t>
             </w:r>
+            <w:proofErr w:type="spellEnd"/>
           </w:p>
         </w:tc>
         <w:tc>
@@ -7822,6 +8004,7 @@
                 <w:color w:val="000000"/>
               </w:rPr>
             </w:pPr>
+            <w:proofErr w:type="spellStart"/>
             <w:r>
               <w:rPr>
                 <w:rFonts w:eastAsia="Times New Roman"/>
@@ -7829,6 +8012,7 @@
               </w:rPr>
               <w:t>downpayment_paid_centavos</w:t>
             </w:r>
+            <w:proofErr w:type="spellEnd"/>
           </w:p>
         </w:tc>
         <w:tc>
@@ -7971,6 +8155,7 @@
                 <w:color w:val="000000"/>
               </w:rPr>
             </w:pPr>
+            <w:proofErr w:type="spellStart"/>
             <w:r>
               <w:rPr>
                 <w:rFonts w:eastAsia="Times New Roman"/>
@@ -7978,6 +8163,7 @@
               </w:rPr>
               <w:t>balance_due_centavos</w:t>
             </w:r>
+            <w:proofErr w:type="spellEnd"/>
           </w:p>
         </w:tc>
         <w:tc>
@@ -8120,6 +8306,7 @@
                 <w:color w:val="000000"/>
               </w:rPr>
             </w:pPr>
+            <w:proofErr w:type="spellStart"/>
             <w:r>
               <w:rPr>
                 <w:rFonts w:eastAsia="Times New Roman"/>
@@ -8127,33 +8314,43 @@
               </w:rPr>
               <w:t>payment_method</w:t>
             </w:r>
-          </w:p>
-        </w:tc>
-        <w:tc>
-          <w:tcPr>
-            <w:tcW w:w="0" w:type="auto"/>
-            <w:tcMar>
-              <w:top w:w="100" w:type="dxa"/>
-              <w:left w:w="120" w:type="dxa"/>
-              <w:bottom w:w="100" w:type="dxa"/>
-              <w:right w:w="120" w:type="dxa"/>
-            </w:tcMar>
-            <w:hideMark/>
-          </w:tcPr>
-          <w:p>
-            <w:pPr>
-              <w:spacing w:after="480"/>
-              <w:rPr>
-                <w:rFonts w:eastAsia="Times New Roman"/>
-                <w:color w:val="000000"/>
-              </w:rPr>
-            </w:pPr>
-            <w:r>
-              <w:rPr>
-                <w:rFonts w:eastAsia="Times New Roman"/>
-                <w:color w:val="000000"/>
-              </w:rPr>
-              <w:t>VARCHAR(20)</w:t>
+            <w:proofErr w:type="spellEnd"/>
+          </w:p>
+        </w:tc>
+        <w:tc>
+          <w:tcPr>
+            <w:tcW w:w="0" w:type="auto"/>
+            <w:tcMar>
+              <w:top w:w="100" w:type="dxa"/>
+              <w:left w:w="120" w:type="dxa"/>
+              <w:bottom w:w="100" w:type="dxa"/>
+              <w:right w:w="120" w:type="dxa"/>
+            </w:tcMar>
+            <w:hideMark/>
+          </w:tcPr>
+          <w:p>
+            <w:pPr>
+              <w:spacing w:after="480"/>
+              <w:rPr>
+                <w:rFonts w:eastAsia="Times New Roman"/>
+                <w:color w:val="000000"/>
+              </w:rPr>
+            </w:pPr>
+            <w:proofErr w:type="gramStart"/>
+            <w:r>
+              <w:rPr>
+                <w:rFonts w:eastAsia="Times New Roman"/>
+                <w:color w:val="000000"/>
+              </w:rPr>
+              <w:t>VARCHAR(</w:t>
+            </w:r>
+            <w:proofErr w:type="gramEnd"/>
+            <w:r>
+              <w:rPr>
+                <w:rFonts w:eastAsia="Times New Roman"/>
+                <w:color w:val="000000"/>
+              </w:rPr>
+              <w:t>20)</w:t>
             </w:r>
           </w:p>
         </w:tc>
@@ -8297,12 +8494,21 @@
                 <w:color w:val="000000"/>
               </w:rPr>
             </w:pPr>
-            <w:r>
-              <w:rPr>
-                <w:rFonts w:eastAsia="Times New Roman"/>
-                <w:color w:val="000000"/>
-              </w:rPr>
-              <w:t>VARCHAR(50)</w:t>
+            <w:proofErr w:type="gramStart"/>
+            <w:r>
+              <w:rPr>
+                <w:rFonts w:eastAsia="Times New Roman"/>
+                <w:color w:val="000000"/>
+              </w:rPr>
+              <w:t>VARCHAR(</w:t>
+            </w:r>
+            <w:proofErr w:type="gramEnd"/>
+            <w:r>
+              <w:rPr>
+                <w:rFonts w:eastAsia="Times New Roman"/>
+                <w:color w:val="000000"/>
+              </w:rPr>
+              <w:t>50)</w:t>
             </w:r>
           </w:p>
         </w:tc>
@@ -8418,6 +8624,7 @@
                 <w:color w:val="000000"/>
               </w:rPr>
             </w:pPr>
+            <w:proofErr w:type="spellStart"/>
             <w:r>
               <w:rPr>
                 <w:rFonts w:eastAsia="Times New Roman"/>
@@ -8425,6 +8632,7 @@
               </w:rPr>
               <w:t>rejection_reason</w:t>
             </w:r>
+            <w:proofErr w:type="spellEnd"/>
           </w:p>
         </w:tc>
         <w:tc>
@@ -8567,6 +8775,7 @@
                 <w:color w:val="000000"/>
               </w:rPr>
             </w:pPr>
+            <w:proofErr w:type="spellStart"/>
             <w:r>
               <w:rPr>
                 <w:rFonts w:eastAsia="Times New Roman"/>
@@ -8575,6 +8784,7 @@
               <w:lastRenderedPageBreak/>
               <w:t>resubmit_count</w:t>
             </w:r>
+            <w:proofErr w:type="spellEnd"/>
           </w:p>
         </w:tc>
         <w:tc>
@@ -8717,6 +8927,7 @@
                 <w:color w:val="000000"/>
               </w:rPr>
             </w:pPr>
+            <w:proofErr w:type="spellStart"/>
             <w:r>
               <w:rPr>
                 <w:rFonts w:eastAsia="Times New Roman"/>
@@ -8724,33 +8935,43 @@
               </w:rPr>
               <w:t>idempotency_key</w:t>
             </w:r>
-          </w:p>
-        </w:tc>
-        <w:tc>
-          <w:tcPr>
-            <w:tcW w:w="0" w:type="auto"/>
-            <w:tcMar>
-              <w:top w:w="100" w:type="dxa"/>
-              <w:left w:w="120" w:type="dxa"/>
-              <w:bottom w:w="100" w:type="dxa"/>
-              <w:right w:w="120" w:type="dxa"/>
-            </w:tcMar>
-            <w:hideMark/>
-          </w:tcPr>
-          <w:p>
-            <w:pPr>
-              <w:spacing w:after="480"/>
-              <w:rPr>
-                <w:rFonts w:eastAsia="Times New Roman"/>
-                <w:color w:val="000000"/>
-              </w:rPr>
-            </w:pPr>
-            <w:r>
-              <w:rPr>
-                <w:rFonts w:eastAsia="Times New Roman"/>
-                <w:color w:val="000000"/>
-              </w:rPr>
-              <w:t>VARCHAR(255)</w:t>
+            <w:proofErr w:type="spellEnd"/>
+          </w:p>
+        </w:tc>
+        <w:tc>
+          <w:tcPr>
+            <w:tcW w:w="0" w:type="auto"/>
+            <w:tcMar>
+              <w:top w:w="100" w:type="dxa"/>
+              <w:left w:w="120" w:type="dxa"/>
+              <w:bottom w:w="100" w:type="dxa"/>
+              <w:right w:w="120" w:type="dxa"/>
+            </w:tcMar>
+            <w:hideMark/>
+          </w:tcPr>
+          <w:p>
+            <w:pPr>
+              <w:spacing w:after="480"/>
+              <w:rPr>
+                <w:rFonts w:eastAsia="Times New Roman"/>
+                <w:color w:val="000000"/>
+              </w:rPr>
+            </w:pPr>
+            <w:proofErr w:type="gramStart"/>
+            <w:r>
+              <w:rPr>
+                <w:rFonts w:eastAsia="Times New Roman"/>
+                <w:color w:val="000000"/>
+              </w:rPr>
+              <w:t>VARCHAR(</w:t>
+            </w:r>
+            <w:proofErr w:type="gramEnd"/>
+            <w:r>
+              <w:rPr>
+                <w:rFonts w:eastAsia="Times New Roman"/>
+                <w:color w:val="000000"/>
+              </w:rPr>
+              <w:t>255)</w:t>
             </w:r>
           </w:p>
         </w:tc>
@@ -8866,6 +9087,7 @@
                 <w:color w:val="000000"/>
               </w:rPr>
             </w:pPr>
+            <w:proofErr w:type="spellStart"/>
             <w:r>
               <w:rPr>
                 <w:rFonts w:eastAsia="Times New Roman"/>
@@ -8873,6 +9095,7 @@
               </w:rPr>
               <w:t>created_at</w:t>
             </w:r>
+            <w:proofErr w:type="spellEnd"/>
           </w:p>
         </w:tc>
         <w:tc>
@@ -9015,6 +9238,7 @@
                 <w:color w:val="000000"/>
               </w:rPr>
             </w:pPr>
+            <w:proofErr w:type="spellStart"/>
             <w:r>
               <w:rPr>
                 <w:rFonts w:eastAsia="Times New Roman"/>
@@ -9022,6 +9246,7 @@
               </w:rPr>
               <w:t>updated_at</w:t>
             </w:r>
+            <w:proofErr w:type="spellEnd"/>
           </w:p>
         </w:tc>
         <w:tc>
@@ -9161,8 +9386,20 @@
           <w:color w:val="000000"/>
           <w:lang w:val="en"/>
         </w:rPr>
-        <w:t>Table 7. Order_Items</w:t>
+        <w:t xml:space="preserve">Table 7. </w:t>
       </w:r>
+      <w:proofErr w:type="spellStart"/>
+      <w:r>
+        <w:rPr>
+          <w:rFonts w:eastAsia="Times New Roman"/>
+          <w:b/>
+          <w:bCs/>
+          <w:color w:val="000000"/>
+          <w:lang w:val="en"/>
+        </w:rPr>
+        <w:t>Order_Items</w:t>
+      </w:r>
+      <w:proofErr w:type="spellEnd"/>
     </w:p>
     <w:tbl>
       <w:tblPr>
@@ -9543,6 +9780,7 @@
                 <w:color w:val="000000"/>
               </w:rPr>
             </w:pPr>
+            <w:proofErr w:type="spellStart"/>
             <w:r>
               <w:rPr>
                 <w:rFonts w:eastAsia="Times New Roman"/>
@@ -9551,6 +9789,7 @@
               <w:lastRenderedPageBreak/>
               <w:t>order_id</w:t>
             </w:r>
+            <w:proofErr w:type="spellEnd"/>
           </w:p>
         </w:tc>
         <w:tc>
@@ -9693,6 +9932,7 @@
                 <w:color w:val="000000"/>
               </w:rPr>
             </w:pPr>
+            <w:proofErr w:type="spellStart"/>
             <w:r>
               <w:rPr>
                 <w:rFonts w:eastAsia="Times New Roman"/>
@@ -9700,6 +9940,7 @@
               </w:rPr>
               <w:t>product_id</w:t>
             </w:r>
+            <w:proofErr w:type="spellEnd"/>
           </w:p>
         </w:tc>
         <w:tc>
@@ -9842,6 +10083,7 @@
                 <w:color w:val="000000"/>
               </w:rPr>
             </w:pPr>
+            <w:proofErr w:type="spellStart"/>
             <w:r>
               <w:rPr>
                 <w:rFonts w:eastAsia="Times New Roman"/>
@@ -9849,33 +10091,43 @@
               </w:rPr>
               <w:t>product_name</w:t>
             </w:r>
-          </w:p>
-        </w:tc>
-        <w:tc>
-          <w:tcPr>
-            <w:tcW w:w="0" w:type="auto"/>
-            <w:tcMar>
-              <w:top w:w="100" w:type="dxa"/>
-              <w:left w:w="120" w:type="dxa"/>
-              <w:bottom w:w="100" w:type="dxa"/>
-              <w:right w:w="120" w:type="dxa"/>
-            </w:tcMar>
-            <w:hideMark/>
-          </w:tcPr>
-          <w:p>
-            <w:pPr>
-              <w:spacing w:after="480"/>
-              <w:rPr>
-                <w:rFonts w:eastAsia="Times New Roman"/>
-                <w:color w:val="000000"/>
-              </w:rPr>
-            </w:pPr>
-            <w:r>
-              <w:rPr>
-                <w:rFonts w:eastAsia="Times New Roman"/>
-                <w:color w:val="000000"/>
-              </w:rPr>
-              <w:t>VARCHAR(255)</w:t>
+            <w:proofErr w:type="spellEnd"/>
+          </w:p>
+        </w:tc>
+        <w:tc>
+          <w:tcPr>
+            <w:tcW w:w="0" w:type="auto"/>
+            <w:tcMar>
+              <w:top w:w="100" w:type="dxa"/>
+              <w:left w:w="120" w:type="dxa"/>
+              <w:bottom w:w="100" w:type="dxa"/>
+              <w:right w:w="120" w:type="dxa"/>
+            </w:tcMar>
+            <w:hideMark/>
+          </w:tcPr>
+          <w:p>
+            <w:pPr>
+              <w:spacing w:after="480"/>
+              <w:rPr>
+                <w:rFonts w:eastAsia="Times New Roman"/>
+                <w:color w:val="000000"/>
+              </w:rPr>
+            </w:pPr>
+            <w:proofErr w:type="gramStart"/>
+            <w:r>
+              <w:rPr>
+                <w:rFonts w:eastAsia="Times New Roman"/>
+                <w:color w:val="000000"/>
+              </w:rPr>
+              <w:t>VARCHAR(</w:t>
+            </w:r>
+            <w:proofErr w:type="gramEnd"/>
+            <w:r>
+              <w:rPr>
+                <w:rFonts w:eastAsia="Times New Roman"/>
+                <w:color w:val="000000"/>
+              </w:rPr>
+              <w:t>255)</w:t>
             </w:r>
           </w:p>
         </w:tc>
@@ -9991,6 +10243,7 @@
                 <w:color w:val="000000"/>
               </w:rPr>
             </w:pPr>
+            <w:proofErr w:type="spellStart"/>
             <w:r>
               <w:rPr>
                 <w:rFonts w:eastAsia="Times New Roman"/>
@@ -9998,6 +10251,7 @@
               </w:rPr>
               <w:t>pieces_per_bundle</w:t>
             </w:r>
+            <w:proofErr w:type="spellEnd"/>
           </w:p>
         </w:tc>
         <w:tc>
@@ -10289,6 +10543,7 @@
                 <w:color w:val="000000"/>
               </w:rPr>
             </w:pPr>
+            <w:proofErr w:type="spellStart"/>
             <w:r>
               <w:rPr>
                 <w:rFonts w:eastAsia="Times New Roman"/>
@@ -10296,6 +10551,7 @@
               </w:rPr>
               <w:t>unit_price_centavos</w:t>
             </w:r>
+            <w:proofErr w:type="spellEnd"/>
           </w:p>
         </w:tc>
         <w:tc>
@@ -10438,6 +10694,7 @@
                 <w:color w:val="000000"/>
               </w:rPr>
             </w:pPr>
+            <w:proofErr w:type="spellStart"/>
             <w:r>
               <w:rPr>
                 <w:rFonts w:eastAsia="Times New Roman"/>
@@ -10445,6 +10702,7 @@
               </w:rPr>
               <w:t>line_total_centavos</w:t>
             </w:r>
+            <w:proofErr w:type="spellEnd"/>
           </w:p>
         </w:tc>
         <w:tc>
@@ -10967,6 +11225,7 @@
                 <w:color w:val="000000"/>
               </w:rPr>
             </w:pPr>
+            <w:proofErr w:type="spellStart"/>
             <w:r>
               <w:rPr>
                 <w:rFonts w:eastAsia="Times New Roman"/>
@@ -10974,6 +11233,7 @@
               </w:rPr>
               <w:t>order_id</w:t>
             </w:r>
+            <w:proofErr w:type="spellEnd"/>
           </w:p>
         </w:tc>
         <w:tc>
@@ -11144,12 +11404,21 @@
                 <w:color w:val="000000"/>
               </w:rPr>
             </w:pPr>
-            <w:r>
-              <w:rPr>
-                <w:rFonts w:eastAsia="Times New Roman"/>
-                <w:color w:val="000000"/>
-              </w:rPr>
-              <w:t>VARCHAR(20)</w:t>
+            <w:proofErr w:type="gramStart"/>
+            <w:r>
+              <w:rPr>
+                <w:rFonts w:eastAsia="Times New Roman"/>
+                <w:color w:val="000000"/>
+              </w:rPr>
+              <w:t>VARCHAR(</w:t>
+            </w:r>
+            <w:proofErr w:type="gramEnd"/>
+            <w:r>
+              <w:rPr>
+                <w:rFonts w:eastAsia="Times New Roman"/>
+                <w:color w:val="000000"/>
+              </w:rPr>
+              <w:t>20)</w:t>
             </w:r>
           </w:p>
         </w:tc>
@@ -11293,12 +11562,21 @@
                 <w:color w:val="000000"/>
               </w:rPr>
             </w:pPr>
-            <w:r>
-              <w:rPr>
-                <w:rFonts w:eastAsia="Times New Roman"/>
-                <w:color w:val="000000"/>
-              </w:rPr>
-              <w:t>VARCHAR(20)</w:t>
+            <w:proofErr w:type="gramStart"/>
+            <w:r>
+              <w:rPr>
+                <w:rFonts w:eastAsia="Times New Roman"/>
+                <w:color w:val="000000"/>
+              </w:rPr>
+              <w:t>VARCHAR(</w:t>
+            </w:r>
+            <w:proofErr w:type="gramEnd"/>
+            <w:r>
+              <w:rPr>
+                <w:rFonts w:eastAsia="Times New Roman"/>
+                <w:color w:val="000000"/>
+              </w:rPr>
+              <w:t>20)</w:t>
             </w:r>
           </w:p>
         </w:tc>
@@ -11414,6 +11692,7 @@
                 <w:color w:val="000000"/>
               </w:rPr>
             </w:pPr>
+            <w:proofErr w:type="spellStart"/>
             <w:r>
               <w:rPr>
                 <w:rFonts w:eastAsia="Times New Roman"/>
@@ -11421,6 +11700,7 @@
               </w:rPr>
               <w:t>amount_centavos</w:t>
             </w:r>
+            <w:proofErr w:type="spellEnd"/>
           </w:p>
         </w:tc>
         <w:tc>
@@ -11563,6 +11843,7 @@
                 <w:color w:val="000000"/>
               </w:rPr>
             </w:pPr>
+            <w:proofErr w:type="spellStart"/>
             <w:r>
               <w:rPr>
                 <w:rFonts w:eastAsia="Times New Roman"/>
@@ -11570,33 +11851,43 @@
               </w:rPr>
               <w:t>reference_number</w:t>
             </w:r>
-          </w:p>
-        </w:tc>
-        <w:tc>
-          <w:tcPr>
-            <w:tcW w:w="0" w:type="auto"/>
-            <w:tcMar>
-              <w:top w:w="100" w:type="dxa"/>
-              <w:left w:w="120" w:type="dxa"/>
-              <w:bottom w:w="100" w:type="dxa"/>
-              <w:right w:w="120" w:type="dxa"/>
-            </w:tcMar>
-            <w:hideMark/>
-          </w:tcPr>
-          <w:p>
-            <w:pPr>
-              <w:spacing w:after="480"/>
-              <w:rPr>
-                <w:rFonts w:eastAsia="Times New Roman"/>
-                <w:color w:val="000000"/>
-              </w:rPr>
-            </w:pPr>
-            <w:r>
-              <w:rPr>
-                <w:rFonts w:eastAsia="Times New Roman"/>
-                <w:color w:val="000000"/>
-              </w:rPr>
-              <w:t>VARCHAR(100)</w:t>
+            <w:proofErr w:type="spellEnd"/>
+          </w:p>
+        </w:tc>
+        <w:tc>
+          <w:tcPr>
+            <w:tcW w:w="0" w:type="auto"/>
+            <w:tcMar>
+              <w:top w:w="100" w:type="dxa"/>
+              <w:left w:w="120" w:type="dxa"/>
+              <w:bottom w:w="100" w:type="dxa"/>
+              <w:right w:w="120" w:type="dxa"/>
+            </w:tcMar>
+            <w:hideMark/>
+          </w:tcPr>
+          <w:p>
+            <w:pPr>
+              <w:spacing w:after="480"/>
+              <w:rPr>
+                <w:rFonts w:eastAsia="Times New Roman"/>
+                <w:color w:val="000000"/>
+              </w:rPr>
+            </w:pPr>
+            <w:proofErr w:type="gramStart"/>
+            <w:r>
+              <w:rPr>
+                <w:rFonts w:eastAsia="Times New Roman"/>
+                <w:color w:val="000000"/>
+              </w:rPr>
+              <w:t>VARCHAR(</w:t>
+            </w:r>
+            <w:proofErr w:type="gramEnd"/>
+            <w:r>
+              <w:rPr>
+                <w:rFonts w:eastAsia="Times New Roman"/>
+                <w:color w:val="000000"/>
+              </w:rPr>
+              <w:t>100)</w:t>
             </w:r>
           </w:p>
         </w:tc>
@@ -11712,6 +12003,7 @@
                 <w:color w:val="000000"/>
               </w:rPr>
             </w:pPr>
+            <w:proofErr w:type="spellStart"/>
             <w:r>
               <w:rPr>
                 <w:rFonts w:eastAsia="Times New Roman"/>
@@ -11719,6 +12011,7 @@
               </w:rPr>
               <w:t>proof_storage_path</w:t>
             </w:r>
+            <w:proofErr w:type="spellEnd"/>
           </w:p>
         </w:tc>
         <w:tc>
@@ -11861,40 +12154,52 @@
                 <w:color w:val="000000"/>
               </w:rPr>
             </w:pPr>
-            <w:r>
-              <w:rPr>
-                <w:rFonts w:eastAsia="Times New Roman"/>
-                <w:color w:val="000000"/>
-              </w:rPr>
+            <w:proofErr w:type="spellStart"/>
+            <w:r>
+              <w:rPr>
+                <w:rFonts w:eastAsia="Times New Roman"/>
+                <w:color w:val="000000"/>
+              </w:rPr>
+              <w:lastRenderedPageBreak/>
               <w:t>verification_status</w:t>
             </w:r>
-          </w:p>
-        </w:tc>
-        <w:tc>
-          <w:tcPr>
-            <w:tcW w:w="0" w:type="auto"/>
-            <w:tcMar>
-              <w:top w:w="100" w:type="dxa"/>
-              <w:left w:w="120" w:type="dxa"/>
-              <w:bottom w:w="100" w:type="dxa"/>
-              <w:right w:w="120" w:type="dxa"/>
-            </w:tcMar>
-            <w:hideMark/>
-          </w:tcPr>
-          <w:p>
-            <w:pPr>
-              <w:spacing w:after="480"/>
-              <w:rPr>
-                <w:rFonts w:eastAsia="Times New Roman"/>
-                <w:color w:val="000000"/>
-              </w:rPr>
-            </w:pPr>
-            <w:r>
-              <w:rPr>
-                <w:rFonts w:eastAsia="Times New Roman"/>
-                <w:color w:val="000000"/>
-              </w:rPr>
-              <w:t>VARCHAR(20)</w:t>
+            <w:proofErr w:type="spellEnd"/>
+          </w:p>
+        </w:tc>
+        <w:tc>
+          <w:tcPr>
+            <w:tcW w:w="0" w:type="auto"/>
+            <w:tcMar>
+              <w:top w:w="100" w:type="dxa"/>
+              <w:left w:w="120" w:type="dxa"/>
+              <w:bottom w:w="100" w:type="dxa"/>
+              <w:right w:w="120" w:type="dxa"/>
+            </w:tcMar>
+            <w:hideMark/>
+          </w:tcPr>
+          <w:p>
+            <w:pPr>
+              <w:spacing w:after="480"/>
+              <w:rPr>
+                <w:rFonts w:eastAsia="Times New Roman"/>
+                <w:color w:val="000000"/>
+              </w:rPr>
+            </w:pPr>
+            <w:proofErr w:type="gramStart"/>
+            <w:r>
+              <w:rPr>
+                <w:rFonts w:eastAsia="Times New Roman"/>
+                <w:color w:val="000000"/>
+              </w:rPr>
+              <w:t>VARCHAR(</w:t>
+            </w:r>
+            <w:proofErr w:type="gramEnd"/>
+            <w:r>
+              <w:rPr>
+                <w:rFonts w:eastAsia="Times New Roman"/>
+                <w:color w:val="000000"/>
+              </w:rPr>
+              <w:t>20)</w:t>
             </w:r>
           </w:p>
         </w:tc>
@@ -12010,6 +12315,7 @@
                 <w:color w:val="000000"/>
               </w:rPr>
             </w:pPr>
+            <w:proofErr w:type="spellStart"/>
             <w:r>
               <w:rPr>
                 <w:rFonts w:eastAsia="Times New Roman"/>
@@ -12017,6 +12323,7 @@
               </w:rPr>
               <w:t>verified_at</w:t>
             </w:r>
+            <w:proofErr w:type="spellEnd"/>
           </w:p>
         </w:tc>
         <w:tc>
@@ -12159,6 +12466,7 @@
                 <w:color w:val="000000"/>
               </w:rPr>
             </w:pPr>
+            <w:proofErr w:type="spellStart"/>
             <w:r>
               <w:rPr>
                 <w:rFonts w:eastAsia="Times New Roman"/>
@@ -12166,6 +12474,7 @@
               </w:rPr>
               <w:t>created_at</w:t>
             </w:r>
+            <w:proofErr w:type="spellEnd"/>
           </w:p>
         </w:tc>
         <w:tc>
@@ -12305,8 +12614,20 @@
           <w:color w:val="000000"/>
           <w:lang w:val="en"/>
         </w:rPr>
-        <w:t>Table 9. Refund_Requests</w:t>
+        <w:t xml:space="preserve">Table 9. </w:t>
       </w:r>
+      <w:proofErr w:type="spellStart"/>
+      <w:r>
+        <w:rPr>
+          <w:rFonts w:eastAsia="Times New Roman"/>
+          <w:b/>
+          <w:bCs/>
+          <w:color w:val="000000"/>
+          <w:lang w:val="en"/>
+        </w:rPr>
+        <w:t>Refund_Requests</w:t>
+      </w:r>
+      <w:proofErr w:type="spellEnd"/>
     </w:p>
     <w:tbl>
       <w:tblPr>
@@ -12687,6 +13008,7 @@
                 <w:color w:val="000000"/>
               </w:rPr>
             </w:pPr>
+            <w:proofErr w:type="spellStart"/>
             <w:r>
               <w:rPr>
                 <w:rFonts w:eastAsia="Times New Roman"/>
@@ -12694,6 +13016,7 @@
               </w:rPr>
               <w:t>order_id</w:t>
             </w:r>
+            <w:proofErr w:type="spellEnd"/>
           </w:p>
         </w:tc>
         <w:tc>
@@ -12985,40 +13308,52 @@
                 <w:color w:val="000000"/>
               </w:rPr>
             </w:pPr>
-            <w:r>
-              <w:rPr>
-                <w:rFonts w:eastAsia="Times New Roman"/>
-                <w:color w:val="000000"/>
-              </w:rPr>
+            <w:proofErr w:type="spellStart"/>
+            <w:r>
+              <w:rPr>
+                <w:rFonts w:eastAsia="Times New Roman"/>
+                <w:color w:val="000000"/>
+              </w:rPr>
+              <w:lastRenderedPageBreak/>
               <w:t>reason_source</w:t>
             </w:r>
-          </w:p>
-        </w:tc>
-        <w:tc>
-          <w:tcPr>
-            <w:tcW w:w="0" w:type="auto"/>
-            <w:tcMar>
-              <w:top w:w="100" w:type="dxa"/>
-              <w:left w:w="120" w:type="dxa"/>
-              <w:bottom w:w="100" w:type="dxa"/>
-              <w:right w:w="120" w:type="dxa"/>
-            </w:tcMar>
-            <w:hideMark/>
-          </w:tcPr>
-          <w:p>
-            <w:pPr>
-              <w:spacing w:after="480"/>
-              <w:rPr>
-                <w:rFonts w:eastAsia="Times New Roman"/>
-                <w:color w:val="000000"/>
-              </w:rPr>
-            </w:pPr>
-            <w:r>
-              <w:rPr>
-                <w:rFonts w:eastAsia="Times New Roman"/>
-                <w:color w:val="000000"/>
-              </w:rPr>
-              <w:t>VARCHAR(20)</w:t>
+            <w:proofErr w:type="spellEnd"/>
+          </w:p>
+        </w:tc>
+        <w:tc>
+          <w:tcPr>
+            <w:tcW w:w="0" w:type="auto"/>
+            <w:tcMar>
+              <w:top w:w="100" w:type="dxa"/>
+              <w:left w:w="120" w:type="dxa"/>
+              <w:bottom w:w="100" w:type="dxa"/>
+              <w:right w:w="120" w:type="dxa"/>
+            </w:tcMar>
+            <w:hideMark/>
+          </w:tcPr>
+          <w:p>
+            <w:pPr>
+              <w:spacing w:after="480"/>
+              <w:rPr>
+                <w:rFonts w:eastAsia="Times New Roman"/>
+                <w:color w:val="000000"/>
+              </w:rPr>
+            </w:pPr>
+            <w:proofErr w:type="gramStart"/>
+            <w:r>
+              <w:rPr>
+                <w:rFonts w:eastAsia="Times New Roman"/>
+                <w:color w:val="000000"/>
+              </w:rPr>
+              <w:t>VARCHAR(</w:t>
+            </w:r>
+            <w:proofErr w:type="gramEnd"/>
+            <w:r>
+              <w:rPr>
+                <w:rFonts w:eastAsia="Times New Roman"/>
+                <w:color w:val="000000"/>
+              </w:rPr>
+              <w:t>20)</w:t>
             </w:r>
           </w:p>
         </w:tc>
@@ -13134,6 +13469,7 @@
                 <w:color w:val="000000"/>
               </w:rPr>
             </w:pPr>
+            <w:proofErr w:type="spellStart"/>
             <w:r>
               <w:rPr>
                 <w:rFonts w:eastAsia="Times New Roman"/>
@@ -13141,33 +13477,43 @@
               </w:rPr>
               <w:t>wallet_type</w:t>
             </w:r>
-          </w:p>
-        </w:tc>
-        <w:tc>
-          <w:tcPr>
-            <w:tcW w:w="0" w:type="auto"/>
-            <w:tcMar>
-              <w:top w:w="100" w:type="dxa"/>
-              <w:left w:w="120" w:type="dxa"/>
-              <w:bottom w:w="100" w:type="dxa"/>
-              <w:right w:w="120" w:type="dxa"/>
-            </w:tcMar>
-            <w:hideMark/>
-          </w:tcPr>
-          <w:p>
-            <w:pPr>
-              <w:spacing w:after="480"/>
-              <w:rPr>
-                <w:rFonts w:eastAsia="Times New Roman"/>
-                <w:color w:val="000000"/>
-              </w:rPr>
-            </w:pPr>
-            <w:r>
-              <w:rPr>
-                <w:rFonts w:eastAsia="Times New Roman"/>
-                <w:color w:val="000000"/>
-              </w:rPr>
-              <w:t>VARCHAR(20)</w:t>
+            <w:proofErr w:type="spellEnd"/>
+          </w:p>
+        </w:tc>
+        <w:tc>
+          <w:tcPr>
+            <w:tcW w:w="0" w:type="auto"/>
+            <w:tcMar>
+              <w:top w:w="100" w:type="dxa"/>
+              <w:left w:w="120" w:type="dxa"/>
+              <w:bottom w:w="100" w:type="dxa"/>
+              <w:right w:w="120" w:type="dxa"/>
+            </w:tcMar>
+            <w:hideMark/>
+          </w:tcPr>
+          <w:p>
+            <w:pPr>
+              <w:spacing w:after="480"/>
+              <w:rPr>
+                <w:rFonts w:eastAsia="Times New Roman"/>
+                <w:color w:val="000000"/>
+              </w:rPr>
+            </w:pPr>
+            <w:proofErr w:type="gramStart"/>
+            <w:r>
+              <w:rPr>
+                <w:rFonts w:eastAsia="Times New Roman"/>
+                <w:color w:val="000000"/>
+              </w:rPr>
+              <w:t>VARCHAR(</w:t>
+            </w:r>
+            <w:proofErr w:type="gramEnd"/>
+            <w:r>
+              <w:rPr>
+                <w:rFonts w:eastAsia="Times New Roman"/>
+                <w:color w:val="000000"/>
+              </w:rPr>
+              <w:t>20)</w:t>
             </w:r>
           </w:p>
         </w:tc>
@@ -13283,6 +13629,7 @@
                 <w:color w:val="000000"/>
               </w:rPr>
             </w:pPr>
+            <w:proofErr w:type="spellStart"/>
             <w:r>
               <w:rPr>
                 <w:rFonts w:eastAsia="Times New Roman"/>
@@ -13290,33 +13637,43 @@
               </w:rPr>
               <w:t>account_number</w:t>
             </w:r>
-          </w:p>
-        </w:tc>
-        <w:tc>
-          <w:tcPr>
-            <w:tcW w:w="0" w:type="auto"/>
-            <w:tcMar>
-              <w:top w:w="100" w:type="dxa"/>
-              <w:left w:w="120" w:type="dxa"/>
-              <w:bottom w:w="100" w:type="dxa"/>
-              <w:right w:w="120" w:type="dxa"/>
-            </w:tcMar>
-            <w:hideMark/>
-          </w:tcPr>
-          <w:p>
-            <w:pPr>
-              <w:spacing w:after="480"/>
-              <w:rPr>
-                <w:rFonts w:eastAsia="Times New Roman"/>
-                <w:color w:val="000000"/>
-              </w:rPr>
-            </w:pPr>
-            <w:r>
-              <w:rPr>
-                <w:rFonts w:eastAsia="Times New Roman"/>
-                <w:color w:val="000000"/>
-              </w:rPr>
-              <w:t>VARCHAR(50)</w:t>
+            <w:proofErr w:type="spellEnd"/>
+          </w:p>
+        </w:tc>
+        <w:tc>
+          <w:tcPr>
+            <w:tcW w:w="0" w:type="auto"/>
+            <w:tcMar>
+              <w:top w:w="100" w:type="dxa"/>
+              <w:left w:w="120" w:type="dxa"/>
+              <w:bottom w:w="100" w:type="dxa"/>
+              <w:right w:w="120" w:type="dxa"/>
+            </w:tcMar>
+            <w:hideMark/>
+          </w:tcPr>
+          <w:p>
+            <w:pPr>
+              <w:spacing w:after="480"/>
+              <w:rPr>
+                <w:rFonts w:eastAsia="Times New Roman"/>
+                <w:color w:val="000000"/>
+              </w:rPr>
+            </w:pPr>
+            <w:proofErr w:type="gramStart"/>
+            <w:r>
+              <w:rPr>
+                <w:rFonts w:eastAsia="Times New Roman"/>
+                <w:color w:val="000000"/>
+              </w:rPr>
+              <w:t>VARCHAR(</w:t>
+            </w:r>
+            <w:proofErr w:type="gramEnd"/>
+            <w:r>
+              <w:rPr>
+                <w:rFonts w:eastAsia="Times New Roman"/>
+                <w:color w:val="000000"/>
+              </w:rPr>
+              <w:t>50)</w:t>
             </w:r>
           </w:p>
         </w:tc>
@@ -13432,6 +13789,7 @@
                 <w:color w:val="000000"/>
               </w:rPr>
             </w:pPr>
+            <w:proofErr w:type="spellStart"/>
             <w:r>
               <w:rPr>
                 <w:rFonts w:eastAsia="Times New Roman"/>
@@ -13439,33 +13797,43 @@
               </w:rPr>
               <w:t>account_name</w:t>
             </w:r>
-          </w:p>
-        </w:tc>
-        <w:tc>
-          <w:tcPr>
-            <w:tcW w:w="0" w:type="auto"/>
-            <w:tcMar>
-              <w:top w:w="100" w:type="dxa"/>
-              <w:left w:w="120" w:type="dxa"/>
-              <w:bottom w:w="100" w:type="dxa"/>
-              <w:right w:w="120" w:type="dxa"/>
-            </w:tcMar>
-            <w:hideMark/>
-          </w:tcPr>
-          <w:p>
-            <w:pPr>
-              <w:spacing w:after="480"/>
-              <w:rPr>
-                <w:rFonts w:eastAsia="Times New Roman"/>
-                <w:color w:val="000000"/>
-              </w:rPr>
-            </w:pPr>
-            <w:r>
-              <w:rPr>
-                <w:rFonts w:eastAsia="Times New Roman"/>
-                <w:color w:val="000000"/>
-              </w:rPr>
-              <w:t>VARCHAR(255)</w:t>
+            <w:proofErr w:type="spellEnd"/>
+          </w:p>
+        </w:tc>
+        <w:tc>
+          <w:tcPr>
+            <w:tcW w:w="0" w:type="auto"/>
+            <w:tcMar>
+              <w:top w:w="100" w:type="dxa"/>
+              <w:left w:w="120" w:type="dxa"/>
+              <w:bottom w:w="100" w:type="dxa"/>
+              <w:right w:w="120" w:type="dxa"/>
+            </w:tcMar>
+            <w:hideMark/>
+          </w:tcPr>
+          <w:p>
+            <w:pPr>
+              <w:spacing w:after="480"/>
+              <w:rPr>
+                <w:rFonts w:eastAsia="Times New Roman"/>
+                <w:color w:val="000000"/>
+              </w:rPr>
+            </w:pPr>
+            <w:proofErr w:type="gramStart"/>
+            <w:r>
+              <w:rPr>
+                <w:rFonts w:eastAsia="Times New Roman"/>
+                <w:color w:val="000000"/>
+              </w:rPr>
+              <w:t>VARCHAR(</w:t>
+            </w:r>
+            <w:proofErr w:type="gramEnd"/>
+            <w:r>
+              <w:rPr>
+                <w:rFonts w:eastAsia="Times New Roman"/>
+                <w:color w:val="000000"/>
+              </w:rPr>
+              <w:t>255)</w:t>
             </w:r>
           </w:p>
         </w:tc>
@@ -13581,6 +13949,7 @@
                 <w:color w:val="000000"/>
               </w:rPr>
             </w:pPr>
+            <w:proofErr w:type="spellStart"/>
             <w:r>
               <w:rPr>
                 <w:rFonts w:eastAsia="Times New Roman"/>
@@ -13588,6 +13957,7 @@
               </w:rPr>
               <w:t>refund_amount_centavos</w:t>
             </w:r>
+            <w:proofErr w:type="spellEnd"/>
           </w:p>
         </w:tc>
         <w:tc>
@@ -13758,12 +14128,21 @@
                 <w:color w:val="000000"/>
               </w:rPr>
             </w:pPr>
-            <w:r>
-              <w:rPr>
-                <w:rFonts w:eastAsia="Times New Roman"/>
-                <w:color w:val="000000"/>
-              </w:rPr>
-              <w:t>VARCHAR(30)</w:t>
+            <w:proofErr w:type="gramStart"/>
+            <w:r>
+              <w:rPr>
+                <w:rFonts w:eastAsia="Times New Roman"/>
+                <w:color w:val="000000"/>
+              </w:rPr>
+              <w:t>VARCHAR(</w:t>
+            </w:r>
+            <w:proofErr w:type="gramEnd"/>
+            <w:r>
+              <w:rPr>
+                <w:rFonts w:eastAsia="Times New Roman"/>
+                <w:color w:val="000000"/>
+              </w:rPr>
+              <w:t>30)</w:t>
             </w:r>
           </w:p>
         </w:tc>
@@ -13879,6 +14258,7 @@
                 <w:color w:val="000000"/>
               </w:rPr>
             </w:pPr>
+            <w:proofErr w:type="spellStart"/>
             <w:r>
               <w:rPr>
                 <w:rFonts w:eastAsia="Times New Roman"/>
@@ -13886,6 +14266,7 @@
               </w:rPr>
               <w:t>requested_at</w:t>
             </w:r>
+            <w:proofErr w:type="spellEnd"/>
           </w:p>
         </w:tc>
         <w:tc>
@@ -14028,6 +14409,7 @@
                 <w:color w:val="000000"/>
               </w:rPr>
             </w:pPr>
+            <w:proofErr w:type="spellStart"/>
             <w:r>
               <w:rPr>
                 <w:rFonts w:eastAsia="Times New Roman"/>
@@ -14035,6 +14417,7 @@
               </w:rPr>
               <w:t>processed_at</w:t>
             </w:r>
+            <w:proofErr w:type="spellEnd"/>
           </w:p>
         </w:tc>
         <w:tc>
@@ -14177,40 +14560,52 @@
                 <w:color w:val="000000"/>
               </w:rPr>
             </w:pPr>
-            <w:r>
-              <w:rPr>
-                <w:rFonts w:eastAsia="Times New Roman"/>
-                <w:color w:val="000000"/>
-              </w:rPr>
+            <w:proofErr w:type="spellStart"/>
+            <w:r>
+              <w:rPr>
+                <w:rFonts w:eastAsia="Times New Roman"/>
+                <w:color w:val="000000"/>
+              </w:rPr>
+              <w:lastRenderedPageBreak/>
               <w:t>admin_reference_number</w:t>
             </w:r>
-          </w:p>
-        </w:tc>
-        <w:tc>
-          <w:tcPr>
-            <w:tcW w:w="0" w:type="auto"/>
-            <w:tcMar>
-              <w:top w:w="100" w:type="dxa"/>
-              <w:left w:w="120" w:type="dxa"/>
-              <w:bottom w:w="100" w:type="dxa"/>
-              <w:right w:w="120" w:type="dxa"/>
-            </w:tcMar>
-            <w:hideMark/>
-          </w:tcPr>
-          <w:p>
-            <w:pPr>
-              <w:spacing w:after="480"/>
-              <w:rPr>
-                <w:rFonts w:eastAsia="Times New Roman"/>
-                <w:color w:val="000000"/>
-              </w:rPr>
-            </w:pPr>
-            <w:r>
-              <w:rPr>
-                <w:rFonts w:eastAsia="Times New Roman"/>
-                <w:color w:val="000000"/>
-              </w:rPr>
-              <w:t>VARCHAR(100)</w:t>
+            <w:proofErr w:type="spellEnd"/>
+          </w:p>
+        </w:tc>
+        <w:tc>
+          <w:tcPr>
+            <w:tcW w:w="0" w:type="auto"/>
+            <w:tcMar>
+              <w:top w:w="100" w:type="dxa"/>
+              <w:left w:w="120" w:type="dxa"/>
+              <w:bottom w:w="100" w:type="dxa"/>
+              <w:right w:w="120" w:type="dxa"/>
+            </w:tcMar>
+            <w:hideMark/>
+          </w:tcPr>
+          <w:p>
+            <w:pPr>
+              <w:spacing w:after="480"/>
+              <w:rPr>
+                <w:rFonts w:eastAsia="Times New Roman"/>
+                <w:color w:val="000000"/>
+              </w:rPr>
+            </w:pPr>
+            <w:proofErr w:type="gramStart"/>
+            <w:r>
+              <w:rPr>
+                <w:rFonts w:eastAsia="Times New Roman"/>
+                <w:color w:val="000000"/>
+              </w:rPr>
+              <w:t>VARCHAR(</w:t>
+            </w:r>
+            <w:proofErr w:type="gramEnd"/>
+            <w:r>
+              <w:rPr>
+                <w:rFonts w:eastAsia="Times New Roman"/>
+                <w:color w:val="000000"/>
+              </w:rPr>
+              <w:t>100)</w:t>
             </w:r>
           </w:p>
         </w:tc>
@@ -14326,6 +14721,7 @@
                 <w:color w:val="000000"/>
               </w:rPr>
             </w:pPr>
+            <w:proofErr w:type="spellStart"/>
             <w:r>
               <w:rPr>
                 <w:rFonts w:eastAsia="Times New Roman"/>
@@ -14333,6 +14729,7 @@
               </w:rPr>
               <w:t>admin_note</w:t>
             </w:r>
+            <w:proofErr w:type="spellEnd"/>
           </w:p>
         </w:tc>
         <w:tc>
@@ -14472,8 +14869,20 @@
           <w:color w:val="000000"/>
           <w:lang w:val="en"/>
         </w:rPr>
-        <w:t>Table 10. Order_Status_History</w:t>
+        <w:t xml:space="preserve">Table 10. </w:t>
       </w:r>
+      <w:proofErr w:type="spellStart"/>
+      <w:r>
+        <w:rPr>
+          <w:rFonts w:eastAsia="Times New Roman"/>
+          <w:b/>
+          <w:bCs/>
+          <w:color w:val="000000"/>
+          <w:lang w:val="en"/>
+        </w:rPr>
+        <w:t>Order_Status_History</w:t>
+      </w:r>
+      <w:proofErr w:type="spellEnd"/>
     </w:p>
     <w:tbl>
       <w:tblPr>
@@ -14854,6 +15263,7 @@
                 <w:color w:val="000000"/>
               </w:rPr>
             </w:pPr>
+            <w:proofErr w:type="spellStart"/>
             <w:r>
               <w:rPr>
                 <w:rFonts w:eastAsia="Times New Roman"/>
@@ -14861,6 +15271,7 @@
               </w:rPr>
               <w:t>order_id</w:t>
             </w:r>
+            <w:proofErr w:type="spellEnd"/>
           </w:p>
         </w:tc>
         <w:tc>
@@ -15003,6 +15414,7 @@
                 <w:color w:val="000000"/>
               </w:rPr>
             </w:pPr>
+            <w:proofErr w:type="spellStart"/>
             <w:r>
               <w:rPr>
                 <w:rFonts w:eastAsia="Times New Roman"/>
@@ -15010,33 +15422,43 @@
               </w:rPr>
               <w:t>old_status</w:t>
             </w:r>
-          </w:p>
-        </w:tc>
-        <w:tc>
-          <w:tcPr>
-            <w:tcW w:w="0" w:type="auto"/>
-            <w:tcMar>
-              <w:top w:w="100" w:type="dxa"/>
-              <w:left w:w="120" w:type="dxa"/>
-              <w:bottom w:w="100" w:type="dxa"/>
-              <w:right w:w="120" w:type="dxa"/>
-            </w:tcMar>
-            <w:hideMark/>
-          </w:tcPr>
-          <w:p>
-            <w:pPr>
-              <w:spacing w:after="480"/>
-              <w:rPr>
-                <w:rFonts w:eastAsia="Times New Roman"/>
-                <w:color w:val="000000"/>
-              </w:rPr>
-            </w:pPr>
-            <w:r>
-              <w:rPr>
-                <w:rFonts w:eastAsia="Times New Roman"/>
-                <w:color w:val="000000"/>
-              </w:rPr>
-              <w:t>VARCHAR(50)</w:t>
+            <w:proofErr w:type="spellEnd"/>
+          </w:p>
+        </w:tc>
+        <w:tc>
+          <w:tcPr>
+            <w:tcW w:w="0" w:type="auto"/>
+            <w:tcMar>
+              <w:top w:w="100" w:type="dxa"/>
+              <w:left w:w="120" w:type="dxa"/>
+              <w:bottom w:w="100" w:type="dxa"/>
+              <w:right w:w="120" w:type="dxa"/>
+            </w:tcMar>
+            <w:hideMark/>
+          </w:tcPr>
+          <w:p>
+            <w:pPr>
+              <w:spacing w:after="480"/>
+              <w:rPr>
+                <w:rFonts w:eastAsia="Times New Roman"/>
+                <w:color w:val="000000"/>
+              </w:rPr>
+            </w:pPr>
+            <w:proofErr w:type="gramStart"/>
+            <w:r>
+              <w:rPr>
+                <w:rFonts w:eastAsia="Times New Roman"/>
+                <w:color w:val="000000"/>
+              </w:rPr>
+              <w:t>VARCHAR(</w:t>
+            </w:r>
+            <w:proofErr w:type="gramEnd"/>
+            <w:r>
+              <w:rPr>
+                <w:rFonts w:eastAsia="Times New Roman"/>
+                <w:color w:val="000000"/>
+              </w:rPr>
+              <w:t>50)</w:t>
             </w:r>
           </w:p>
         </w:tc>
@@ -15152,6 +15574,7 @@
                 <w:color w:val="000000"/>
               </w:rPr>
             </w:pPr>
+            <w:proofErr w:type="spellStart"/>
             <w:r>
               <w:rPr>
                 <w:rFonts w:eastAsia="Times New Roman"/>
@@ -15159,33 +15582,43 @@
               </w:rPr>
               <w:t>new_status</w:t>
             </w:r>
-          </w:p>
-        </w:tc>
-        <w:tc>
-          <w:tcPr>
-            <w:tcW w:w="0" w:type="auto"/>
-            <w:tcMar>
-              <w:top w:w="100" w:type="dxa"/>
-              <w:left w:w="120" w:type="dxa"/>
-              <w:bottom w:w="100" w:type="dxa"/>
-              <w:right w:w="120" w:type="dxa"/>
-            </w:tcMar>
-            <w:hideMark/>
-          </w:tcPr>
-          <w:p>
-            <w:pPr>
-              <w:spacing w:after="480"/>
-              <w:rPr>
-                <w:rFonts w:eastAsia="Times New Roman"/>
-                <w:color w:val="000000"/>
-              </w:rPr>
-            </w:pPr>
-            <w:r>
-              <w:rPr>
-                <w:rFonts w:eastAsia="Times New Roman"/>
-                <w:color w:val="000000"/>
-              </w:rPr>
-              <w:t>VARCHAR(50)</w:t>
+            <w:proofErr w:type="spellEnd"/>
+          </w:p>
+        </w:tc>
+        <w:tc>
+          <w:tcPr>
+            <w:tcW w:w="0" w:type="auto"/>
+            <w:tcMar>
+              <w:top w:w="100" w:type="dxa"/>
+              <w:left w:w="120" w:type="dxa"/>
+              <w:bottom w:w="100" w:type="dxa"/>
+              <w:right w:w="120" w:type="dxa"/>
+            </w:tcMar>
+            <w:hideMark/>
+          </w:tcPr>
+          <w:p>
+            <w:pPr>
+              <w:spacing w:after="480"/>
+              <w:rPr>
+                <w:rFonts w:eastAsia="Times New Roman"/>
+                <w:color w:val="000000"/>
+              </w:rPr>
+            </w:pPr>
+            <w:proofErr w:type="gramStart"/>
+            <w:r>
+              <w:rPr>
+                <w:rFonts w:eastAsia="Times New Roman"/>
+                <w:color w:val="000000"/>
+              </w:rPr>
+              <w:t>VARCHAR(</w:t>
+            </w:r>
+            <w:proofErr w:type="gramEnd"/>
+            <w:r>
+              <w:rPr>
+                <w:rFonts w:eastAsia="Times New Roman"/>
+                <w:color w:val="000000"/>
+              </w:rPr>
+              <w:t>50)</w:t>
             </w:r>
           </w:p>
         </w:tc>
@@ -15301,40 +15734,52 @@
                 <w:color w:val="000000"/>
               </w:rPr>
             </w:pPr>
-            <w:r>
-              <w:rPr>
-                <w:rFonts w:eastAsia="Times New Roman"/>
-                <w:color w:val="000000"/>
-              </w:rPr>
+            <w:proofErr w:type="spellStart"/>
+            <w:r>
+              <w:rPr>
+                <w:rFonts w:eastAsia="Times New Roman"/>
+                <w:color w:val="000000"/>
+              </w:rPr>
+              <w:lastRenderedPageBreak/>
               <w:t>changed_by</w:t>
             </w:r>
-          </w:p>
-        </w:tc>
-        <w:tc>
-          <w:tcPr>
-            <w:tcW w:w="0" w:type="auto"/>
-            <w:tcMar>
-              <w:top w:w="100" w:type="dxa"/>
-              <w:left w:w="120" w:type="dxa"/>
-              <w:bottom w:w="100" w:type="dxa"/>
-              <w:right w:w="120" w:type="dxa"/>
-            </w:tcMar>
-            <w:hideMark/>
-          </w:tcPr>
-          <w:p>
-            <w:pPr>
-              <w:spacing w:after="480"/>
-              <w:rPr>
-                <w:rFonts w:eastAsia="Times New Roman"/>
-                <w:color w:val="000000"/>
-              </w:rPr>
-            </w:pPr>
-            <w:r>
-              <w:rPr>
-                <w:rFonts w:eastAsia="Times New Roman"/>
-                <w:color w:val="000000"/>
-              </w:rPr>
-              <w:t>VARCHAR(20)</w:t>
+            <w:proofErr w:type="spellEnd"/>
+          </w:p>
+        </w:tc>
+        <w:tc>
+          <w:tcPr>
+            <w:tcW w:w="0" w:type="auto"/>
+            <w:tcMar>
+              <w:top w:w="100" w:type="dxa"/>
+              <w:left w:w="120" w:type="dxa"/>
+              <w:bottom w:w="100" w:type="dxa"/>
+              <w:right w:w="120" w:type="dxa"/>
+            </w:tcMar>
+            <w:hideMark/>
+          </w:tcPr>
+          <w:p>
+            <w:pPr>
+              <w:spacing w:after="480"/>
+              <w:rPr>
+                <w:rFonts w:eastAsia="Times New Roman"/>
+                <w:color w:val="000000"/>
+              </w:rPr>
+            </w:pPr>
+            <w:proofErr w:type="gramStart"/>
+            <w:r>
+              <w:rPr>
+                <w:rFonts w:eastAsia="Times New Roman"/>
+                <w:color w:val="000000"/>
+              </w:rPr>
+              <w:t>VARCHAR(</w:t>
+            </w:r>
+            <w:proofErr w:type="gramEnd"/>
+            <w:r>
+              <w:rPr>
+                <w:rFonts w:eastAsia="Times New Roman"/>
+                <w:color w:val="000000"/>
+              </w:rPr>
+              <w:t>20)</w:t>
             </w:r>
           </w:p>
         </w:tc>
@@ -15450,6 +15895,7 @@
                 <w:color w:val="000000"/>
               </w:rPr>
             </w:pPr>
+            <w:proofErr w:type="spellStart"/>
             <w:r>
               <w:rPr>
                 <w:rFonts w:eastAsia="Times New Roman"/>
@@ -15457,6 +15903,7 @@
               </w:rPr>
               <w:t>changed_at</w:t>
             </w:r>
+            <w:proofErr w:type="spellEnd"/>
           </w:p>
         </w:tc>
         <w:tc>
@@ -15745,8 +16192,20 @@
           <w:color w:val="000000"/>
           <w:lang w:val="en"/>
         </w:rPr>
-        <w:t>Table 11. Stock_Movements</w:t>
+        <w:t xml:space="preserve">Table 11. </w:t>
       </w:r>
+      <w:proofErr w:type="spellStart"/>
+      <w:r>
+        <w:rPr>
+          <w:rFonts w:eastAsia="Times New Roman"/>
+          <w:b/>
+          <w:bCs/>
+          <w:color w:val="000000"/>
+          <w:lang w:val="en"/>
+        </w:rPr>
+        <w:t>Stock_Movements</w:t>
+      </w:r>
+      <w:proofErr w:type="spellEnd"/>
     </w:p>
     <w:tbl>
       <w:tblPr>
@@ -16127,6 +16586,7 @@
                 <w:color w:val="000000"/>
               </w:rPr>
             </w:pPr>
+            <w:proofErr w:type="spellStart"/>
             <w:r>
               <w:rPr>
                 <w:rFonts w:eastAsia="Times New Roman"/>
@@ -16134,6 +16594,7 @@
               </w:rPr>
               <w:t>product_id</w:t>
             </w:r>
+            <w:proofErr w:type="spellEnd"/>
           </w:p>
         </w:tc>
         <w:tc>
@@ -16276,6 +16737,7 @@
                 <w:color w:val="000000"/>
               </w:rPr>
             </w:pPr>
+            <w:proofErr w:type="spellStart"/>
             <w:r>
               <w:rPr>
                 <w:rFonts w:eastAsia="Times New Roman"/>
@@ -16283,6 +16745,7 @@
               </w:rPr>
               <w:t>change_pieces</w:t>
             </w:r>
+            <w:proofErr w:type="spellEnd"/>
           </w:p>
         </w:tc>
         <w:tc>
@@ -16430,6 +16893,7 @@
                 <w:rFonts w:eastAsia="Times New Roman"/>
                 <w:color w:val="000000"/>
               </w:rPr>
+              <w:lastRenderedPageBreak/>
               <w:t>reason</w:t>
             </w:r>
           </w:p>
@@ -16453,12 +16917,21 @@
                 <w:color w:val="000000"/>
               </w:rPr>
             </w:pPr>
-            <w:r>
-              <w:rPr>
-                <w:rFonts w:eastAsia="Times New Roman"/>
-                <w:color w:val="000000"/>
-              </w:rPr>
-              <w:t>VARCHAR(50)</w:t>
+            <w:proofErr w:type="gramStart"/>
+            <w:r>
+              <w:rPr>
+                <w:rFonts w:eastAsia="Times New Roman"/>
+                <w:color w:val="000000"/>
+              </w:rPr>
+              <w:t>VARCHAR(</w:t>
+            </w:r>
+            <w:proofErr w:type="gramEnd"/>
+            <w:r>
+              <w:rPr>
+                <w:rFonts w:eastAsia="Times New Roman"/>
+                <w:color w:val="000000"/>
+              </w:rPr>
+              <w:t>50)</w:t>
             </w:r>
           </w:p>
         </w:tc>
@@ -16574,6 +17047,7 @@
                 <w:color w:val="000000"/>
               </w:rPr>
             </w:pPr>
+            <w:proofErr w:type="spellStart"/>
             <w:r>
               <w:rPr>
                 <w:rFonts w:eastAsia="Times New Roman"/>
@@ -16581,6 +17055,7 @@
               </w:rPr>
               <w:t>order_id</w:t>
             </w:r>
+            <w:proofErr w:type="spellEnd"/>
           </w:p>
         </w:tc>
         <w:tc>
@@ -16842,7 +17317,23 @@
                 <w:rFonts w:eastAsia="Times New Roman"/>
                 <w:color w:val="000000"/>
               </w:rPr>
-              <w:t>Audit trail note or reference memo</w:t>
+              <w:t xml:space="preserve">Audit trail </w:t>
+            </w:r>
+            <w:proofErr w:type="gramStart"/>
+            <w:r>
+              <w:rPr>
+                <w:rFonts w:eastAsia="Times New Roman"/>
+                <w:color w:val="000000"/>
+              </w:rPr>
+              <w:t>note</w:t>
+            </w:r>
+            <w:proofErr w:type="gramEnd"/>
+            <w:r>
+              <w:rPr>
+                <w:rFonts w:eastAsia="Times New Roman"/>
+                <w:color w:val="000000"/>
+              </w:rPr>
+              <w:t xml:space="preserve"> or reference memo</w:t>
             </w:r>
           </w:p>
         </w:tc>
@@ -16872,6 +17363,7 @@
                 <w:color w:val="000000"/>
               </w:rPr>
             </w:pPr>
+            <w:proofErr w:type="spellStart"/>
             <w:r>
               <w:rPr>
                 <w:rFonts w:eastAsia="Times New Roman"/>
@@ -16879,33 +17371,43 @@
               </w:rPr>
               <w:t>created_by</w:t>
             </w:r>
-          </w:p>
-        </w:tc>
-        <w:tc>
-          <w:tcPr>
-            <w:tcW w:w="0" w:type="auto"/>
-            <w:tcMar>
-              <w:top w:w="100" w:type="dxa"/>
-              <w:left w:w="120" w:type="dxa"/>
-              <w:bottom w:w="100" w:type="dxa"/>
-              <w:right w:w="120" w:type="dxa"/>
-            </w:tcMar>
-            <w:hideMark/>
-          </w:tcPr>
-          <w:p>
-            <w:pPr>
-              <w:spacing w:after="480"/>
-              <w:rPr>
-                <w:rFonts w:eastAsia="Times New Roman"/>
-                <w:color w:val="000000"/>
-              </w:rPr>
-            </w:pPr>
-            <w:r>
-              <w:rPr>
-                <w:rFonts w:eastAsia="Times New Roman"/>
-                <w:color w:val="000000"/>
-              </w:rPr>
-              <w:t>VARCHAR(100)</w:t>
+            <w:proofErr w:type="spellEnd"/>
+          </w:p>
+        </w:tc>
+        <w:tc>
+          <w:tcPr>
+            <w:tcW w:w="0" w:type="auto"/>
+            <w:tcMar>
+              <w:top w:w="100" w:type="dxa"/>
+              <w:left w:w="120" w:type="dxa"/>
+              <w:bottom w:w="100" w:type="dxa"/>
+              <w:right w:w="120" w:type="dxa"/>
+            </w:tcMar>
+            <w:hideMark/>
+          </w:tcPr>
+          <w:p>
+            <w:pPr>
+              <w:spacing w:after="480"/>
+              <w:rPr>
+                <w:rFonts w:eastAsia="Times New Roman"/>
+                <w:color w:val="000000"/>
+              </w:rPr>
+            </w:pPr>
+            <w:proofErr w:type="gramStart"/>
+            <w:r>
+              <w:rPr>
+                <w:rFonts w:eastAsia="Times New Roman"/>
+                <w:color w:val="000000"/>
+              </w:rPr>
+              <w:t>VARCHAR(</w:t>
+            </w:r>
+            <w:proofErr w:type="gramEnd"/>
+            <w:r>
+              <w:rPr>
+                <w:rFonts w:eastAsia="Times New Roman"/>
+                <w:color w:val="000000"/>
+              </w:rPr>
+              <w:t>100)</w:t>
             </w:r>
           </w:p>
         </w:tc>
@@ -17021,6 +17523,7 @@
                 <w:color w:val="000000"/>
               </w:rPr>
             </w:pPr>
+            <w:proofErr w:type="spellStart"/>
             <w:r>
               <w:rPr>
                 <w:rFonts w:eastAsia="Times New Roman"/>
@@ -17028,6 +17531,7 @@
               </w:rPr>
               <w:t>created_at</w:t>
             </w:r>
+            <w:proofErr w:type="spellEnd"/>
           </w:p>
         </w:tc>
         <w:tc>
@@ -17167,8 +17671,20 @@
           <w:color w:val="000000"/>
           <w:lang w:val="en"/>
         </w:rPr>
-        <w:t>Table 12. Walkin_Sales</w:t>
+        <w:t xml:space="preserve">Table 12. </w:t>
       </w:r>
+      <w:proofErr w:type="spellStart"/>
+      <w:r>
+        <w:rPr>
+          <w:rFonts w:eastAsia="Times New Roman"/>
+          <w:b/>
+          <w:bCs/>
+          <w:color w:val="000000"/>
+          <w:lang w:val="en"/>
+        </w:rPr>
+        <w:t>Walkin_Sales</w:t>
+      </w:r>
+      <w:proofErr w:type="spellEnd"/>
     </w:p>
     <w:tbl>
       <w:tblPr>
@@ -17549,40 +18065,52 @@
                 <w:color w:val="000000"/>
               </w:rPr>
             </w:pPr>
-            <w:r>
-              <w:rPr>
-                <w:rFonts w:eastAsia="Times New Roman"/>
-                <w:color w:val="000000"/>
-              </w:rPr>
+            <w:proofErr w:type="spellStart"/>
+            <w:r>
+              <w:rPr>
+                <w:rFonts w:eastAsia="Times New Roman"/>
+                <w:color w:val="000000"/>
+              </w:rPr>
+              <w:lastRenderedPageBreak/>
               <w:t>sale_code</w:t>
             </w:r>
-          </w:p>
-        </w:tc>
-        <w:tc>
-          <w:tcPr>
-            <w:tcW w:w="0" w:type="auto"/>
-            <w:tcMar>
-              <w:top w:w="100" w:type="dxa"/>
-              <w:left w:w="120" w:type="dxa"/>
-              <w:bottom w:w="100" w:type="dxa"/>
-              <w:right w:w="120" w:type="dxa"/>
-            </w:tcMar>
-            <w:hideMark/>
-          </w:tcPr>
-          <w:p>
-            <w:pPr>
-              <w:spacing w:after="480"/>
-              <w:rPr>
-                <w:rFonts w:eastAsia="Times New Roman"/>
-                <w:color w:val="000000"/>
-              </w:rPr>
-            </w:pPr>
-            <w:r>
-              <w:rPr>
-                <w:rFonts w:eastAsia="Times New Roman"/>
-                <w:color w:val="000000"/>
-              </w:rPr>
-              <w:t>VARCHAR(50)</w:t>
+            <w:proofErr w:type="spellEnd"/>
+          </w:p>
+        </w:tc>
+        <w:tc>
+          <w:tcPr>
+            <w:tcW w:w="0" w:type="auto"/>
+            <w:tcMar>
+              <w:top w:w="100" w:type="dxa"/>
+              <w:left w:w="120" w:type="dxa"/>
+              <w:bottom w:w="100" w:type="dxa"/>
+              <w:right w:w="120" w:type="dxa"/>
+            </w:tcMar>
+            <w:hideMark/>
+          </w:tcPr>
+          <w:p>
+            <w:pPr>
+              <w:spacing w:after="480"/>
+              <w:rPr>
+                <w:rFonts w:eastAsia="Times New Roman"/>
+                <w:color w:val="000000"/>
+              </w:rPr>
+            </w:pPr>
+            <w:proofErr w:type="gramStart"/>
+            <w:r>
+              <w:rPr>
+                <w:rFonts w:eastAsia="Times New Roman"/>
+                <w:color w:val="000000"/>
+              </w:rPr>
+              <w:t>VARCHAR(</w:t>
+            </w:r>
+            <w:proofErr w:type="gramEnd"/>
+            <w:r>
+              <w:rPr>
+                <w:rFonts w:eastAsia="Times New Roman"/>
+                <w:color w:val="000000"/>
+              </w:rPr>
+              <w:t>50)</w:t>
             </w:r>
           </w:p>
         </w:tc>
@@ -17698,6 +18226,7 @@
                 <w:color w:val="000000"/>
               </w:rPr>
             </w:pPr>
+            <w:proofErr w:type="spellStart"/>
             <w:r>
               <w:rPr>
                 <w:rFonts w:eastAsia="Times New Roman"/>
@@ -17705,6 +18234,7 @@
               </w:rPr>
               <w:t>total_centavos</w:t>
             </w:r>
+            <w:proofErr w:type="spellEnd"/>
           </w:p>
         </w:tc>
         <w:tc>
@@ -17847,6 +18377,7 @@
                 <w:color w:val="000000"/>
               </w:rPr>
             </w:pPr>
+            <w:proofErr w:type="spellStart"/>
             <w:r>
               <w:rPr>
                 <w:rFonts w:eastAsia="Times New Roman"/>
@@ -17854,6 +18385,7 @@
               </w:rPr>
               <w:t>cash_received_centavos</w:t>
             </w:r>
+            <w:proofErr w:type="spellEnd"/>
           </w:p>
         </w:tc>
         <w:tc>
@@ -17996,6 +18528,7 @@
                 <w:color w:val="000000"/>
               </w:rPr>
             </w:pPr>
+            <w:proofErr w:type="spellStart"/>
             <w:r>
               <w:rPr>
                 <w:rFonts w:eastAsia="Times New Roman"/>
@@ -18003,6 +18536,7 @@
               </w:rPr>
               <w:t>change_centavos</w:t>
             </w:r>
+            <w:proofErr w:type="spellEnd"/>
           </w:p>
         </w:tc>
         <w:tc>
@@ -18145,6 +18679,7 @@
                 <w:color w:val="000000"/>
               </w:rPr>
             </w:pPr>
+            <w:proofErr w:type="spellStart"/>
             <w:r>
               <w:rPr>
                 <w:rFonts w:eastAsia="Times New Roman"/>
@@ -18152,33 +18687,43 @@
               </w:rPr>
               <w:t>created_by</w:t>
             </w:r>
-          </w:p>
-        </w:tc>
-        <w:tc>
-          <w:tcPr>
-            <w:tcW w:w="0" w:type="auto"/>
-            <w:tcMar>
-              <w:top w:w="100" w:type="dxa"/>
-              <w:left w:w="120" w:type="dxa"/>
-              <w:bottom w:w="100" w:type="dxa"/>
-              <w:right w:w="120" w:type="dxa"/>
-            </w:tcMar>
-            <w:hideMark/>
-          </w:tcPr>
-          <w:p>
-            <w:pPr>
-              <w:spacing w:after="480"/>
-              <w:rPr>
-                <w:rFonts w:eastAsia="Times New Roman"/>
-                <w:color w:val="000000"/>
-              </w:rPr>
-            </w:pPr>
-            <w:r>
-              <w:rPr>
-                <w:rFonts w:eastAsia="Times New Roman"/>
-                <w:color w:val="000000"/>
-              </w:rPr>
-              <w:t>VARCHAR(100)</w:t>
+            <w:proofErr w:type="spellEnd"/>
+          </w:p>
+        </w:tc>
+        <w:tc>
+          <w:tcPr>
+            <w:tcW w:w="0" w:type="auto"/>
+            <w:tcMar>
+              <w:top w:w="100" w:type="dxa"/>
+              <w:left w:w="120" w:type="dxa"/>
+              <w:bottom w:w="100" w:type="dxa"/>
+              <w:right w:w="120" w:type="dxa"/>
+            </w:tcMar>
+            <w:hideMark/>
+          </w:tcPr>
+          <w:p>
+            <w:pPr>
+              <w:spacing w:after="480"/>
+              <w:rPr>
+                <w:rFonts w:eastAsia="Times New Roman"/>
+                <w:color w:val="000000"/>
+              </w:rPr>
+            </w:pPr>
+            <w:proofErr w:type="gramStart"/>
+            <w:r>
+              <w:rPr>
+                <w:rFonts w:eastAsia="Times New Roman"/>
+                <w:color w:val="000000"/>
+              </w:rPr>
+              <w:t>VARCHAR(</w:t>
+            </w:r>
+            <w:proofErr w:type="gramEnd"/>
+            <w:r>
+              <w:rPr>
+                <w:rFonts w:eastAsia="Times New Roman"/>
+                <w:color w:val="000000"/>
+              </w:rPr>
+              <w:t>100)</w:t>
             </w:r>
           </w:p>
         </w:tc>
@@ -18294,6 +18839,7 @@
                 <w:color w:val="000000"/>
               </w:rPr>
             </w:pPr>
+            <w:proofErr w:type="spellStart"/>
             <w:r>
               <w:rPr>
                 <w:rFonts w:eastAsia="Times New Roman"/>
@@ -18301,6 +18847,7 @@
               </w:rPr>
               <w:t>created_at</w:t>
             </w:r>
+            <w:proofErr w:type="spellEnd"/>
           </w:p>
         </w:tc>
         <w:tc>
@@ -18440,8 +18987,21 @@
           <w:color w:val="000000"/>
           <w:lang w:val="en"/>
         </w:rPr>
-        <w:t>Table 13. Walkin_Sale_Items</w:t>
+        <w:lastRenderedPageBreak/>
+        <w:t xml:space="preserve">Table 13. </w:t>
       </w:r>
+      <w:proofErr w:type="spellStart"/>
+      <w:r>
+        <w:rPr>
+          <w:rFonts w:eastAsia="Times New Roman"/>
+          <w:b/>
+          <w:bCs/>
+          <w:color w:val="000000"/>
+          <w:lang w:val="en"/>
+        </w:rPr>
+        <w:t>Walkin_Sale_Items</w:t>
+      </w:r>
+      <w:proofErr w:type="spellEnd"/>
     </w:p>
     <w:tbl>
       <w:tblPr>
@@ -18822,6 +19382,7 @@
                 <w:color w:val="000000"/>
               </w:rPr>
             </w:pPr>
+            <w:proofErr w:type="spellStart"/>
             <w:r>
               <w:rPr>
                 <w:rFonts w:eastAsia="Times New Roman"/>
@@ -18829,6 +19390,7 @@
               </w:rPr>
               <w:t>sale_id</w:t>
             </w:r>
+            <w:proofErr w:type="spellEnd"/>
           </w:p>
         </w:tc>
         <w:tc>
@@ -18941,7 +19503,23 @@
                 <w:rFonts w:eastAsia="Times New Roman"/>
                 <w:color w:val="000000"/>
               </w:rPr>
-              <w:t>References walkin_sales(id) indicating parent sale</w:t>
+              <w:t xml:space="preserve">References </w:t>
+            </w:r>
+            <w:proofErr w:type="spellStart"/>
+            <w:r>
+              <w:rPr>
+                <w:rFonts w:eastAsia="Times New Roman"/>
+                <w:color w:val="000000"/>
+              </w:rPr>
+              <w:t>walkin_sales</w:t>
+            </w:r>
+            <w:proofErr w:type="spellEnd"/>
+            <w:r>
+              <w:rPr>
+                <w:rFonts w:eastAsia="Times New Roman"/>
+                <w:color w:val="000000"/>
+              </w:rPr>
+              <w:t>(id) indicating parent sale</w:t>
             </w:r>
           </w:p>
         </w:tc>
@@ -18971,6 +19549,7 @@
                 <w:color w:val="000000"/>
               </w:rPr>
             </w:pPr>
+            <w:proofErr w:type="spellStart"/>
             <w:r>
               <w:rPr>
                 <w:rFonts w:eastAsia="Times New Roman"/>
@@ -18978,6 +19557,7 @@
               </w:rPr>
               <w:t>product_id</w:t>
             </w:r>
+            <w:proofErr w:type="spellEnd"/>
           </w:p>
         </w:tc>
         <w:tc>
@@ -19120,6 +19700,7 @@
                 <w:color w:val="000000"/>
               </w:rPr>
             </w:pPr>
+            <w:proofErr w:type="spellStart"/>
             <w:r>
               <w:rPr>
                 <w:rFonts w:eastAsia="Times New Roman"/>
@@ -19127,33 +19708,43 @@
               </w:rPr>
               <w:t>product_name</w:t>
             </w:r>
-          </w:p>
-        </w:tc>
-        <w:tc>
-          <w:tcPr>
-            <w:tcW w:w="0" w:type="auto"/>
-            <w:tcMar>
-              <w:top w:w="100" w:type="dxa"/>
-              <w:left w:w="120" w:type="dxa"/>
-              <w:bottom w:w="100" w:type="dxa"/>
-              <w:right w:w="120" w:type="dxa"/>
-            </w:tcMar>
-            <w:hideMark/>
-          </w:tcPr>
-          <w:p>
-            <w:pPr>
-              <w:spacing w:after="480"/>
-              <w:rPr>
-                <w:rFonts w:eastAsia="Times New Roman"/>
-                <w:color w:val="000000"/>
-              </w:rPr>
-            </w:pPr>
-            <w:r>
-              <w:rPr>
-                <w:rFonts w:eastAsia="Times New Roman"/>
-                <w:color w:val="000000"/>
-              </w:rPr>
-              <w:t>VARCHAR(255)</w:t>
+            <w:proofErr w:type="spellEnd"/>
+          </w:p>
+        </w:tc>
+        <w:tc>
+          <w:tcPr>
+            <w:tcW w:w="0" w:type="auto"/>
+            <w:tcMar>
+              <w:top w:w="100" w:type="dxa"/>
+              <w:left w:w="120" w:type="dxa"/>
+              <w:bottom w:w="100" w:type="dxa"/>
+              <w:right w:w="120" w:type="dxa"/>
+            </w:tcMar>
+            <w:hideMark/>
+          </w:tcPr>
+          <w:p>
+            <w:pPr>
+              <w:spacing w:after="480"/>
+              <w:rPr>
+                <w:rFonts w:eastAsia="Times New Roman"/>
+                <w:color w:val="000000"/>
+              </w:rPr>
+            </w:pPr>
+            <w:proofErr w:type="gramStart"/>
+            <w:r>
+              <w:rPr>
+                <w:rFonts w:eastAsia="Times New Roman"/>
+                <w:color w:val="000000"/>
+              </w:rPr>
+              <w:t>VARCHAR(</w:t>
+            </w:r>
+            <w:proofErr w:type="gramEnd"/>
+            <w:r>
+              <w:rPr>
+                <w:rFonts w:eastAsia="Times New Roman"/>
+                <w:color w:val="000000"/>
+              </w:rPr>
+              <w:t>255)</w:t>
             </w:r>
           </w:p>
         </w:tc>
@@ -19269,6 +19860,7 @@
                 <w:color w:val="000000"/>
               </w:rPr>
             </w:pPr>
+            <w:proofErr w:type="spellStart"/>
             <w:r>
               <w:rPr>
                 <w:rFonts w:eastAsia="Times New Roman"/>
@@ -19276,6 +19868,7 @@
               </w:rPr>
               <w:t>pieces_per_bundle</w:t>
             </w:r>
+            <w:proofErr w:type="spellEnd"/>
           </w:p>
         </w:tc>
         <w:tc>
@@ -19446,12 +20039,21 @@
                 <w:color w:val="000000"/>
               </w:rPr>
             </w:pPr>
-            <w:r>
-              <w:rPr>
-                <w:rFonts w:eastAsia="Times New Roman"/>
-                <w:color w:val="000000"/>
-              </w:rPr>
-              <w:t>VARCHAR(10)</w:t>
+            <w:proofErr w:type="gramStart"/>
+            <w:r>
+              <w:rPr>
+                <w:rFonts w:eastAsia="Times New Roman"/>
+                <w:color w:val="000000"/>
+              </w:rPr>
+              <w:t>VARCHAR(</w:t>
+            </w:r>
+            <w:proofErr w:type="gramEnd"/>
+            <w:r>
+              <w:rPr>
+                <w:rFonts w:eastAsia="Times New Roman"/>
+                <w:color w:val="000000"/>
+              </w:rPr>
+              <w:t>10)</w:t>
             </w:r>
           </w:p>
         </w:tc>
@@ -19716,13 +20318,16 @@
                 <w:color w:val="000000"/>
               </w:rPr>
             </w:pPr>
-            <w:r>
-              <w:rPr>
-                <w:rFonts w:eastAsia="Times New Roman"/>
-                <w:color w:val="000000"/>
-              </w:rPr>
+            <w:proofErr w:type="spellStart"/>
+            <w:r>
+              <w:rPr>
+                <w:rFonts w:eastAsia="Times New Roman"/>
+                <w:color w:val="000000"/>
+              </w:rPr>
+              <w:lastRenderedPageBreak/>
               <w:t>unit_price_centavos</w:t>
             </w:r>
+            <w:proofErr w:type="spellEnd"/>
           </w:p>
         </w:tc>
         <w:tc>
@@ -19865,6 +20470,7 @@
                 <w:color w:val="000000"/>
               </w:rPr>
             </w:pPr>
+            <w:proofErr w:type="spellStart"/>
             <w:r>
               <w:rPr>
                 <w:rFonts w:eastAsia="Times New Roman"/>
@@ -19872,6 +20478,7 @@
               </w:rPr>
               <w:t>line_total_centavos</w:t>
             </w:r>
+            <w:proofErr w:type="spellEnd"/>
           </w:p>
         </w:tc>
         <w:tc>
@@ -20421,12 +21028,21 @@
                 <w:color w:val="000000"/>
               </w:rPr>
             </w:pPr>
-            <w:r>
-              <w:rPr>
-                <w:rFonts w:eastAsia="Times New Roman"/>
-                <w:color w:val="000000"/>
-              </w:rPr>
-              <w:t>VARCHAR(255)</w:t>
+            <w:proofErr w:type="gramStart"/>
+            <w:r>
+              <w:rPr>
+                <w:rFonts w:eastAsia="Times New Roman"/>
+                <w:color w:val="000000"/>
+              </w:rPr>
+              <w:t>VARCHAR(</w:t>
+            </w:r>
+            <w:proofErr w:type="gramEnd"/>
+            <w:r>
+              <w:rPr>
+                <w:rFonts w:eastAsia="Times New Roman"/>
+                <w:color w:val="000000"/>
+              </w:rPr>
+              <w:t>255)</w:t>
             </w:r>
           </w:p>
         </w:tc>
@@ -20542,6 +21158,7 @@
                 <w:color w:val="000000"/>
               </w:rPr>
             </w:pPr>
+            <w:proofErr w:type="spellStart"/>
             <w:r>
               <w:rPr>
                 <w:rFonts w:eastAsia="Times New Roman"/>
@@ -20549,33 +21166,43 @@
               </w:rPr>
               <w:t>stock_quantity</w:t>
             </w:r>
-          </w:p>
-        </w:tc>
-        <w:tc>
-          <w:tcPr>
-            <w:tcW w:w="0" w:type="auto"/>
-            <w:tcMar>
-              <w:top w:w="100" w:type="dxa"/>
-              <w:left w:w="120" w:type="dxa"/>
-              <w:bottom w:w="100" w:type="dxa"/>
-              <w:right w:w="120" w:type="dxa"/>
-            </w:tcMar>
-            <w:hideMark/>
-          </w:tcPr>
-          <w:p>
-            <w:pPr>
-              <w:spacing w:after="480"/>
-              <w:rPr>
-                <w:rFonts w:eastAsia="Times New Roman"/>
-                <w:color w:val="000000"/>
-              </w:rPr>
-            </w:pPr>
-            <w:r>
-              <w:rPr>
-                <w:rFonts w:eastAsia="Times New Roman"/>
-                <w:color w:val="000000"/>
-              </w:rPr>
-              <w:t>DECIMAL(12,3)</w:t>
+            <w:proofErr w:type="spellEnd"/>
+          </w:p>
+        </w:tc>
+        <w:tc>
+          <w:tcPr>
+            <w:tcW w:w="0" w:type="auto"/>
+            <w:tcMar>
+              <w:top w:w="100" w:type="dxa"/>
+              <w:left w:w="120" w:type="dxa"/>
+              <w:bottom w:w="100" w:type="dxa"/>
+              <w:right w:w="120" w:type="dxa"/>
+            </w:tcMar>
+            <w:hideMark/>
+          </w:tcPr>
+          <w:p>
+            <w:pPr>
+              <w:spacing w:after="480"/>
+              <w:rPr>
+                <w:rFonts w:eastAsia="Times New Roman"/>
+                <w:color w:val="000000"/>
+              </w:rPr>
+            </w:pPr>
+            <w:proofErr w:type="gramStart"/>
+            <w:r>
+              <w:rPr>
+                <w:rFonts w:eastAsia="Times New Roman"/>
+                <w:color w:val="000000"/>
+              </w:rPr>
+              <w:t>DECIMAL(</w:t>
+            </w:r>
+            <w:proofErr w:type="gramEnd"/>
+            <w:r>
+              <w:rPr>
+                <w:rFonts w:eastAsia="Times New Roman"/>
+                <w:color w:val="000000"/>
+              </w:rPr>
+              <w:t>12,3)</w:t>
             </w:r>
           </w:p>
         </w:tc>
@@ -20719,12 +21346,21 @@
                 <w:color w:val="000000"/>
               </w:rPr>
             </w:pPr>
-            <w:r>
-              <w:rPr>
-                <w:rFonts w:eastAsia="Times New Roman"/>
-                <w:color w:val="000000"/>
-              </w:rPr>
-              <w:t>VARCHAR(20)</w:t>
+            <w:proofErr w:type="gramStart"/>
+            <w:r>
+              <w:rPr>
+                <w:rFonts w:eastAsia="Times New Roman"/>
+                <w:color w:val="000000"/>
+              </w:rPr>
+              <w:t>VARCHAR(</w:t>
+            </w:r>
+            <w:proofErr w:type="gramEnd"/>
+            <w:r>
+              <w:rPr>
+                <w:rFonts w:eastAsia="Times New Roman"/>
+                <w:color w:val="000000"/>
+              </w:rPr>
+              <w:t>20)</w:t>
             </w:r>
           </w:p>
         </w:tc>
@@ -20840,40 +21476,52 @@
                 <w:color w:val="000000"/>
               </w:rPr>
             </w:pPr>
-            <w:r>
-              <w:rPr>
-                <w:rFonts w:eastAsia="Times New Roman"/>
-                <w:color w:val="000000"/>
-              </w:rPr>
+            <w:proofErr w:type="spellStart"/>
+            <w:r>
+              <w:rPr>
+                <w:rFonts w:eastAsia="Times New Roman"/>
+                <w:color w:val="000000"/>
+              </w:rPr>
+              <w:lastRenderedPageBreak/>
               <w:t>reorder_level</w:t>
             </w:r>
-          </w:p>
-        </w:tc>
-        <w:tc>
-          <w:tcPr>
-            <w:tcW w:w="0" w:type="auto"/>
-            <w:tcMar>
-              <w:top w:w="100" w:type="dxa"/>
-              <w:left w:w="120" w:type="dxa"/>
-              <w:bottom w:w="100" w:type="dxa"/>
-              <w:right w:w="120" w:type="dxa"/>
-            </w:tcMar>
-            <w:hideMark/>
-          </w:tcPr>
-          <w:p>
-            <w:pPr>
-              <w:spacing w:after="480"/>
-              <w:rPr>
-                <w:rFonts w:eastAsia="Times New Roman"/>
-                <w:color w:val="000000"/>
-              </w:rPr>
-            </w:pPr>
-            <w:r>
-              <w:rPr>
-                <w:rFonts w:eastAsia="Times New Roman"/>
-                <w:color w:val="000000"/>
-              </w:rPr>
-              <w:t>DECIMAL(12,3)</w:t>
+            <w:proofErr w:type="spellEnd"/>
+          </w:p>
+        </w:tc>
+        <w:tc>
+          <w:tcPr>
+            <w:tcW w:w="0" w:type="auto"/>
+            <w:tcMar>
+              <w:top w:w="100" w:type="dxa"/>
+              <w:left w:w="120" w:type="dxa"/>
+              <w:bottom w:w="100" w:type="dxa"/>
+              <w:right w:w="120" w:type="dxa"/>
+            </w:tcMar>
+            <w:hideMark/>
+          </w:tcPr>
+          <w:p>
+            <w:pPr>
+              <w:spacing w:after="480"/>
+              <w:rPr>
+                <w:rFonts w:eastAsia="Times New Roman"/>
+                <w:color w:val="000000"/>
+              </w:rPr>
+            </w:pPr>
+            <w:proofErr w:type="gramStart"/>
+            <w:r>
+              <w:rPr>
+                <w:rFonts w:eastAsia="Times New Roman"/>
+                <w:color w:val="000000"/>
+              </w:rPr>
+              <w:t>DECIMAL(</w:t>
+            </w:r>
+            <w:proofErr w:type="gramEnd"/>
+            <w:r>
+              <w:rPr>
+                <w:rFonts w:eastAsia="Times New Roman"/>
+                <w:color w:val="000000"/>
+              </w:rPr>
+              <w:t>12,3)</w:t>
             </w:r>
           </w:p>
         </w:tc>
@@ -20989,6 +21637,7 @@
                 <w:color w:val="000000"/>
               </w:rPr>
             </w:pPr>
+            <w:proofErr w:type="spellStart"/>
             <w:r>
               <w:rPr>
                 <w:rFonts w:eastAsia="Times New Roman"/>
@@ -20996,33 +21645,43 @@
               </w:rPr>
               <w:t>cost_per_unit</w:t>
             </w:r>
-          </w:p>
-        </w:tc>
-        <w:tc>
-          <w:tcPr>
-            <w:tcW w:w="0" w:type="auto"/>
-            <w:tcMar>
-              <w:top w:w="100" w:type="dxa"/>
-              <w:left w:w="120" w:type="dxa"/>
-              <w:bottom w:w="100" w:type="dxa"/>
-              <w:right w:w="120" w:type="dxa"/>
-            </w:tcMar>
-            <w:hideMark/>
-          </w:tcPr>
-          <w:p>
-            <w:pPr>
-              <w:spacing w:after="480"/>
-              <w:rPr>
-                <w:rFonts w:eastAsia="Times New Roman"/>
-                <w:color w:val="000000"/>
-              </w:rPr>
-            </w:pPr>
-            <w:r>
-              <w:rPr>
-                <w:rFonts w:eastAsia="Times New Roman"/>
-                <w:color w:val="000000"/>
-              </w:rPr>
-              <w:t>DECIMAL(12,2)</w:t>
+            <w:proofErr w:type="spellEnd"/>
+          </w:p>
+        </w:tc>
+        <w:tc>
+          <w:tcPr>
+            <w:tcW w:w="0" w:type="auto"/>
+            <w:tcMar>
+              <w:top w:w="100" w:type="dxa"/>
+              <w:left w:w="120" w:type="dxa"/>
+              <w:bottom w:w="100" w:type="dxa"/>
+              <w:right w:w="120" w:type="dxa"/>
+            </w:tcMar>
+            <w:hideMark/>
+          </w:tcPr>
+          <w:p>
+            <w:pPr>
+              <w:spacing w:after="480"/>
+              <w:rPr>
+                <w:rFonts w:eastAsia="Times New Roman"/>
+                <w:color w:val="000000"/>
+              </w:rPr>
+            </w:pPr>
+            <w:proofErr w:type="gramStart"/>
+            <w:r>
+              <w:rPr>
+                <w:rFonts w:eastAsia="Times New Roman"/>
+                <w:color w:val="000000"/>
+              </w:rPr>
+              <w:t>DECIMAL(</w:t>
+            </w:r>
+            <w:proofErr w:type="gramEnd"/>
+            <w:r>
+              <w:rPr>
+                <w:rFonts w:eastAsia="Times New Roman"/>
+                <w:color w:val="000000"/>
+              </w:rPr>
+              <w:t>12,2)</w:t>
             </w:r>
           </w:p>
         </w:tc>
@@ -21138,6 +21797,7 @@
                 <w:color w:val="000000"/>
               </w:rPr>
             </w:pPr>
+            <w:proofErr w:type="spellStart"/>
             <w:r>
               <w:rPr>
                 <w:rFonts w:eastAsia="Times New Roman"/>
@@ -21145,6 +21805,7 @@
               </w:rPr>
               <w:t>expiry_date</w:t>
             </w:r>
+            <w:proofErr w:type="spellEnd"/>
           </w:p>
         </w:tc>
         <w:tc>
@@ -21287,6 +21948,7 @@
                 <w:color w:val="000000"/>
               </w:rPr>
             </w:pPr>
+            <w:proofErr w:type="spellStart"/>
             <w:r>
               <w:rPr>
                 <w:rFonts w:eastAsia="Times New Roman"/>
@@ -21294,6 +21956,7 @@
               </w:rPr>
               <w:t>stock_updated_at</w:t>
             </w:r>
+            <w:proofErr w:type="spellEnd"/>
           </w:p>
         </w:tc>
         <w:tc>
@@ -21436,6 +22099,7 @@
                 <w:color w:val="000000"/>
               </w:rPr>
             </w:pPr>
+            <w:proofErr w:type="spellStart"/>
             <w:r>
               <w:rPr>
                 <w:rFonts w:eastAsia="Times New Roman"/>
@@ -21443,6 +22107,7 @@
               </w:rPr>
               <w:t>created_at</w:t>
             </w:r>
+            <w:proofErr w:type="spellEnd"/>
           </w:p>
         </w:tc>
         <w:tc>
@@ -21585,6 +22250,7 @@
                 <w:color w:val="000000"/>
               </w:rPr>
             </w:pPr>
+            <w:proofErr w:type="spellStart"/>
             <w:r>
               <w:rPr>
                 <w:rFonts w:eastAsia="Times New Roman"/>
@@ -21592,6 +22258,7 @@
               </w:rPr>
               <w:t>updated_at</w:t>
             </w:r>
+            <w:proofErr w:type="spellEnd"/>
           </w:p>
         </w:tc>
         <w:tc>
@@ -21731,8 +22398,20 @@
           <w:color w:val="000000"/>
           <w:lang w:val="en"/>
         </w:rPr>
-        <w:t>Table 15. Inventory_Movements</w:t>
+        <w:t xml:space="preserve">Table 15. </w:t>
       </w:r>
+      <w:proofErr w:type="spellStart"/>
+      <w:r>
+        <w:rPr>
+          <w:rFonts w:eastAsia="Times New Roman"/>
+          <w:b/>
+          <w:bCs/>
+          <w:color w:val="000000"/>
+          <w:lang w:val="en"/>
+        </w:rPr>
+        <w:t>Inventory_Movements</w:t>
+      </w:r>
+      <w:proofErr w:type="spellEnd"/>
     </w:p>
     <w:tbl>
       <w:tblPr>
@@ -22113,13 +22792,16 @@
                 <w:color w:val="000000"/>
               </w:rPr>
             </w:pPr>
-            <w:r>
-              <w:rPr>
-                <w:rFonts w:eastAsia="Times New Roman"/>
-                <w:color w:val="000000"/>
-              </w:rPr>
+            <w:proofErr w:type="spellStart"/>
+            <w:r>
+              <w:rPr>
+                <w:rFonts w:eastAsia="Times New Roman"/>
+                <w:color w:val="000000"/>
+              </w:rPr>
+              <w:lastRenderedPageBreak/>
               <w:t>ingredient_id</w:t>
             </w:r>
+            <w:proofErr w:type="spellEnd"/>
           </w:p>
         </w:tc>
         <w:tc>
@@ -22262,6 +22944,7 @@
                 <w:color w:val="000000"/>
               </w:rPr>
             </w:pPr>
+            <w:proofErr w:type="spellStart"/>
             <w:r>
               <w:rPr>
                 <w:rFonts w:eastAsia="Times New Roman"/>
@@ -22269,33 +22952,43 @@
               </w:rPr>
               <w:t>movement_type</w:t>
             </w:r>
-          </w:p>
-        </w:tc>
-        <w:tc>
-          <w:tcPr>
-            <w:tcW w:w="0" w:type="auto"/>
-            <w:tcMar>
-              <w:top w:w="100" w:type="dxa"/>
-              <w:left w:w="120" w:type="dxa"/>
-              <w:bottom w:w="100" w:type="dxa"/>
-              <w:right w:w="120" w:type="dxa"/>
-            </w:tcMar>
-            <w:hideMark/>
-          </w:tcPr>
-          <w:p>
-            <w:pPr>
-              <w:spacing w:after="480"/>
-              <w:rPr>
-                <w:rFonts w:eastAsia="Times New Roman"/>
-                <w:color w:val="000000"/>
-              </w:rPr>
-            </w:pPr>
-            <w:r>
-              <w:rPr>
-                <w:rFonts w:eastAsia="Times New Roman"/>
-                <w:color w:val="000000"/>
-              </w:rPr>
-              <w:t>VARCHAR(20)</w:t>
+            <w:proofErr w:type="spellEnd"/>
+          </w:p>
+        </w:tc>
+        <w:tc>
+          <w:tcPr>
+            <w:tcW w:w="0" w:type="auto"/>
+            <w:tcMar>
+              <w:top w:w="100" w:type="dxa"/>
+              <w:left w:w="120" w:type="dxa"/>
+              <w:bottom w:w="100" w:type="dxa"/>
+              <w:right w:w="120" w:type="dxa"/>
+            </w:tcMar>
+            <w:hideMark/>
+          </w:tcPr>
+          <w:p>
+            <w:pPr>
+              <w:spacing w:after="480"/>
+              <w:rPr>
+                <w:rFonts w:eastAsia="Times New Roman"/>
+                <w:color w:val="000000"/>
+              </w:rPr>
+            </w:pPr>
+            <w:proofErr w:type="gramStart"/>
+            <w:r>
+              <w:rPr>
+                <w:rFonts w:eastAsia="Times New Roman"/>
+                <w:color w:val="000000"/>
+              </w:rPr>
+              <w:t>VARCHAR(</w:t>
+            </w:r>
+            <w:proofErr w:type="gramEnd"/>
+            <w:r>
+              <w:rPr>
+                <w:rFonts w:eastAsia="Times New Roman"/>
+                <w:color w:val="000000"/>
+              </w:rPr>
+              <w:t>20)</w:t>
             </w:r>
           </w:p>
         </w:tc>
@@ -22411,6 +23104,7 @@
                 <w:color w:val="000000"/>
               </w:rPr>
             </w:pPr>
+            <w:proofErr w:type="spellStart"/>
             <w:r>
               <w:rPr>
                 <w:rFonts w:eastAsia="Times New Roman"/>
@@ -22418,33 +23112,43 @@
               </w:rPr>
               <w:t>quantity_change</w:t>
             </w:r>
-          </w:p>
-        </w:tc>
-        <w:tc>
-          <w:tcPr>
-            <w:tcW w:w="0" w:type="auto"/>
-            <w:tcMar>
-              <w:top w:w="100" w:type="dxa"/>
-              <w:left w:w="120" w:type="dxa"/>
-              <w:bottom w:w="100" w:type="dxa"/>
-              <w:right w:w="120" w:type="dxa"/>
-            </w:tcMar>
-            <w:hideMark/>
-          </w:tcPr>
-          <w:p>
-            <w:pPr>
-              <w:spacing w:after="480"/>
-              <w:rPr>
-                <w:rFonts w:eastAsia="Times New Roman"/>
-                <w:color w:val="000000"/>
-              </w:rPr>
-            </w:pPr>
-            <w:r>
-              <w:rPr>
-                <w:rFonts w:eastAsia="Times New Roman"/>
-                <w:color w:val="000000"/>
-              </w:rPr>
-              <w:t>DECIMAL(12,3)</w:t>
+            <w:proofErr w:type="spellEnd"/>
+          </w:p>
+        </w:tc>
+        <w:tc>
+          <w:tcPr>
+            <w:tcW w:w="0" w:type="auto"/>
+            <w:tcMar>
+              <w:top w:w="100" w:type="dxa"/>
+              <w:left w:w="120" w:type="dxa"/>
+              <w:bottom w:w="100" w:type="dxa"/>
+              <w:right w:w="120" w:type="dxa"/>
+            </w:tcMar>
+            <w:hideMark/>
+          </w:tcPr>
+          <w:p>
+            <w:pPr>
+              <w:spacing w:after="480"/>
+              <w:rPr>
+                <w:rFonts w:eastAsia="Times New Roman"/>
+                <w:color w:val="000000"/>
+              </w:rPr>
+            </w:pPr>
+            <w:proofErr w:type="gramStart"/>
+            <w:r>
+              <w:rPr>
+                <w:rFonts w:eastAsia="Times New Roman"/>
+                <w:color w:val="000000"/>
+              </w:rPr>
+              <w:t>DECIMAL(</w:t>
+            </w:r>
+            <w:proofErr w:type="gramEnd"/>
+            <w:r>
+              <w:rPr>
+                <w:rFonts w:eastAsia="Times New Roman"/>
+                <w:color w:val="000000"/>
+              </w:rPr>
+              <w:t>12,3)</w:t>
             </w:r>
           </w:p>
         </w:tc>
@@ -22560,6 +23264,7 @@
                 <w:color w:val="000000"/>
               </w:rPr>
             </w:pPr>
+            <w:proofErr w:type="spellStart"/>
             <w:r>
               <w:rPr>
                 <w:rFonts w:eastAsia="Times New Roman"/>
@@ -22567,33 +23272,43 @@
               </w:rPr>
               <w:t>quantity_before</w:t>
             </w:r>
-          </w:p>
-        </w:tc>
-        <w:tc>
-          <w:tcPr>
-            <w:tcW w:w="0" w:type="auto"/>
-            <w:tcMar>
-              <w:top w:w="100" w:type="dxa"/>
-              <w:left w:w="120" w:type="dxa"/>
-              <w:bottom w:w="100" w:type="dxa"/>
-              <w:right w:w="120" w:type="dxa"/>
-            </w:tcMar>
-            <w:hideMark/>
-          </w:tcPr>
-          <w:p>
-            <w:pPr>
-              <w:spacing w:after="480"/>
-              <w:rPr>
-                <w:rFonts w:eastAsia="Times New Roman"/>
-                <w:color w:val="000000"/>
-              </w:rPr>
-            </w:pPr>
-            <w:r>
-              <w:rPr>
-                <w:rFonts w:eastAsia="Times New Roman"/>
-                <w:color w:val="000000"/>
-              </w:rPr>
-              <w:t>DECIMAL(12,3)</w:t>
+            <w:proofErr w:type="spellEnd"/>
+          </w:p>
+        </w:tc>
+        <w:tc>
+          <w:tcPr>
+            <w:tcW w:w="0" w:type="auto"/>
+            <w:tcMar>
+              <w:top w:w="100" w:type="dxa"/>
+              <w:left w:w="120" w:type="dxa"/>
+              <w:bottom w:w="100" w:type="dxa"/>
+              <w:right w:w="120" w:type="dxa"/>
+            </w:tcMar>
+            <w:hideMark/>
+          </w:tcPr>
+          <w:p>
+            <w:pPr>
+              <w:spacing w:after="480"/>
+              <w:rPr>
+                <w:rFonts w:eastAsia="Times New Roman"/>
+                <w:color w:val="000000"/>
+              </w:rPr>
+            </w:pPr>
+            <w:proofErr w:type="gramStart"/>
+            <w:r>
+              <w:rPr>
+                <w:rFonts w:eastAsia="Times New Roman"/>
+                <w:color w:val="000000"/>
+              </w:rPr>
+              <w:t>DECIMAL(</w:t>
+            </w:r>
+            <w:proofErr w:type="gramEnd"/>
+            <w:r>
+              <w:rPr>
+                <w:rFonts w:eastAsia="Times New Roman"/>
+                <w:color w:val="000000"/>
+              </w:rPr>
+              <w:t>12,3)</w:t>
             </w:r>
           </w:p>
         </w:tc>
@@ -22709,6 +23424,7 @@
                 <w:color w:val="000000"/>
               </w:rPr>
             </w:pPr>
+            <w:proofErr w:type="spellStart"/>
             <w:r>
               <w:rPr>
                 <w:rFonts w:eastAsia="Times New Roman"/>
@@ -22716,33 +23432,43 @@
               </w:rPr>
               <w:t>quantity_after</w:t>
             </w:r>
-          </w:p>
-        </w:tc>
-        <w:tc>
-          <w:tcPr>
-            <w:tcW w:w="0" w:type="auto"/>
-            <w:tcMar>
-              <w:top w:w="100" w:type="dxa"/>
-              <w:left w:w="120" w:type="dxa"/>
-              <w:bottom w:w="100" w:type="dxa"/>
-              <w:right w:w="120" w:type="dxa"/>
-            </w:tcMar>
-            <w:hideMark/>
-          </w:tcPr>
-          <w:p>
-            <w:pPr>
-              <w:spacing w:after="480"/>
-              <w:rPr>
-                <w:rFonts w:eastAsia="Times New Roman"/>
-                <w:color w:val="000000"/>
-              </w:rPr>
-            </w:pPr>
-            <w:r>
-              <w:rPr>
-                <w:rFonts w:eastAsia="Times New Roman"/>
-                <w:color w:val="000000"/>
-              </w:rPr>
-              <w:t>DECIMAL(12,3)</w:t>
+            <w:proofErr w:type="spellEnd"/>
+          </w:p>
+        </w:tc>
+        <w:tc>
+          <w:tcPr>
+            <w:tcW w:w="0" w:type="auto"/>
+            <w:tcMar>
+              <w:top w:w="100" w:type="dxa"/>
+              <w:left w:w="120" w:type="dxa"/>
+              <w:bottom w:w="100" w:type="dxa"/>
+              <w:right w:w="120" w:type="dxa"/>
+            </w:tcMar>
+            <w:hideMark/>
+          </w:tcPr>
+          <w:p>
+            <w:pPr>
+              <w:spacing w:after="480"/>
+              <w:rPr>
+                <w:rFonts w:eastAsia="Times New Roman"/>
+                <w:color w:val="000000"/>
+              </w:rPr>
+            </w:pPr>
+            <w:proofErr w:type="gramStart"/>
+            <w:r>
+              <w:rPr>
+                <w:rFonts w:eastAsia="Times New Roman"/>
+                <w:color w:val="000000"/>
+              </w:rPr>
+              <w:t>DECIMAL(</w:t>
+            </w:r>
+            <w:proofErr w:type="gramEnd"/>
+            <w:r>
+              <w:rPr>
+                <w:rFonts w:eastAsia="Times New Roman"/>
+                <w:color w:val="000000"/>
+              </w:rPr>
+              <w:t>12,3)</w:t>
             </w:r>
           </w:p>
         </w:tc>
@@ -22858,6 +23584,7 @@
                 <w:color w:val="000000"/>
               </w:rPr>
             </w:pPr>
+            <w:proofErr w:type="spellStart"/>
             <w:r>
               <w:rPr>
                 <w:rFonts w:eastAsia="Times New Roman"/>
@@ -22865,33 +23592,43 @@
               </w:rPr>
               <w:t>unit_cost</w:t>
             </w:r>
-          </w:p>
-        </w:tc>
-        <w:tc>
-          <w:tcPr>
-            <w:tcW w:w="0" w:type="auto"/>
-            <w:tcMar>
-              <w:top w:w="100" w:type="dxa"/>
-              <w:left w:w="120" w:type="dxa"/>
-              <w:bottom w:w="100" w:type="dxa"/>
-              <w:right w:w="120" w:type="dxa"/>
-            </w:tcMar>
-            <w:hideMark/>
-          </w:tcPr>
-          <w:p>
-            <w:pPr>
-              <w:spacing w:after="480"/>
-              <w:rPr>
-                <w:rFonts w:eastAsia="Times New Roman"/>
-                <w:color w:val="000000"/>
-              </w:rPr>
-            </w:pPr>
-            <w:r>
-              <w:rPr>
-                <w:rFonts w:eastAsia="Times New Roman"/>
-                <w:color w:val="000000"/>
-              </w:rPr>
-              <w:t>DECIMAL(12,2)</w:t>
+            <w:proofErr w:type="spellEnd"/>
+          </w:p>
+        </w:tc>
+        <w:tc>
+          <w:tcPr>
+            <w:tcW w:w="0" w:type="auto"/>
+            <w:tcMar>
+              <w:top w:w="100" w:type="dxa"/>
+              <w:left w:w="120" w:type="dxa"/>
+              <w:bottom w:w="100" w:type="dxa"/>
+              <w:right w:w="120" w:type="dxa"/>
+            </w:tcMar>
+            <w:hideMark/>
+          </w:tcPr>
+          <w:p>
+            <w:pPr>
+              <w:spacing w:after="480"/>
+              <w:rPr>
+                <w:rFonts w:eastAsia="Times New Roman"/>
+                <w:color w:val="000000"/>
+              </w:rPr>
+            </w:pPr>
+            <w:proofErr w:type="gramStart"/>
+            <w:r>
+              <w:rPr>
+                <w:rFonts w:eastAsia="Times New Roman"/>
+                <w:color w:val="000000"/>
+              </w:rPr>
+              <w:t>DECIMAL(</w:t>
+            </w:r>
+            <w:proofErr w:type="gramEnd"/>
+            <w:r>
+              <w:rPr>
+                <w:rFonts w:eastAsia="Times New Roman"/>
+                <w:color w:val="000000"/>
+              </w:rPr>
+              <w:t>12,2)</w:t>
             </w:r>
           </w:p>
         </w:tc>
@@ -23156,6 +23893,7 @@
                 <w:color w:val="000000"/>
               </w:rPr>
             </w:pPr>
+            <w:proofErr w:type="spellStart"/>
             <w:r>
               <w:rPr>
                 <w:rFonts w:eastAsia="Times New Roman"/>
@@ -23163,33 +23901,43 @@
               </w:rPr>
               <w:t>created_by</w:t>
             </w:r>
-          </w:p>
-        </w:tc>
-        <w:tc>
-          <w:tcPr>
-            <w:tcW w:w="0" w:type="auto"/>
-            <w:tcMar>
-              <w:top w:w="100" w:type="dxa"/>
-              <w:left w:w="120" w:type="dxa"/>
-              <w:bottom w:w="100" w:type="dxa"/>
-              <w:right w:w="120" w:type="dxa"/>
-            </w:tcMar>
-            <w:hideMark/>
-          </w:tcPr>
-          <w:p>
-            <w:pPr>
-              <w:spacing w:after="480"/>
-              <w:rPr>
-                <w:rFonts w:eastAsia="Times New Roman"/>
-                <w:color w:val="000000"/>
-              </w:rPr>
-            </w:pPr>
-            <w:r>
-              <w:rPr>
-                <w:rFonts w:eastAsia="Times New Roman"/>
-                <w:color w:val="000000"/>
-              </w:rPr>
-              <w:t>VARCHAR(100)</w:t>
+            <w:proofErr w:type="spellEnd"/>
+          </w:p>
+        </w:tc>
+        <w:tc>
+          <w:tcPr>
+            <w:tcW w:w="0" w:type="auto"/>
+            <w:tcMar>
+              <w:top w:w="100" w:type="dxa"/>
+              <w:left w:w="120" w:type="dxa"/>
+              <w:bottom w:w="100" w:type="dxa"/>
+              <w:right w:w="120" w:type="dxa"/>
+            </w:tcMar>
+            <w:hideMark/>
+          </w:tcPr>
+          <w:p>
+            <w:pPr>
+              <w:spacing w:after="480"/>
+              <w:rPr>
+                <w:rFonts w:eastAsia="Times New Roman"/>
+                <w:color w:val="000000"/>
+              </w:rPr>
+            </w:pPr>
+            <w:proofErr w:type="gramStart"/>
+            <w:r>
+              <w:rPr>
+                <w:rFonts w:eastAsia="Times New Roman"/>
+                <w:color w:val="000000"/>
+              </w:rPr>
+              <w:t>VARCHAR(</w:t>
+            </w:r>
+            <w:proofErr w:type="gramEnd"/>
+            <w:r>
+              <w:rPr>
+                <w:rFonts w:eastAsia="Times New Roman"/>
+                <w:color w:val="000000"/>
+              </w:rPr>
+              <w:t>100)</w:t>
             </w:r>
           </w:p>
         </w:tc>
@@ -23305,6 +24053,7 @@
                 <w:color w:val="000000"/>
               </w:rPr>
             </w:pPr>
+            <w:proofErr w:type="spellStart"/>
             <w:r>
               <w:rPr>
                 <w:rFonts w:eastAsia="Times New Roman"/>
@@ -23312,6 +24061,7 @@
               </w:rPr>
               <w:t>created_at</w:t>
             </w:r>
+            <w:proofErr w:type="spellEnd"/>
           </w:p>
         </w:tc>
         <w:tc>
@@ -23451,6 +24201,7 @@
           <w:color w:val="000000"/>
           <w:lang w:val="en"/>
         </w:rPr>
+        <w:lastRenderedPageBreak/>
         <w:t>Table 16. Reviews</w:t>
       </w:r>
     </w:p>
@@ -23833,6 +24584,7 @@
                 <w:color w:val="000000"/>
               </w:rPr>
             </w:pPr>
+            <w:proofErr w:type="spellStart"/>
             <w:r>
               <w:rPr>
                 <w:rFonts w:eastAsia="Times New Roman"/>
@@ -23840,6 +24592,7 @@
               </w:rPr>
               <w:t>order_id</w:t>
             </w:r>
+            <w:proofErr w:type="spellEnd"/>
           </w:p>
         </w:tc>
         <w:tc>
@@ -23982,6 +24735,7 @@
                 <w:color w:val="000000"/>
               </w:rPr>
             </w:pPr>
+            <w:proofErr w:type="spellStart"/>
             <w:r>
               <w:rPr>
                 <w:rFonts w:eastAsia="Times New Roman"/>
@@ -23989,6 +24743,7 @@
               </w:rPr>
               <w:t>product_id</w:t>
             </w:r>
+            <w:proofErr w:type="spellEnd"/>
           </w:p>
         </w:tc>
         <w:tc>
@@ -24131,6 +24886,7 @@
                 <w:color w:val="000000"/>
               </w:rPr>
             </w:pPr>
+            <w:proofErr w:type="spellStart"/>
             <w:r>
               <w:rPr>
                 <w:rFonts w:eastAsia="Times New Roman"/>
@@ -24138,6 +24894,7 @@
               </w:rPr>
               <w:t>member_id</w:t>
             </w:r>
+            <w:proofErr w:type="spellEnd"/>
           </w:p>
         </w:tc>
         <w:tc>
@@ -24280,6 +25037,7 @@
                 <w:color w:val="000000"/>
               </w:rPr>
             </w:pPr>
+            <w:proofErr w:type="spellStart"/>
             <w:r>
               <w:rPr>
                 <w:rFonts w:eastAsia="Times New Roman"/>
@@ -24287,33 +25045,43 @@
               </w:rPr>
               <w:t>display_name</w:t>
             </w:r>
-          </w:p>
-        </w:tc>
-        <w:tc>
-          <w:tcPr>
-            <w:tcW w:w="0" w:type="auto"/>
-            <w:tcMar>
-              <w:top w:w="100" w:type="dxa"/>
-              <w:left w:w="120" w:type="dxa"/>
-              <w:bottom w:w="100" w:type="dxa"/>
-              <w:right w:w="120" w:type="dxa"/>
-            </w:tcMar>
-            <w:hideMark/>
-          </w:tcPr>
-          <w:p>
-            <w:pPr>
-              <w:spacing w:after="480"/>
-              <w:rPr>
-                <w:rFonts w:eastAsia="Times New Roman"/>
-                <w:color w:val="000000"/>
-              </w:rPr>
-            </w:pPr>
-            <w:r>
-              <w:rPr>
-                <w:rFonts w:eastAsia="Times New Roman"/>
-                <w:color w:val="000000"/>
-              </w:rPr>
-              <w:t>VARCHAR(255)</w:t>
+            <w:proofErr w:type="spellEnd"/>
+          </w:p>
+        </w:tc>
+        <w:tc>
+          <w:tcPr>
+            <w:tcW w:w="0" w:type="auto"/>
+            <w:tcMar>
+              <w:top w:w="100" w:type="dxa"/>
+              <w:left w:w="120" w:type="dxa"/>
+              <w:bottom w:w="100" w:type="dxa"/>
+              <w:right w:w="120" w:type="dxa"/>
+            </w:tcMar>
+            <w:hideMark/>
+          </w:tcPr>
+          <w:p>
+            <w:pPr>
+              <w:spacing w:after="480"/>
+              <w:rPr>
+                <w:rFonts w:eastAsia="Times New Roman"/>
+                <w:color w:val="000000"/>
+              </w:rPr>
+            </w:pPr>
+            <w:proofErr w:type="gramStart"/>
+            <w:r>
+              <w:rPr>
+                <w:rFonts w:eastAsia="Times New Roman"/>
+                <w:color w:val="000000"/>
+              </w:rPr>
+              <w:t>VARCHAR(</w:t>
+            </w:r>
+            <w:proofErr w:type="gramEnd"/>
+            <w:r>
+              <w:rPr>
+                <w:rFonts w:eastAsia="Times New Roman"/>
+                <w:color w:val="000000"/>
+              </w:rPr>
+              <w:t>255)</w:t>
             </w:r>
           </w:p>
         </w:tc>
@@ -24578,6 +25346,7 @@
                 <w:color w:val="000000"/>
               </w:rPr>
             </w:pPr>
+            <w:proofErr w:type="spellStart"/>
             <w:r>
               <w:rPr>
                 <w:rFonts w:eastAsia="Times New Roman"/>
@@ -24585,6 +25354,7 @@
               </w:rPr>
               <w:t>text_en</w:t>
             </w:r>
+            <w:proofErr w:type="spellEnd"/>
           </w:p>
         </w:tc>
         <w:tc>
@@ -24727,6 +25497,7 @@
                 <w:color w:val="000000"/>
               </w:rPr>
             </w:pPr>
+            <w:proofErr w:type="spellStart"/>
             <w:r>
               <w:rPr>
                 <w:rFonts w:eastAsia="Times New Roman"/>
@@ -24734,6 +25505,7 @@
               </w:rPr>
               <w:t>is_seed</w:t>
             </w:r>
+            <w:proofErr w:type="spellEnd"/>
           </w:p>
         </w:tc>
         <w:tc>
@@ -24876,13 +25648,16 @@
                 <w:color w:val="000000"/>
               </w:rPr>
             </w:pPr>
-            <w:r>
-              <w:rPr>
-                <w:rFonts w:eastAsia="Times New Roman"/>
-                <w:color w:val="000000"/>
-              </w:rPr>
+            <w:proofErr w:type="spellStart"/>
+            <w:r>
+              <w:rPr>
+                <w:rFonts w:eastAsia="Times New Roman"/>
+                <w:color w:val="000000"/>
+              </w:rPr>
+              <w:lastRenderedPageBreak/>
               <w:t>created_at</w:t>
             </w:r>
+            <w:proofErr w:type="spellEnd"/>
           </w:p>
         </w:tc>
         <w:tc>
@@ -25022,8 +25797,20 @@
           <w:color w:val="000000"/>
           <w:lang w:val="en"/>
         </w:rPr>
-        <w:t>Table 17. Otp_Codes</w:t>
+        <w:t xml:space="preserve">Table 17. </w:t>
       </w:r>
+      <w:proofErr w:type="spellStart"/>
+      <w:r>
+        <w:rPr>
+          <w:rFonts w:eastAsia="Times New Roman"/>
+          <w:b/>
+          <w:bCs/>
+          <w:color w:val="000000"/>
+          <w:lang w:val="en"/>
+        </w:rPr>
+        <w:t>Otp_Codes</w:t>
+      </w:r>
+      <w:proofErr w:type="spellEnd"/>
     </w:p>
     <w:tbl>
       <w:tblPr>
@@ -25432,12 +26219,21 @@
                 <w:color w:val="000000"/>
               </w:rPr>
             </w:pPr>
-            <w:r>
-              <w:rPr>
-                <w:rFonts w:eastAsia="Times New Roman"/>
-                <w:color w:val="000000"/>
-              </w:rPr>
-              <w:t>VARCHAR(255)</w:t>
+            <w:proofErr w:type="gramStart"/>
+            <w:r>
+              <w:rPr>
+                <w:rFonts w:eastAsia="Times New Roman"/>
+                <w:color w:val="000000"/>
+              </w:rPr>
+              <w:t>VARCHAR(</w:t>
+            </w:r>
+            <w:proofErr w:type="gramEnd"/>
+            <w:r>
+              <w:rPr>
+                <w:rFonts w:eastAsia="Times New Roman"/>
+                <w:color w:val="000000"/>
+              </w:rPr>
+              <w:t>255)</w:t>
             </w:r>
           </w:p>
         </w:tc>
@@ -25553,6 +26349,7 @@
                 <w:color w:val="000000"/>
               </w:rPr>
             </w:pPr>
+            <w:proofErr w:type="spellStart"/>
             <w:r>
               <w:rPr>
                 <w:rFonts w:eastAsia="Times New Roman"/>
@@ -25560,33 +26357,43 @@
               </w:rPr>
               <w:t>code_hash</w:t>
             </w:r>
-          </w:p>
-        </w:tc>
-        <w:tc>
-          <w:tcPr>
-            <w:tcW w:w="0" w:type="auto"/>
-            <w:tcMar>
-              <w:top w:w="100" w:type="dxa"/>
-              <w:left w:w="120" w:type="dxa"/>
-              <w:bottom w:w="100" w:type="dxa"/>
-              <w:right w:w="120" w:type="dxa"/>
-            </w:tcMar>
-            <w:hideMark/>
-          </w:tcPr>
-          <w:p>
-            <w:pPr>
-              <w:spacing w:after="480"/>
-              <w:rPr>
-                <w:rFonts w:eastAsia="Times New Roman"/>
-                <w:color w:val="000000"/>
-              </w:rPr>
-            </w:pPr>
-            <w:r>
-              <w:rPr>
-                <w:rFonts w:eastAsia="Times New Roman"/>
-                <w:color w:val="000000"/>
-              </w:rPr>
-              <w:t>VARCHAR(255)</w:t>
+            <w:proofErr w:type="spellEnd"/>
+          </w:p>
+        </w:tc>
+        <w:tc>
+          <w:tcPr>
+            <w:tcW w:w="0" w:type="auto"/>
+            <w:tcMar>
+              <w:top w:w="100" w:type="dxa"/>
+              <w:left w:w="120" w:type="dxa"/>
+              <w:bottom w:w="100" w:type="dxa"/>
+              <w:right w:w="120" w:type="dxa"/>
+            </w:tcMar>
+            <w:hideMark/>
+          </w:tcPr>
+          <w:p>
+            <w:pPr>
+              <w:spacing w:after="480"/>
+              <w:rPr>
+                <w:rFonts w:eastAsia="Times New Roman"/>
+                <w:color w:val="000000"/>
+              </w:rPr>
+            </w:pPr>
+            <w:proofErr w:type="gramStart"/>
+            <w:r>
+              <w:rPr>
+                <w:rFonts w:eastAsia="Times New Roman"/>
+                <w:color w:val="000000"/>
+              </w:rPr>
+              <w:t>VARCHAR(</w:t>
+            </w:r>
+            <w:proofErr w:type="gramEnd"/>
+            <w:r>
+              <w:rPr>
+                <w:rFonts w:eastAsia="Times New Roman"/>
+                <w:color w:val="000000"/>
+              </w:rPr>
+              <w:t>255)</w:t>
             </w:r>
           </w:p>
         </w:tc>
@@ -25730,12 +26537,21 @@
                 <w:color w:val="000000"/>
               </w:rPr>
             </w:pPr>
-            <w:r>
-              <w:rPr>
-                <w:rFonts w:eastAsia="Times New Roman"/>
-                <w:color w:val="000000"/>
-              </w:rPr>
-              <w:t>VARCHAR(20)</w:t>
+            <w:proofErr w:type="gramStart"/>
+            <w:r>
+              <w:rPr>
+                <w:rFonts w:eastAsia="Times New Roman"/>
+                <w:color w:val="000000"/>
+              </w:rPr>
+              <w:t>VARCHAR(</w:t>
+            </w:r>
+            <w:proofErr w:type="gramEnd"/>
+            <w:r>
+              <w:rPr>
+                <w:rFonts w:eastAsia="Times New Roman"/>
+                <w:color w:val="000000"/>
+              </w:rPr>
+              <w:t>20)</w:t>
             </w:r>
           </w:p>
         </w:tc>
@@ -25851,6 +26667,7 @@
                 <w:color w:val="000000"/>
               </w:rPr>
             </w:pPr>
+            <w:proofErr w:type="spellStart"/>
             <w:r>
               <w:rPr>
                 <w:rFonts w:eastAsia="Times New Roman"/>
@@ -25858,6 +26675,7 @@
               </w:rPr>
               <w:t>expires_at</w:t>
             </w:r>
+            <w:proofErr w:type="spellEnd"/>
           </w:p>
         </w:tc>
         <w:tc>
@@ -26005,6 +26823,7 @@
                 <w:rFonts w:eastAsia="Times New Roman"/>
                 <w:color w:val="000000"/>
               </w:rPr>
+              <w:lastRenderedPageBreak/>
               <w:t>attempts</w:t>
             </w:r>
           </w:p>
@@ -26149,6 +26968,7 @@
                 <w:color w:val="000000"/>
               </w:rPr>
             </w:pPr>
+            <w:proofErr w:type="spellStart"/>
             <w:r>
               <w:rPr>
                 <w:rFonts w:eastAsia="Times New Roman"/>
@@ -26156,6 +26976,7 @@
               </w:rPr>
               <w:t>verified_at</w:t>
             </w:r>
+            <w:proofErr w:type="spellEnd"/>
           </w:p>
         </w:tc>
         <w:tc>
@@ -26298,6 +27119,7 @@
                 <w:color w:val="000000"/>
               </w:rPr>
             </w:pPr>
+            <w:proofErr w:type="spellStart"/>
             <w:r>
               <w:rPr>
                 <w:rFonts w:eastAsia="Times New Roman"/>
@@ -26305,6 +27127,7 @@
               </w:rPr>
               <w:t>consumed_at</w:t>
             </w:r>
+            <w:proofErr w:type="spellEnd"/>
           </w:p>
         </w:tc>
         <w:tc>
@@ -26447,6 +27270,7 @@
                 <w:color w:val="000000"/>
               </w:rPr>
             </w:pPr>
+            <w:proofErr w:type="spellStart"/>
             <w:r>
               <w:rPr>
                 <w:rFonts w:eastAsia="Times New Roman"/>
@@ -26454,6 +27278,7 @@
               </w:rPr>
               <w:t>created_at</w:t>
             </w:r>
+            <w:proofErr w:type="spellEnd"/>
           </w:p>
         </w:tc>
         <w:tc>
@@ -26854,12 +27679,21 @@
                 <w:color w:val="000000"/>
               </w:rPr>
             </w:pPr>
-            <w:r>
-              <w:rPr>
-                <w:rFonts w:eastAsia="Times New Roman"/>
-                <w:color w:val="000000"/>
-              </w:rPr>
-              <w:t>VARCHAR(100)</w:t>
+            <w:proofErr w:type="gramStart"/>
+            <w:r>
+              <w:rPr>
+                <w:rFonts w:eastAsia="Times New Roman"/>
+                <w:color w:val="000000"/>
+              </w:rPr>
+              <w:t>VARCHAR(</w:t>
+            </w:r>
+            <w:proofErr w:type="gramEnd"/>
+            <w:r>
+              <w:rPr>
+                <w:rFonts w:eastAsia="Times New Roman"/>
+                <w:color w:val="000000"/>
+              </w:rPr>
+              <w:t>100)</w:t>
             </w:r>
           </w:p>
         </w:tc>
@@ -26945,7 +27779,23 @@
                 <w:rFonts w:eastAsia="Times New Roman"/>
                 <w:color w:val="000000"/>
               </w:rPr>
-              <w:t>Unique configuration key identifier (e.g., gcash_qr)</w:t>
+              <w:t xml:space="preserve">Unique configuration key identifier (e.g., </w:t>
+            </w:r>
+            <w:proofErr w:type="spellStart"/>
+            <w:r>
+              <w:rPr>
+                <w:rFonts w:eastAsia="Times New Roman"/>
+                <w:color w:val="000000"/>
+              </w:rPr>
+              <w:t>gcash_qr</w:t>
+            </w:r>
+            <w:proofErr w:type="spellEnd"/>
+            <w:r>
+              <w:rPr>
+                <w:rFonts w:eastAsia="Times New Roman"/>
+                <w:color w:val="000000"/>
+              </w:rPr>
+              <w:t>)</w:t>
             </w:r>
           </w:p>
         </w:tc>
@@ -27124,13 +27974,16 @@
                 <w:color w:val="000000"/>
               </w:rPr>
             </w:pPr>
-            <w:r>
-              <w:rPr>
-                <w:rFonts w:eastAsia="Times New Roman"/>
-                <w:color w:val="000000"/>
-              </w:rPr>
+            <w:proofErr w:type="spellStart"/>
+            <w:r>
+              <w:rPr>
+                <w:rFonts w:eastAsia="Times New Roman"/>
+                <w:color w:val="000000"/>
+              </w:rPr>
+              <w:lastRenderedPageBreak/>
               <w:t>updated_at</w:t>
             </w:r>
+            <w:proofErr w:type="spellEnd"/>
           </w:p>
         </w:tc>
         <w:tc>

</xml_diff>